<commit_message>
Aggiorna il volume docx con l'approfondimento in otto sottonodi
Il volume rilegato dei due fronti italiani comprende ora, come quarta
parte, l'approfondimento sul Tribunale Speciale (presidenti, OVRA,
processi di Trieste, prosopografia repubblicana, scala bolognese, donne,
svolta di guerra, impunita postbellica). Verificato strutturalmente con
python-docx: 6 H1, 29 H2, 6 tabelle, un solo font, nessun residuo
markdown. Frontespizio e indice aggiornati.

Co-Authored-By: Claude Opus 4.8 <noreply@anthropic.com>
Claude-Session: https://claude.ai/code/session_01AhkuH2awwGPfHYRbptsHPY
</commit_message>
<xml_diff>
--- a/IL_VETTORE_E_IL_TRIBUNALE_DUE_STUDI_1926-1972.docx
+++ b/IL_VETTORE_E_IL_TRIBUNALE_DUE_STUDI_1926-1972.docx
@@ -110,6 +110,14 @@
         </w:rPr>
         <w:t xml:space="preserve">Il Tribunale Speciale per la Difesa dello Stato: storia di un'istituzione</w:t>
       </w:r>
+      <w:r>
+        <w:rPr>
+          <w:rFonts w:ascii="Times New Roman" w:cs="Times New Roman" w:eastAsia="Times New Roman" w:hAnsi="Times New Roman"/>
+          <w:sz w:val="24"/>
+          <w:szCs w:val="24"/>
+        </w:rPr>
+        <w:t xml:space="preserve"> · con l'approfondimento in otto sottonodi</w:t>
+      </w:r>
     </w:p>
     <w:p>
       <w:pPr>
@@ -8254,6 +8262,2295 @@
           <w:szCs w:val="24"/>
         </w:rPr>
         <w:t xml:space="preserve">Studio storico sull'istituzione da cui il branch è partito. Si salda a monte con `amnistiati-tribunale-speciale.md` (i nomi) e tocca il versante moroteo nel solo punto documentato (Moro costituente; art. 102 Cost.). Regola di Ferro: dove la fonte documenta, si certifica; dove tace, si tace.</w:t>
+      </w:r>
+    </w:p>
+    <w:p>
+      <w:r>
+        <w:br w:type="page"/>
+      </w:r>
+    </w:p>
+    <w:p>
+      <w:pPr>
+        <w:pStyle w:val="Heading1"/>
+        <w:spacing w:after="120" w:before="240"/>
+      </w:pPr>
+      <w:r>
+        <w:rPr>
+          <w:rFonts w:ascii="Times New Roman" w:cs="Times New Roman" w:eastAsia="Times New Roman" w:hAnsi="Times New Roman"/>
+          <w:sz w:val="24"/>
+          <w:szCs w:val="24"/>
+        </w:rPr>
+        <w:t xml:space="preserve">Il Tribunale Speciale: approfondimento in sottonodi</w:t>
+      </w:r>
+    </w:p>
+    <w:p>
+      <w:pPr>
+        <w:spacing w:after="120" w:line="276"/>
+        <w:jc w:val="both"/>
+      </w:pPr>
+      <w:r>
+        <w:rPr>
+          <w:rFonts w:ascii="Times New Roman" w:cs="Times New Roman" w:eastAsia="Times New Roman" w:hAnsi="Times New Roman"/>
+          <w:i/>
+          <w:iCs/>
+          <w:sz w:val="24"/>
+          <w:szCs w:val="24"/>
+        </w:rPr>
+        <w:t xml:space="preserve">Complemento allo studio sull'istituzione — 24 agosto 2026</w:t>
+      </w:r>
+    </w:p>
+    <w:p>
+      <w:pPr>
+        <w:pBdr>
+          <w:left w:val="single" w:color="1F3864" w:sz="18" w:space="8"/>
+        </w:pBdr>
+        <w:spacing w:after="80" w:before="80"/>
+        <w:ind w:left="360" w:right="360"/>
+        <w:jc w:val="both"/>
+      </w:pPr>
+      <w:r>
+        <w:rPr>
+          <w:rFonts w:ascii="Times New Roman" w:cs="Times New Roman" w:eastAsia="Times New Roman" w:hAnsi="Times New Roman"/>
+          <w:b/>
+          <w:bCs/>
+          <w:i w:val="false"/>
+          <w:iCs w:val="false"/>
+          <w:sz w:val="24"/>
+          <w:szCs w:val="24"/>
+        </w:rPr>
+        <w:t xml:space="preserve">Statuto.</w:t>
+      </w:r>
+      <w:r>
+        <w:rPr>
+          <w:rFonts w:ascii="Times New Roman" w:cs="Times New Roman" w:eastAsia="Times New Roman" w:hAnsi="Times New Roman"/>
+          <w:i w:val="false"/>
+          <w:iCs w:val="false"/>
+          <w:sz w:val="24"/>
+          <w:szCs w:val="24"/>
+        </w:rPr>
+        <w:t xml:space="preserve"> Questo documento approfondisce, in </w:t>
+      </w:r>
+      <w:r>
+        <w:rPr>
+          <w:rFonts w:ascii="Times New Roman" w:cs="Times New Roman" w:eastAsia="Times New Roman" w:hAnsi="Times New Roman"/>
+          <w:b/>
+          <w:bCs/>
+          <w:i w:val="false"/>
+          <w:iCs w:val="false"/>
+          <w:sz w:val="24"/>
+          <w:szCs w:val="24"/>
+        </w:rPr>
+        <w:t xml:space="preserve">otto sottonodi verificati</w:t>
+      </w:r>
+      <w:r>
+        <w:rPr>
+          <w:rFonts w:ascii="Times New Roman" w:cs="Times New Roman" w:eastAsia="Times New Roman" w:hAnsi="Times New Roman"/>
+          <w:i w:val="false"/>
+          <w:iCs w:val="false"/>
+          <w:sz w:val="24"/>
+          <w:szCs w:val="24"/>
+        </w:rPr>
+        <w:t xml:space="preserve">, ciò che lo studio principale (</w:t>
+      </w:r>
+      <w:r>
+        <w:rPr>
+          <w:rFonts w:ascii="Times New Roman" w:cs="Times New Roman" w:eastAsia="Times New Roman" w:hAnsi="Times New Roman"/>
+          <w:i w:val="false"/>
+          <w:iCs w:val="false"/>
+          <w:sz w:val="24"/>
+          <w:szCs w:val="24"/>
+        </w:rPr>
+        <w:t xml:space="preserve">tribunale-speciale-storia-istituzione.md</w:t>
+      </w:r>
+      <w:r>
+        <w:rPr>
+          <w:rFonts w:ascii="Times New Roman" w:cs="Times New Roman" w:eastAsia="Times New Roman" w:hAnsi="Times New Roman"/>
+          <w:i w:val="false"/>
+          <w:iCs w:val="false"/>
+          <w:sz w:val="24"/>
+          <w:szCs w:val="24"/>
+        </w:rPr>
+        <w:t xml:space="preserve">) ha dovuto trattare in sintesi: gli uomini che presiedettero il Tribunale, la macchina istruttoria, i due processi di Trieste, la prosopografia dei condannati che fecero la Repubblica, la scala bolognese da cui il branch è partito, le donne davanti al Tribunale, la svolta di guerra e la questione dell'impunità postbellica. Ogni sottonodo dichiara le proprie fonti e il proprio grado. Vale la Regola di Ferro: dove la fonte documenta, si certifica; dove tace, si tace.</w:t>
+      </w:r>
+    </w:p>
+    <w:p>
+      <w:pPr>
+        <w:pBdr>
+          <w:bottom w:val="single" w:color="999999" w:sz="6" w:space="1"/>
+        </w:pBdr>
+        <w:spacing w:after="80"/>
+      </w:pPr>
+    </w:p>
+    <w:p>
+      <w:pPr>
+        <w:pStyle w:val="Heading2"/>
+        <w:spacing w:after="100" w:before="200"/>
+      </w:pPr>
+      <w:r>
+        <w:rPr>
+          <w:rFonts w:ascii="Times New Roman" w:cs="Times New Roman" w:eastAsia="Times New Roman" w:hAnsi="Times New Roman"/>
+          <w:sz w:val="24"/>
+          <w:szCs w:val="24"/>
+        </w:rPr>
+        <w:t xml:space="preserve">S-1 · I tre presidenti (1927-1943)</w:t>
+      </w:r>
+    </w:p>
+    <w:p>
+      <w:pPr>
+        <w:spacing w:after="120" w:line="276"/>
+        <w:jc w:val="both"/>
+      </w:pPr>
+      <w:r>
+        <w:rPr>
+          <w:rFonts w:ascii="Times New Roman" w:cs="Times New Roman" w:eastAsia="Times New Roman" w:hAnsi="Times New Roman"/>
+          <w:sz w:val="24"/>
+          <w:szCs w:val="24"/>
+        </w:rPr>
+        <w:t xml:space="preserve">Il Tribunale ebbe, in sedici anni, tre presidenti — e la loro successione racconta la parabola dell'istituto (Wikipedia IT (https://it.wikipedia.org/wiki/Tribunale_speciale_per_la_difesa_dello_Stato_(1926-1943)); Guido Cristini (https://it.wikipedia.org/wiki/Guido_Cristini); Antonino Tringali Casanuova (https://en.wikipedia.org/wiki/Antonino_Tringali_Casanuova)):</w:t>
+      </w:r>
+    </w:p>
+    <w:tbl>
+      <w:tblPr>
+        <w:tblW w:type="dxa" w:w="9360"/>
+        <w:tblBorders>
+          <w:top w:val="single" w:color="auto" w:sz="4"/>
+          <w:left w:val="single" w:color="auto" w:sz="4"/>
+          <w:bottom w:val="single" w:color="auto" w:sz="4"/>
+          <w:right w:val="single" w:color="auto" w:sz="4"/>
+          <w:insideH w:val="single" w:color="auto" w:sz="4"/>
+          <w:insideV w:val="single" w:color="auto" w:sz="4"/>
+        </w:tblBorders>
+      </w:tblPr>
+      <w:tblGrid>
+        <w:gridCol w:w="3120"/>
+        <w:gridCol w:w="3120"/>
+        <w:gridCol w:w="3120"/>
+      </w:tblGrid>
+      <w:tr>
+        <w:tc>
+          <w:tcPr>
+            <w:tcW w:type="dxa" w:w="3120"/>
+            <w:shd w:fill="1F3864" w:val="clear"/>
+          </w:tcPr>
+          <w:p>
+            <w:pPr>
+              <w:spacing w:after="20" w:before="20"/>
+              <w:jc w:val="left"/>
+            </w:pPr>
+            <w:r>
+              <w:rPr>
+                <w:rFonts w:ascii="Times New Roman" w:cs="Times New Roman" w:eastAsia="Times New Roman" w:hAnsi="Times New Roman"/>
+                <w:b/>
+                <w:bCs/>
+                <w:color w:val="FFFFFF"/>
+                <w:sz w:val="20"/>
+                <w:szCs w:val="20"/>
+              </w:rPr>
+              <w:t xml:space="preserve">Presidente</w:t>
+            </w:r>
+          </w:p>
+        </w:tc>
+        <w:tc>
+          <w:tcPr>
+            <w:tcW w:type="dxa" w:w="3120"/>
+            <w:shd w:fill="1F3864" w:val="clear"/>
+          </w:tcPr>
+          <w:p>
+            <w:pPr>
+              <w:spacing w:after="20" w:before="20"/>
+              <w:jc w:val="left"/>
+            </w:pPr>
+            <w:r>
+              <w:rPr>
+                <w:rFonts w:ascii="Times New Roman" w:cs="Times New Roman" w:eastAsia="Times New Roman" w:hAnsi="Times New Roman"/>
+                <w:b/>
+                <w:bCs/>
+                <w:color w:val="FFFFFF"/>
+                <w:sz w:val="20"/>
+                <w:szCs w:val="20"/>
+              </w:rPr>
+              <w:t xml:space="preserve">Periodo</w:t>
+            </w:r>
+          </w:p>
+        </w:tc>
+        <w:tc>
+          <w:tcPr>
+            <w:tcW w:type="dxa" w:w="3120"/>
+            <w:shd w:fill="1F3864" w:val="clear"/>
+          </w:tcPr>
+          <w:p>
+            <w:pPr>
+              <w:spacing w:after="20" w:before="20"/>
+              <w:jc w:val="left"/>
+            </w:pPr>
+            <w:r>
+              <w:rPr>
+                <w:rFonts w:ascii="Times New Roman" w:cs="Times New Roman" w:eastAsia="Times New Roman" w:hAnsi="Times New Roman"/>
+                <w:b/>
+                <w:bCs/>
+                <w:color w:val="FFFFFF"/>
+                <w:sz w:val="20"/>
+                <w:szCs w:val="20"/>
+              </w:rPr>
+              <w:t xml:space="preserve">Profilo</w:t>
+            </w:r>
+          </w:p>
+        </w:tc>
+      </w:tr>
+      <w:tr>
+        <w:tc>
+          <w:tcPr>
+            <w:tcW w:type="dxa" w:w="3120"/>
+          </w:tcPr>
+          <w:p>
+            <w:pPr>
+              <w:spacing w:after="20" w:before="20"/>
+              <w:jc w:val="left"/>
+            </w:pPr>
+            <w:r>
+              <w:rPr>
+                <w:rFonts w:ascii="Times New Roman" w:cs="Times New Roman" w:eastAsia="Times New Roman" w:hAnsi="Times New Roman"/>
+                <w:b/>
+                <w:bCs/>
+                <w:sz w:val="20"/>
+                <w:szCs w:val="20"/>
+              </w:rPr>
+              <w:t xml:space="preserve">Carlo Sanna</w:t>
+            </w:r>
+          </w:p>
+        </w:tc>
+        <w:tc>
+          <w:tcPr>
+            <w:tcW w:type="dxa" w:w="3120"/>
+          </w:tcPr>
+          <w:p>
+            <w:pPr>
+              <w:spacing w:after="20" w:before="20"/>
+              <w:jc w:val="left"/>
+            </w:pPr>
+            <w:r>
+              <w:rPr>
+                <w:rFonts w:ascii="Times New Roman" w:cs="Times New Roman" w:eastAsia="Times New Roman" w:hAnsi="Times New Roman"/>
+                <w:sz w:val="20"/>
+                <w:szCs w:val="20"/>
+              </w:rPr>
+              <w:t xml:space="preserve">1927 – estate 1928</w:t>
+            </w:r>
+          </w:p>
+        </w:tc>
+        <w:tc>
+          <w:tcPr>
+            <w:tcW w:type="dxa" w:w="3120"/>
+          </w:tcPr>
+          <w:p>
+            <w:pPr>
+              <w:spacing w:after="20" w:before="20"/>
+              <w:jc w:val="left"/>
+            </w:pPr>
+            <w:r>
+              <w:rPr>
+                <w:rFonts w:ascii="Times New Roman" w:cs="Times New Roman" w:eastAsia="Times New Roman" w:hAnsi="Times New Roman"/>
+                <w:sz w:val="20"/>
+                <w:szCs w:val="20"/>
+              </w:rPr>
+              <w:t xml:space="preserve">Generale dell'esercito, primo presidente; morì d'infarto in carica</w:t>
+            </w:r>
+          </w:p>
+        </w:tc>
+      </w:tr>
+      <w:tr>
+        <w:tc>
+          <w:tcPr>
+            <w:tcW w:type="dxa" w:w="3120"/>
+          </w:tcPr>
+          <w:p>
+            <w:pPr>
+              <w:spacing w:after="20" w:before="20"/>
+              <w:jc w:val="left"/>
+            </w:pPr>
+            <w:r>
+              <w:rPr>
+                <w:rFonts w:ascii="Times New Roman" w:cs="Times New Roman" w:eastAsia="Times New Roman" w:hAnsi="Times New Roman"/>
+                <w:b/>
+                <w:bCs/>
+                <w:sz w:val="20"/>
+                <w:szCs w:val="20"/>
+              </w:rPr>
+              <w:t xml:space="preserve">Guido Cristini</w:t>
+            </w:r>
+          </w:p>
+        </w:tc>
+        <w:tc>
+          <w:tcPr>
+            <w:tcW w:type="dxa" w:w="3120"/>
+          </w:tcPr>
+          <w:p>
+            <w:pPr>
+              <w:spacing w:after="20" w:before="20"/>
+              <w:jc w:val="left"/>
+            </w:pPr>
+            <w:r>
+              <w:rPr>
+                <w:rFonts w:ascii="Times New Roman" w:cs="Times New Roman" w:eastAsia="Times New Roman" w:hAnsi="Times New Roman"/>
+                <w:sz w:val="20"/>
+                <w:szCs w:val="20"/>
+              </w:rPr>
+              <w:t xml:space="preserve">1928 – 27 novembre 1932</w:t>
+            </w:r>
+          </w:p>
+        </w:tc>
+        <w:tc>
+          <w:tcPr>
+            <w:tcW w:type="dxa" w:w="3120"/>
+          </w:tcPr>
+          <w:p>
+            <w:pPr>
+              <w:spacing w:after="20" w:before="20"/>
+              <w:jc w:val="left"/>
+            </w:pPr>
+            <w:r>
+              <w:rPr>
+                <w:rFonts w:ascii="Times New Roman" w:cs="Times New Roman" w:eastAsia="Times New Roman" w:hAnsi="Times New Roman"/>
+                <w:sz w:val="20"/>
+                <w:szCs w:val="20"/>
+              </w:rPr>
+              <w:t xml:space="preserve">Nominato a soli trentatré anni; presiedette il «processone» del 1928; la sua è la stagione della repressione contro la rete clandestina del PCI</w:t>
+            </w:r>
+          </w:p>
+        </w:tc>
+      </w:tr>
+      <w:tr>
+        <w:tc>
+          <w:tcPr>
+            <w:tcW w:type="dxa" w:w="3120"/>
+          </w:tcPr>
+          <w:p>
+            <w:pPr>
+              <w:spacing w:after="20" w:before="20"/>
+              <w:jc w:val="left"/>
+            </w:pPr>
+            <w:r>
+              <w:rPr>
+                <w:rFonts w:ascii="Times New Roman" w:cs="Times New Roman" w:eastAsia="Times New Roman" w:hAnsi="Times New Roman"/>
+                <w:b/>
+                <w:bCs/>
+                <w:sz w:val="20"/>
+                <w:szCs w:val="20"/>
+              </w:rPr>
+              <w:t xml:space="preserve">Antonino Tringali Casanuova</w:t>
+            </w:r>
+          </w:p>
+        </w:tc>
+        <w:tc>
+          <w:tcPr>
+            <w:tcW w:type="dxa" w:w="3120"/>
+          </w:tcPr>
+          <w:p>
+            <w:pPr>
+              <w:spacing w:after="20" w:before="20"/>
+              <w:jc w:val="left"/>
+            </w:pPr>
+            <w:r>
+              <w:rPr>
+                <w:rFonts w:ascii="Times New Roman" w:cs="Times New Roman" w:eastAsia="Times New Roman" w:hAnsi="Times New Roman"/>
+                <w:sz w:val="20"/>
+                <w:szCs w:val="20"/>
+              </w:rPr>
+              <w:t xml:space="preserve">novembre 1932 – luglio 1943</w:t>
+            </w:r>
+          </w:p>
+        </w:tc>
+        <w:tc>
+          <w:tcPr>
+            <w:tcW w:type="dxa" w:w="3120"/>
+          </w:tcPr>
+          <w:p>
+            <w:pPr>
+              <w:spacing w:after="20" w:before="20"/>
+              <w:jc w:val="left"/>
+            </w:pPr>
+            <w:r>
+              <w:rPr>
+                <w:rFonts w:ascii="Times New Roman" w:cs="Times New Roman" w:eastAsia="Times New Roman" w:hAnsi="Times New Roman"/>
+                <w:sz w:val="20"/>
+                <w:szCs w:val="20"/>
+              </w:rPr>
+              <w:t xml:space="preserve">Vicepresidente dal settembre 1928, poi presidente per undici anni: l'uomo della normalizzazione dell'eccezione e della stagione di guerra</w:t>
+            </w:r>
+          </w:p>
+        </w:tc>
+      </w:tr>
+    </w:tbl>
+    <w:p>
+      <w:pPr>
+        <w:spacing w:after="80"/>
+      </w:pPr>
+    </w:p>
+    <w:p>
+      <w:pPr>
+        <w:spacing w:after="120" w:line="276"/>
+        <w:jc w:val="both"/>
+      </w:pPr>
+      <w:r>
+        <w:rPr>
+          <w:rFonts w:ascii="Times New Roman" w:cs="Times New Roman" w:eastAsia="Times New Roman" w:hAnsi="Times New Roman"/>
+          <w:sz w:val="24"/>
+          <w:szCs w:val="24"/>
+        </w:rPr>
+        <w:t xml:space="preserve">Il dato istituzionale è la </w:t>
+      </w:r>
+      <w:r>
+        <w:rPr>
+          <w:rFonts w:ascii="Times New Roman" w:cs="Times New Roman" w:eastAsia="Times New Roman" w:hAnsi="Times New Roman"/>
+          <w:b/>
+          <w:bCs/>
+          <w:sz w:val="24"/>
+          <w:szCs w:val="24"/>
+        </w:rPr>
+        <w:t xml:space="preserve">progressiva fascistizzazione del vertice</w:t>
+      </w:r>
+      <w:r>
+        <w:rPr>
+          <w:rFonts w:ascii="Times New Roman" w:cs="Times New Roman" w:eastAsia="Times New Roman" w:hAnsi="Times New Roman"/>
+          <w:sz w:val="24"/>
+          <w:szCs w:val="24"/>
+        </w:rPr>
+        <w:t xml:space="preserve">: dal generale del regio esercito (Sanna) al gerarca di partito (Tringali Casanuova). L'organo «tecnico-militare» del 1927 divenne, negli anni Trenta, apertamente un organo politico.</w:t>
+      </w:r>
+    </w:p>
+    <w:p>
+      <w:pPr>
+        <w:pStyle w:val="Heading2"/>
+        <w:spacing w:after="100" w:before="200"/>
+      </w:pPr>
+      <w:r>
+        <w:rPr>
+          <w:rFonts w:ascii="Times New Roman" w:cs="Times New Roman" w:eastAsia="Times New Roman" w:hAnsi="Times New Roman"/>
+          <w:sz w:val="24"/>
+          <w:szCs w:val="24"/>
+        </w:rPr>
+        <w:t xml:space="preserve">S-2 · La macchina istruttoria: l'OVRA</w:t>
+      </w:r>
+    </w:p>
+    <w:p>
+      <w:pPr>
+        <w:spacing w:after="120" w:line="276"/>
+        <w:jc w:val="both"/>
+      </w:pPr>
+      <w:r>
+        <w:rPr>
+          <w:rFonts w:ascii="Times New Roman" w:cs="Times New Roman" w:eastAsia="Times New Roman" w:hAnsi="Times New Roman"/>
+          <w:sz w:val="24"/>
+          <w:szCs w:val="24"/>
+        </w:rPr>
+        <w:t xml:space="preserve">Il Tribunale giudicava ciò che la polizia politica gli portava. Il primo nucleo di quella che sarebbe stata nota come </w:t>
+      </w:r>
+      <w:r>
+        <w:rPr>
+          <w:rFonts w:ascii="Times New Roman" w:cs="Times New Roman" w:eastAsia="Times New Roman" w:hAnsi="Times New Roman"/>
+          <w:b/>
+          <w:bCs/>
+          <w:sz w:val="24"/>
+          <w:szCs w:val="24"/>
+        </w:rPr>
+        <w:t xml:space="preserve">OVRA</w:t>
+      </w:r>
+      <w:r>
+        <w:rPr>
+          <w:rFonts w:ascii="Times New Roman" w:cs="Times New Roman" w:eastAsia="Times New Roman" w:hAnsi="Times New Roman"/>
+          <w:sz w:val="24"/>
+          <w:szCs w:val="24"/>
+        </w:rPr>
+        <w:t xml:space="preserve"> nacque </w:t>
+      </w:r>
+      <w:r>
+        <w:rPr>
+          <w:rFonts w:ascii="Times New Roman" w:cs="Times New Roman" w:eastAsia="Times New Roman" w:hAnsi="Times New Roman"/>
+          <w:b/>
+          <w:bCs/>
+          <w:sz w:val="24"/>
+          <w:szCs w:val="24"/>
+        </w:rPr>
+        <w:t xml:space="preserve">a Milano nel 1927</w:t>
+      </w:r>
+      <w:r>
+        <w:rPr>
+          <w:rFonts w:ascii="Times New Roman" w:cs="Times New Roman" w:eastAsia="Times New Roman" w:hAnsi="Times New Roman"/>
+          <w:sz w:val="24"/>
+          <w:szCs w:val="24"/>
+        </w:rPr>
+        <w:t xml:space="preserve"> come «Ispettorato speciale di polizia» alle dipendenze della Direzione generale di Pubblica Sicurezza, sotto la regia del capo della polizia </w:t>
+      </w:r>
+      <w:r>
+        <w:rPr>
+          <w:rFonts w:ascii="Times New Roman" w:cs="Times New Roman" w:eastAsia="Times New Roman" w:hAnsi="Times New Roman"/>
+          <w:b/>
+          <w:bCs/>
+          <w:sz w:val="24"/>
+          <w:szCs w:val="24"/>
+        </w:rPr>
+        <w:t xml:space="preserve">Arturo Bocchini</w:t>
+      </w:r>
+      <w:r>
+        <w:rPr>
+          <w:rFonts w:ascii="Times New Roman" w:cs="Times New Roman" w:eastAsia="Times New Roman" w:hAnsi="Times New Roman"/>
+          <w:sz w:val="24"/>
+          <w:szCs w:val="24"/>
+        </w:rPr>
+        <w:t xml:space="preserve"> (Polizia di Stato, scheda Bocchini (https://www.poliziadistato.it/articolo/arturo-bocchini); Treccani (https://www.treccani.it/enciclopedia/arturo-bocchini_(Dizionario-Biografico)/); Wikipedia EN, OVRA (https://en.wikipedia.org/wiki/OVRA)). Il suo strumento caratteristico era la </w:t>
+      </w:r>
+      <w:r>
+        <w:rPr>
+          <w:rFonts w:ascii="Times New Roman" w:cs="Times New Roman" w:eastAsia="Times New Roman" w:hAnsi="Times New Roman"/>
+          <w:b/>
+          <w:bCs/>
+          <w:sz w:val="24"/>
+          <w:szCs w:val="24"/>
+        </w:rPr>
+        <w:t xml:space="preserve">rete dei confidenti</w:t>
+      </w:r>
+      <w:r>
+        <w:rPr>
+          <w:rFonts w:ascii="Times New Roman" w:cs="Times New Roman" w:eastAsia="Times New Roman" w:hAnsi="Times New Roman"/>
+          <w:sz w:val="24"/>
+          <w:szCs w:val="24"/>
+        </w:rPr>
+        <w:t xml:space="preserve">: l'infiltrazione e la delazione sistematica, che riempivano i fascicoli istruttori del Tribunale. Il binomio è essenziale per capire l'istituto: </w:t>
+      </w:r>
+      <w:r>
+        <w:rPr>
+          <w:rFonts w:ascii="Times New Roman" w:cs="Times New Roman" w:eastAsia="Times New Roman" w:hAnsi="Times New Roman"/>
+          <w:b/>
+          <w:bCs/>
+          <w:sz w:val="24"/>
+          <w:szCs w:val="24"/>
+        </w:rPr>
+        <w:t xml:space="preserve">l'OVRA costruiva il caso, il Tribunale lo certificava</w:t>
+      </w:r>
+      <w:r>
+        <w:rPr>
+          <w:rFonts w:ascii="Times New Roman" w:cs="Times New Roman" w:eastAsia="Times New Roman" w:hAnsi="Times New Roman"/>
+          <w:sz w:val="24"/>
+          <w:szCs w:val="24"/>
+        </w:rPr>
+        <w:t xml:space="preserve"> — con un rito militare che non prevedeva un reale contraddittorio sulla prova. Le schede bolognesi del primo documento del branch (arresti a grappolo: «con altri 55», «con altri 88», «con altri 116») mostrano esattamente questo metodo: la retata sulla rete, non l'indagine sul fatto.</w:t>
+      </w:r>
+    </w:p>
+    <w:p>
+      <w:pPr>
+        <w:pStyle w:val="Heading2"/>
+        <w:spacing w:after="100" w:before="200"/>
+      </w:pPr>
+      <w:r>
+        <w:rPr>
+          <w:rFonts w:ascii="Times New Roman" w:cs="Times New Roman" w:eastAsia="Times New Roman" w:hAnsi="Times New Roman"/>
+          <w:sz w:val="24"/>
+          <w:szCs w:val="24"/>
+        </w:rPr>
+        <w:t xml:space="preserve">S-3 · La repressione anti-slava in due tempi: i processi di Trieste</w:t>
+      </w:r>
+    </w:p>
+    <w:p>
+      <w:pPr>
+        <w:spacing w:after="120" w:line="276"/>
+        <w:jc w:val="both"/>
+      </w:pPr>
+      <w:r>
+        <w:rPr>
+          <w:rFonts w:ascii="Times New Roman" w:cs="Times New Roman" w:eastAsia="Times New Roman" w:hAnsi="Times New Roman"/>
+          <w:sz w:val="24"/>
+          <w:szCs w:val="24"/>
+        </w:rPr>
+        <w:t xml:space="preserve">Lo studio principale registrava Basovizza; il sottonodo ricompone l'intero arco.</w:t>
+      </w:r>
+    </w:p>
+    <w:p>
+      <w:pPr>
+        <w:pStyle w:val="ListParagraph"/>
+        <w:numPr>
+          <w:ilvl w:val="0"/>
+          <w:numId w:val="1"/>
+        </w:numPr>
+        <w:spacing w:after="40"/>
+        <w:jc w:val="both"/>
+      </w:pPr>
+      <w:r>
+        <w:rPr>
+          <w:rFonts w:ascii="Times New Roman" w:cs="Times New Roman" w:eastAsia="Times New Roman" w:hAnsi="Times New Roman"/>
+          <w:b/>
+          <w:bCs/>
+          <w:sz w:val="24"/>
+          <w:szCs w:val="24"/>
+        </w:rPr>
+        <w:t xml:space="preserve">Primo processo di Trieste (1930).</w:t>
+      </w:r>
+      <w:r>
+        <w:rPr>
+          <w:rFonts w:ascii="Times New Roman" w:cs="Times New Roman" w:eastAsia="Times New Roman" w:hAnsi="Times New Roman"/>
+          <w:sz w:val="24"/>
+          <w:szCs w:val="24"/>
+        </w:rPr>
+        <w:t xml:space="preserve"> Quattro antifascisti sloveni — </w:t>
+      </w:r>
+      <w:r>
+        <w:rPr>
+          <w:rFonts w:ascii="Times New Roman" w:cs="Times New Roman" w:eastAsia="Times New Roman" w:hAnsi="Times New Roman"/>
+          <w:b/>
+          <w:bCs/>
+          <w:sz w:val="24"/>
+          <w:szCs w:val="24"/>
+        </w:rPr>
+        <w:t xml:space="preserve">Ferdo Bidovec, Fran Marušič, Zvonimir Miloš, Alojz Valenčič</w:t>
+      </w:r>
+      <w:r>
+        <w:rPr>
+          <w:rFonts w:ascii="Times New Roman" w:cs="Times New Roman" w:eastAsia="Times New Roman" w:hAnsi="Times New Roman"/>
+          <w:sz w:val="24"/>
+          <w:szCs w:val="24"/>
+        </w:rPr>
+        <w:t xml:space="preserve"> — fucilati a </w:t>
+      </w:r>
+      <w:r>
+        <w:rPr>
+          <w:rFonts w:ascii="Times New Roman" w:cs="Times New Roman" w:eastAsia="Times New Roman" w:hAnsi="Times New Roman"/>
+          <w:b/>
+          <w:bCs/>
+          <w:sz w:val="24"/>
+          <w:szCs w:val="24"/>
+        </w:rPr>
+        <w:t xml:space="preserve">Basovizza il 6 settembre 1930</w:t>
+      </w:r>
+      <w:r>
+        <w:rPr>
+          <w:rFonts w:ascii="Times New Roman" w:cs="Times New Roman" w:eastAsia="Times New Roman" w:hAnsi="Times New Roman"/>
+          <w:sz w:val="24"/>
+          <w:szCs w:val="24"/>
+        </w:rPr>
+        <w:t xml:space="preserve"> (Grosseto Contemporanea (http://www.grossetocontemporanea.it/fucilati-di-basovizza/)).</w:t>
+      </w:r>
+    </w:p>
+    <w:p>
+      <w:pPr>
+        <w:pStyle w:val="ListParagraph"/>
+        <w:numPr>
+          <w:ilvl w:val="0"/>
+          <w:numId w:val="1"/>
+        </w:numPr>
+        <w:spacing w:after="40"/>
+        <w:jc w:val="both"/>
+      </w:pPr>
+      <w:r>
+        <w:rPr>
+          <w:rFonts w:ascii="Times New Roman" w:cs="Times New Roman" w:eastAsia="Times New Roman" w:hAnsi="Times New Roman"/>
+          <w:b/>
+          <w:bCs/>
+          <w:sz w:val="24"/>
+          <w:szCs w:val="24"/>
+        </w:rPr>
+        <w:t xml:space="preserve">Secondo processo di Trieste (2-14 dicembre 1941).</w:t>
+      </w:r>
+      <w:r>
+        <w:rPr>
+          <w:rFonts w:ascii="Times New Roman" w:cs="Times New Roman" w:eastAsia="Times New Roman" w:hAnsi="Times New Roman"/>
+          <w:sz w:val="24"/>
+          <w:szCs w:val="24"/>
+        </w:rPr>
+        <w:t xml:space="preserve"> Il Tribunale tornò a Trieste in trasferta e giudicò </w:t>
+      </w:r>
+      <w:r>
+        <w:rPr>
+          <w:rFonts w:ascii="Times New Roman" w:cs="Times New Roman" w:eastAsia="Times New Roman" w:hAnsi="Times New Roman"/>
+          <w:b/>
+          <w:bCs/>
+          <w:sz w:val="24"/>
+          <w:szCs w:val="24"/>
+        </w:rPr>
+        <w:t xml:space="preserve">sessanta imputati sloveni</w:t>
+      </w:r>
+      <w:r>
+        <w:rPr>
+          <w:rFonts w:ascii="Times New Roman" w:cs="Times New Roman" w:eastAsia="Times New Roman" w:hAnsi="Times New Roman"/>
+          <w:sz w:val="24"/>
+          <w:szCs w:val="24"/>
+        </w:rPr>
+        <w:t xml:space="preserve">, raggruppati dall'accusa in tre categorie — ventidue intellettuali di orientamento liberale e cristiano, ventisei comunisti, dodici membri del </w:t>
+      </w:r>
+      <w:r>
+        <w:rPr>
+          <w:rFonts w:ascii="Times New Roman" w:cs="Times New Roman" w:eastAsia="Times New Roman" w:hAnsi="Times New Roman"/>
+          <w:b/>
+          <w:bCs/>
+          <w:sz w:val="24"/>
+          <w:szCs w:val="24"/>
+        </w:rPr>
+        <w:t xml:space="preserve">TIGR</w:t>
+      </w:r>
+      <w:r>
+        <w:rPr>
+          <w:rFonts w:ascii="Times New Roman" w:cs="Times New Roman" w:eastAsia="Times New Roman" w:hAnsi="Times New Roman"/>
+          <w:sz w:val="24"/>
+          <w:szCs w:val="24"/>
+        </w:rPr>
+        <w:t xml:space="preserve"> — unificati dalla formula del «complotto contro l'integrità dello Stato». Cinque i fucilati, il </w:t>
+      </w:r>
+      <w:r>
+        <w:rPr>
+          <w:rFonts w:ascii="Times New Roman" w:cs="Times New Roman" w:eastAsia="Times New Roman" w:hAnsi="Times New Roman"/>
+          <w:b/>
+          <w:bCs/>
+          <w:sz w:val="24"/>
+          <w:szCs w:val="24"/>
+        </w:rPr>
+        <w:t xml:space="preserve">15 dicembre 1941 al poligono di Opicina</w:t>
+      </w:r>
+      <w:r>
+        <w:rPr>
+          <w:rFonts w:ascii="Times New Roman" w:cs="Times New Roman" w:eastAsia="Times New Roman" w:hAnsi="Times New Roman"/>
+          <w:sz w:val="24"/>
+          <w:szCs w:val="24"/>
+        </w:rPr>
+        <w:t xml:space="preserve">: </w:t>
+      </w:r>
+      <w:r>
+        <w:rPr>
+          <w:rFonts w:ascii="Times New Roman" w:cs="Times New Roman" w:eastAsia="Times New Roman" w:hAnsi="Times New Roman"/>
+          <w:b/>
+          <w:bCs/>
+          <w:sz w:val="24"/>
+          <w:szCs w:val="24"/>
+        </w:rPr>
+        <w:t xml:space="preserve">Pinko Tomažič, Viktor Bobek, Ivan Ivančič, Simon Kos, Ivan Vadnal</w:t>
+      </w:r>
+      <w:r>
+        <w:rPr>
+          <w:rFonts w:ascii="Times New Roman" w:cs="Times New Roman" w:eastAsia="Times New Roman" w:hAnsi="Times New Roman"/>
+          <w:sz w:val="24"/>
+          <w:szCs w:val="24"/>
+        </w:rPr>
+        <w:t xml:space="preserve"> (La Bottega del Barbieri (https://www.labottegadelbarbieri.org/trieste-1941-processi-fascisti-e-lotta-di-liberazione/); Wikipedia IT, Pinko Tomažič (https://it.wikipedia.org/wiki/Pinko_Toma%C5%BEi%C4%8D); ANPI Trieste (https://www.anpits.it/)). Tomažič è oggi eroe nazionale in Slovenia.</w:t>
+      </w:r>
+    </w:p>
+    <w:p>
+      <w:pPr>
+        <w:spacing w:after="120" w:line="276"/>
+        <w:jc w:val="both"/>
+      </w:pPr>
+      <w:r>
+        <w:rPr>
+          <w:rFonts w:ascii="Times New Roman" w:cs="Times New Roman" w:eastAsia="Times New Roman" w:hAnsi="Times New Roman"/>
+          <w:sz w:val="24"/>
+          <w:szCs w:val="24"/>
+        </w:rPr>
+        <w:t xml:space="preserve">Il sottonodo precisa la natura </w:t>
+      </w:r>
+      <w:r>
+        <w:rPr>
+          <w:rFonts w:ascii="Times New Roman" w:cs="Times New Roman" w:eastAsia="Times New Roman" w:hAnsi="Times New Roman"/>
+          <w:b/>
+          <w:bCs/>
+          <w:sz w:val="24"/>
+          <w:szCs w:val="24"/>
+        </w:rPr>
+        <w:t xml:space="preserve">anche nazionale</w:t>
+      </w:r>
+      <w:r>
+        <w:rPr>
+          <w:rFonts w:ascii="Times New Roman" w:cs="Times New Roman" w:eastAsia="Times New Roman" w:hAnsi="Times New Roman"/>
+          <w:sz w:val="24"/>
+          <w:szCs w:val="24"/>
+        </w:rPr>
+        <w:t xml:space="preserve"> della repressione: contro le minoranze slave della Venezia Giulia il Tribunale operò come strumento dell'italianizzazione forzata, e la costruzione unificante del «complotto» — che saldava in un solo disegno liberali, comunisti e irredentisti — è l'esempio più puro del suo metodo accusatorio.</w:t>
+      </w:r>
+    </w:p>
+    <w:p>
+      <w:pPr>
+        <w:pStyle w:val="Heading2"/>
+        <w:spacing w:after="100" w:before="200"/>
+      </w:pPr>
+      <w:r>
+        <w:rPr>
+          <w:rFonts w:ascii="Times New Roman" w:cs="Times New Roman" w:eastAsia="Times New Roman" w:hAnsi="Times New Roman"/>
+          <w:sz w:val="24"/>
+          <w:szCs w:val="24"/>
+        </w:rPr>
+        <w:t xml:space="preserve">S-4 · Prosopografia: i condannati che fecero la Repubblica</w:t>
+      </w:r>
+    </w:p>
+    <w:p>
+      <w:pPr>
+        <w:spacing w:after="120" w:line="276"/>
+        <w:jc w:val="both"/>
+      </w:pPr>
+      <w:r>
+        <w:rPr>
+          <w:rFonts w:ascii="Times New Roman" w:cs="Times New Roman" w:eastAsia="Times New Roman" w:hAnsi="Times New Roman"/>
+          <w:sz w:val="24"/>
+          <w:szCs w:val="24"/>
+        </w:rPr>
+        <w:t xml:space="preserve">Il rovesciamento prosopografico accennato nello studio principale, qui documentato caso per caso:</w:t>
+      </w:r>
+    </w:p>
+    <w:tbl>
+      <w:tblPr>
+        <w:tblW w:type="dxa" w:w="9360"/>
+        <w:tblBorders>
+          <w:top w:val="single" w:color="auto" w:sz="4"/>
+          <w:left w:val="single" w:color="auto" w:sz="4"/>
+          <w:bottom w:val="single" w:color="auto" w:sz="4"/>
+          <w:right w:val="single" w:color="auto" w:sz="4"/>
+          <w:insideH w:val="single" w:color="auto" w:sz="4"/>
+          <w:insideV w:val="single" w:color="auto" w:sz="4"/>
+        </w:tblBorders>
+      </w:tblPr>
+      <w:tblGrid>
+        <w:gridCol w:w="3120"/>
+        <w:gridCol w:w="3120"/>
+        <w:gridCol w:w="3120"/>
+      </w:tblGrid>
+      <w:tr>
+        <w:tc>
+          <w:tcPr>
+            <w:tcW w:type="dxa" w:w="3120"/>
+            <w:shd w:fill="1F3864" w:val="clear"/>
+          </w:tcPr>
+          <w:p>
+            <w:pPr>
+              <w:spacing w:after="20" w:before="20"/>
+              <w:jc w:val="left"/>
+            </w:pPr>
+            <w:r>
+              <w:rPr>
+                <w:rFonts w:ascii="Times New Roman" w:cs="Times New Roman" w:eastAsia="Times New Roman" w:hAnsi="Times New Roman"/>
+                <w:b/>
+                <w:bCs/>
+                <w:color w:val="FFFFFF"/>
+                <w:sz w:val="20"/>
+                <w:szCs w:val="20"/>
+              </w:rPr>
+              <w:t xml:space="preserve">Condannato</w:t>
+            </w:r>
+          </w:p>
+        </w:tc>
+        <w:tc>
+          <w:tcPr>
+            <w:tcW w:type="dxa" w:w="3120"/>
+            <w:shd w:fill="1F3864" w:val="clear"/>
+          </w:tcPr>
+          <w:p>
+            <w:pPr>
+              <w:spacing w:after="20" w:before="20"/>
+              <w:jc w:val="left"/>
+            </w:pPr>
+            <w:r>
+              <w:rPr>
+                <w:rFonts w:ascii="Times New Roman" w:cs="Times New Roman" w:eastAsia="Times New Roman" w:hAnsi="Times New Roman"/>
+                <w:b/>
+                <w:bCs/>
+                <w:color w:val="FFFFFF"/>
+                <w:sz w:val="20"/>
+                <w:szCs w:val="20"/>
+              </w:rPr>
+              <w:t xml:space="preserve">Condanna del Tribunale</w:t>
+            </w:r>
+          </w:p>
+        </w:tc>
+        <w:tc>
+          <w:tcPr>
+            <w:tcW w:type="dxa" w:w="3120"/>
+            <w:shd w:fill="1F3864" w:val="clear"/>
+          </w:tcPr>
+          <w:p>
+            <w:pPr>
+              <w:spacing w:after="20" w:before="20"/>
+              <w:jc w:val="left"/>
+            </w:pPr>
+            <w:r>
+              <w:rPr>
+                <w:rFonts w:ascii="Times New Roman" w:cs="Times New Roman" w:eastAsia="Times New Roman" w:hAnsi="Times New Roman"/>
+                <w:b/>
+                <w:bCs/>
+                <w:color w:val="FFFFFF"/>
+                <w:sz w:val="20"/>
+                <w:szCs w:val="20"/>
+              </w:rPr>
+              <w:t xml:space="preserve">Ruolo nella Repubblica</w:t>
+            </w:r>
+          </w:p>
+        </w:tc>
+      </w:tr>
+      <w:tr>
+        <w:tc>
+          <w:tcPr>
+            <w:tcW w:type="dxa" w:w="3120"/>
+          </w:tcPr>
+          <w:p>
+            <w:pPr>
+              <w:spacing w:after="20" w:before="20"/>
+              <w:jc w:val="left"/>
+            </w:pPr>
+            <w:r>
+              <w:rPr>
+                <w:rFonts w:ascii="Times New Roman" w:cs="Times New Roman" w:eastAsia="Times New Roman" w:hAnsi="Times New Roman"/>
+                <w:b/>
+                <w:bCs/>
+                <w:sz w:val="20"/>
+                <w:szCs w:val="20"/>
+              </w:rPr>
+              <w:t xml:space="preserve">Antonio Gramsci</w:t>
+            </w:r>
+          </w:p>
+        </w:tc>
+        <w:tc>
+          <w:tcPr>
+            <w:tcW w:type="dxa" w:w="3120"/>
+          </w:tcPr>
+          <w:p>
+            <w:pPr>
+              <w:spacing w:after="20" w:before="20"/>
+              <w:jc w:val="left"/>
+            </w:pPr>
+            <w:r>
+              <w:rPr>
+                <w:rFonts w:ascii="Times New Roman" w:cs="Times New Roman" w:eastAsia="Times New Roman" w:hAnsi="Times New Roman"/>
+                <w:sz w:val="20"/>
+                <w:szCs w:val="20"/>
+              </w:rPr>
+              <w:t xml:space="preserve">4 giugno 1928 («processone»): 20 anni, 4 mesi e 5 giorni</w:t>
+            </w:r>
+          </w:p>
+        </w:tc>
+        <w:tc>
+          <w:tcPr>
+            <w:tcW w:type="dxa" w:w="3120"/>
+          </w:tcPr>
+          <w:p>
+            <w:pPr>
+              <w:spacing w:after="20" w:before="20"/>
+              <w:jc w:val="left"/>
+            </w:pPr>
+            <w:r>
+              <w:rPr>
+                <w:rFonts w:ascii="Times New Roman" w:cs="Times New Roman" w:eastAsia="Times New Roman" w:hAnsi="Times New Roman"/>
+                <w:sz w:val="20"/>
+                <w:szCs w:val="20"/>
+              </w:rPr>
+              <w:t xml:space="preserve">Morì il 27 aprile 1937; i </w:t>
+            </w:r>
+            <w:r>
+              <w:rPr>
+                <w:rFonts w:ascii="Times New Roman" w:cs="Times New Roman" w:eastAsia="Times New Roman" w:hAnsi="Times New Roman"/>
+                <w:i/>
+                <w:iCs/>
+                <w:sz w:val="20"/>
+                <w:szCs w:val="20"/>
+              </w:rPr>
+              <w:t xml:space="preserve">Quaderni</w:t>
+            </w:r>
+            <w:r>
+              <w:rPr>
+                <w:rFonts w:ascii="Times New Roman" w:cs="Times New Roman" w:eastAsia="Times New Roman" w:hAnsi="Times New Roman"/>
+                <w:sz w:val="20"/>
+                <w:szCs w:val="20"/>
+              </w:rPr>
+              <w:t xml:space="preserve"> divennero un fondamento della cultura repubblicana</w:t>
+            </w:r>
+          </w:p>
+        </w:tc>
+      </w:tr>
+      <w:tr>
+        <w:tc>
+          <w:tcPr>
+            <w:tcW w:type="dxa" w:w="3120"/>
+          </w:tcPr>
+          <w:p>
+            <w:pPr>
+              <w:spacing w:after="20" w:before="20"/>
+              <w:jc w:val="left"/>
+            </w:pPr>
+            <w:r>
+              <w:rPr>
+                <w:rFonts w:ascii="Times New Roman" w:cs="Times New Roman" w:eastAsia="Times New Roman" w:hAnsi="Times New Roman"/>
+                <w:b/>
+                <w:bCs/>
+                <w:sz w:val="20"/>
+                <w:szCs w:val="20"/>
+              </w:rPr>
+              <w:t xml:space="preserve">Umberto Terracini</w:t>
+            </w:r>
+          </w:p>
+        </w:tc>
+        <w:tc>
+          <w:tcPr>
+            <w:tcW w:type="dxa" w:w="3120"/>
+          </w:tcPr>
+          <w:p>
+            <w:pPr>
+              <w:spacing w:after="20" w:before="20"/>
+              <w:jc w:val="left"/>
+            </w:pPr>
+            <w:r>
+              <w:rPr>
+                <w:rFonts w:ascii="Times New Roman" w:cs="Times New Roman" w:eastAsia="Times New Roman" w:hAnsi="Times New Roman"/>
+                <w:sz w:val="20"/>
+                <w:szCs w:val="20"/>
+              </w:rPr>
+              <w:t xml:space="preserve">«processone» 1928: la pena più alta, oltre ventidue anni</w:t>
+            </w:r>
+          </w:p>
+        </w:tc>
+        <w:tc>
+          <w:tcPr>
+            <w:tcW w:type="dxa" w:w="3120"/>
+          </w:tcPr>
+          <w:p>
+            <w:pPr>
+              <w:spacing w:after="20" w:before="20"/>
+              <w:jc w:val="left"/>
+            </w:pPr>
+            <w:r>
+              <w:rPr>
+                <w:rFonts w:ascii="Times New Roman" w:cs="Times New Roman" w:eastAsia="Times New Roman" w:hAnsi="Times New Roman"/>
+                <w:b/>
+                <w:bCs/>
+                <w:sz w:val="20"/>
+                <w:szCs w:val="20"/>
+              </w:rPr>
+              <w:t xml:space="preserve">Presidente dell'Assemblea Costituente</w:t>
+            </w:r>
+            <w:r>
+              <w:rPr>
+                <w:rFonts w:ascii="Times New Roman" w:cs="Times New Roman" w:eastAsia="Times New Roman" w:hAnsi="Times New Roman"/>
+                <w:sz w:val="20"/>
+                <w:szCs w:val="20"/>
+              </w:rPr>
+              <w:t xml:space="preserve"> (1947-48): firmò la Costituzione</w:t>
+            </w:r>
+          </w:p>
+        </w:tc>
+      </w:tr>
+      <w:tr>
+        <w:tc>
+          <w:tcPr>
+            <w:tcW w:type="dxa" w:w="3120"/>
+          </w:tcPr>
+          <w:p>
+            <w:pPr>
+              <w:spacing w:after="20" w:before="20"/>
+              <w:jc w:val="left"/>
+            </w:pPr>
+            <w:r>
+              <w:rPr>
+                <w:rFonts w:ascii="Times New Roman" w:cs="Times New Roman" w:eastAsia="Times New Roman" w:hAnsi="Times New Roman"/>
+                <w:b/>
+                <w:bCs/>
+                <w:sz w:val="20"/>
+                <w:szCs w:val="20"/>
+              </w:rPr>
+              <w:t xml:space="preserve">Sandro Pertini</w:t>
+            </w:r>
+          </w:p>
+        </w:tc>
+        <w:tc>
+          <w:tcPr>
+            <w:tcW w:type="dxa" w:w="3120"/>
+          </w:tcPr>
+          <w:p>
+            <w:pPr>
+              <w:spacing w:after="20" w:before="20"/>
+              <w:jc w:val="left"/>
+            </w:pPr>
+            <w:r>
+              <w:rPr>
+                <w:rFonts w:ascii="Times New Roman" w:cs="Times New Roman" w:eastAsia="Times New Roman" w:hAnsi="Times New Roman"/>
+                <w:sz w:val="20"/>
+                <w:szCs w:val="20"/>
+              </w:rPr>
+              <w:t xml:space="preserve">30 novembre 1929: </w:t>
+            </w:r>
+            <w:r>
+              <w:rPr>
+                <w:rFonts w:ascii="Times New Roman" w:cs="Times New Roman" w:eastAsia="Times New Roman" w:hAnsi="Times New Roman"/>
+                <w:b/>
+                <w:bCs/>
+                <w:sz w:val="20"/>
+                <w:szCs w:val="20"/>
+              </w:rPr>
+              <w:t xml:space="preserve">10 anni e 9 mesi</w:t>
+            </w:r>
+            <w:r>
+              <w:rPr>
+                <w:rFonts w:ascii="Times New Roman" w:cs="Times New Roman" w:eastAsia="Times New Roman" w:hAnsi="Times New Roman"/>
+                <w:sz w:val="20"/>
+                <w:szCs w:val="20"/>
+              </w:rPr>
+              <w:t xml:space="preserve"> più 3 anni di vigilanza speciale (arrestato a Pisa il 14 aprile 1929)</w:t>
+            </w:r>
+          </w:p>
+        </w:tc>
+        <w:tc>
+          <w:tcPr>
+            <w:tcW w:type="dxa" w:w="3120"/>
+          </w:tcPr>
+          <w:p>
+            <w:pPr>
+              <w:spacing w:after="20" w:before="20"/>
+              <w:jc w:val="left"/>
+            </w:pPr>
+            <w:r>
+              <w:rPr>
+                <w:rFonts w:ascii="Times New Roman" w:cs="Times New Roman" w:eastAsia="Times New Roman" w:hAnsi="Times New Roman"/>
+                <w:b/>
+                <w:bCs/>
+                <w:sz w:val="20"/>
+                <w:szCs w:val="20"/>
+              </w:rPr>
+              <w:t xml:space="preserve">Presidente della Repubblica</w:t>
+            </w:r>
+            <w:r>
+              <w:rPr>
+                <w:rFonts w:ascii="Times New Roman" w:cs="Times New Roman" w:eastAsia="Times New Roman" w:hAnsi="Times New Roman"/>
+                <w:sz w:val="20"/>
+                <w:szCs w:val="20"/>
+              </w:rPr>
+              <w:t xml:space="preserve"> (1978-1985) (Quirinale, biografia (https://presidenti.quirinale.it/page/7/per-biografia.html); Treccani (https://www.treccani.it/enciclopedia/alessandro-pertini_(Dizionario-Biografico)/))</w:t>
+            </w:r>
+          </w:p>
+        </w:tc>
+      </w:tr>
+      <w:tr>
+        <w:tc>
+          <w:tcPr>
+            <w:tcW w:type="dxa" w:w="3120"/>
+          </w:tcPr>
+          <w:p>
+            <w:pPr>
+              <w:spacing w:after="20" w:before="20"/>
+              <w:jc w:val="left"/>
+            </w:pPr>
+            <w:r>
+              <w:rPr>
+                <w:rFonts w:ascii="Times New Roman" w:cs="Times New Roman" w:eastAsia="Times New Roman" w:hAnsi="Times New Roman"/>
+                <w:b/>
+                <w:bCs/>
+                <w:sz w:val="20"/>
+                <w:szCs w:val="20"/>
+              </w:rPr>
+              <w:t xml:space="preserve">Camilla Ravera</w:t>
+            </w:r>
+          </w:p>
+        </w:tc>
+        <w:tc>
+          <w:tcPr>
+            <w:tcW w:type="dxa" w:w="3120"/>
+          </w:tcPr>
+          <w:p>
+            <w:pPr>
+              <w:spacing w:after="20" w:before="20"/>
+              <w:jc w:val="left"/>
+            </w:pPr>
+            <w:r>
+              <w:rPr>
+                <w:rFonts w:ascii="Times New Roman" w:cs="Times New Roman" w:eastAsia="Times New Roman" w:hAnsi="Times New Roman"/>
+                <w:sz w:val="20"/>
+                <w:szCs w:val="20"/>
+              </w:rPr>
+              <w:t xml:space="preserve">novembre 1930: </w:t>
+            </w:r>
+            <w:r>
+              <w:rPr>
+                <w:rFonts w:ascii="Times New Roman" w:cs="Times New Roman" w:eastAsia="Times New Roman" w:hAnsi="Times New Roman"/>
+                <w:b/>
+                <w:bCs/>
+                <w:sz w:val="20"/>
+                <w:szCs w:val="20"/>
+              </w:rPr>
+              <w:t xml:space="preserve">15 anni e 6 mesi</w:t>
+            </w:r>
+            <w:r>
+              <w:rPr>
+                <w:rFonts w:ascii="Times New Roman" w:cs="Times New Roman" w:eastAsia="Times New Roman" w:hAnsi="Times New Roman"/>
+                <w:sz w:val="20"/>
+                <w:szCs w:val="20"/>
+              </w:rPr>
+              <w:t xml:space="preserve"> per ricostituzione del PCI (arrestata il 10 luglio 1930)</w:t>
+            </w:r>
+          </w:p>
+        </w:tc>
+        <w:tc>
+          <w:tcPr>
+            <w:tcW w:type="dxa" w:w="3120"/>
+          </w:tcPr>
+          <w:p>
+            <w:pPr>
+              <w:spacing w:after="20" w:before="20"/>
+              <w:jc w:val="left"/>
+            </w:pPr>
+            <w:r>
+              <w:rPr>
+                <w:rFonts w:ascii="Times New Roman" w:cs="Times New Roman" w:eastAsia="Times New Roman" w:hAnsi="Times New Roman"/>
+                <w:sz w:val="20"/>
+                <w:szCs w:val="20"/>
+              </w:rPr>
+              <w:t xml:space="preserve">Prima donna </w:t>
+            </w:r>
+            <w:r>
+              <w:rPr>
+                <w:rFonts w:ascii="Times New Roman" w:cs="Times New Roman" w:eastAsia="Times New Roman" w:hAnsi="Times New Roman"/>
+                <w:b/>
+                <w:bCs/>
+                <w:sz w:val="20"/>
+                <w:szCs w:val="20"/>
+              </w:rPr>
+              <w:t xml:space="preserve">senatrice a vita</w:t>
+            </w:r>
+            <w:r>
+              <w:rPr>
+                <w:rFonts w:ascii="Times New Roman" w:cs="Times New Roman" w:eastAsia="Times New Roman" w:hAnsi="Times New Roman"/>
+                <w:sz w:val="20"/>
+                <w:szCs w:val="20"/>
+              </w:rPr>
+              <w:t xml:space="preserve"> (1982) (Treccani (https://www.treccani.it/enciclopedia/camilla-ravera_(Dizionario-Biografico)/); ANPPIA (https://anppia.it/antifascisti/ravera-camilla/))</w:t>
+            </w:r>
+          </w:p>
+        </w:tc>
+      </w:tr>
+      <w:tr>
+        <w:tc>
+          <w:tcPr>
+            <w:tcW w:type="dxa" w:w="3120"/>
+          </w:tcPr>
+          <w:p>
+            <w:pPr>
+              <w:spacing w:after="20" w:before="20"/>
+              <w:jc w:val="left"/>
+            </w:pPr>
+            <w:r>
+              <w:rPr>
+                <w:rFonts w:ascii="Times New Roman" w:cs="Times New Roman" w:eastAsia="Times New Roman" w:hAnsi="Times New Roman"/>
+                <w:b/>
+                <w:bCs/>
+                <w:sz w:val="20"/>
+                <w:szCs w:val="20"/>
+              </w:rPr>
+              <w:t xml:space="preserve">Mauro Scoccimarro</w:t>
+            </w:r>
+          </w:p>
+        </w:tc>
+        <w:tc>
+          <w:tcPr>
+            <w:tcW w:type="dxa" w:w="3120"/>
+          </w:tcPr>
+          <w:p>
+            <w:pPr>
+              <w:spacing w:after="20" w:before="20"/>
+              <w:jc w:val="left"/>
+            </w:pPr>
+            <w:r>
+              <w:rPr>
+                <w:rFonts w:ascii="Times New Roman" w:cs="Times New Roman" w:eastAsia="Times New Roman" w:hAnsi="Times New Roman"/>
+                <w:sz w:val="20"/>
+                <w:szCs w:val="20"/>
+              </w:rPr>
+              <w:t xml:space="preserve">«processone» 1928</w:t>
+            </w:r>
+          </w:p>
+        </w:tc>
+        <w:tc>
+          <w:tcPr>
+            <w:tcW w:type="dxa" w:w="3120"/>
+          </w:tcPr>
+          <w:p>
+            <w:pPr>
+              <w:spacing w:after="20" w:before="20"/>
+              <w:jc w:val="left"/>
+            </w:pPr>
+            <w:r>
+              <w:rPr>
+                <w:rFonts w:ascii="Times New Roman" w:cs="Times New Roman" w:eastAsia="Times New Roman" w:hAnsi="Times New Roman"/>
+                <w:sz w:val="20"/>
+                <w:szCs w:val="20"/>
+              </w:rPr>
+              <w:t xml:space="preserve">Ministro delle finanze della Repubblica, senatore</w:t>
+            </w:r>
+          </w:p>
+        </w:tc>
+      </w:tr>
+    </w:tbl>
+    <w:p>
+      <w:pPr>
+        <w:spacing w:after="80"/>
+      </w:pPr>
+    </w:p>
+    <w:p>
+      <w:pPr>
+        <w:spacing w:after="120" w:line="276"/>
+        <w:jc w:val="both"/>
+      </w:pPr>
+      <w:r>
+        <w:rPr>
+          <w:rFonts w:ascii="Times New Roman" w:cs="Times New Roman" w:eastAsia="Times New Roman" w:hAnsi="Times New Roman"/>
+          <w:sz w:val="24"/>
+          <w:szCs w:val="24"/>
+        </w:rPr>
+        <w:t xml:space="preserve">La coincidenza cronologica ha un vertice simbolico documentato: </w:t>
+      </w:r>
+      <w:r>
+        <w:rPr>
+          <w:rFonts w:ascii="Times New Roman" w:cs="Times New Roman" w:eastAsia="Times New Roman" w:hAnsi="Times New Roman"/>
+          <w:b/>
+          <w:bCs/>
+          <w:sz w:val="24"/>
+          <w:szCs w:val="24"/>
+        </w:rPr>
+        <w:t xml:space="preserve">nel 1978 il Presidente della Repubblica era un condannato del Tribunale Speciale</w:t>
+      </w:r>
+      <w:r>
+        <w:rPr>
+          <w:rFonts w:ascii="Times New Roman" w:cs="Times New Roman" w:eastAsia="Times New Roman" w:hAnsi="Times New Roman"/>
+          <w:sz w:val="24"/>
+          <w:szCs w:val="24"/>
+        </w:rPr>
+        <w:t xml:space="preserve"> — Pertini, eletto l'8 luglio 1978, due mesi dopo via Caetani. L'anno più buio della Repubblica ebbe al Quirinale un uomo che il giudice speciale del regime aveva spedito in carcere mezzo secolo prima. Si registra come fatto, senza caricarlo di più di quel che dice.</w:t>
+      </w:r>
+    </w:p>
+    <w:p>
+      <w:pPr>
+        <w:pStyle w:val="Heading2"/>
+        <w:spacing w:after="100" w:before="200"/>
+      </w:pPr>
+      <w:r>
+        <w:rPr>
+          <w:rFonts w:ascii="Times New Roman" w:cs="Times New Roman" w:eastAsia="Times New Roman" w:hAnsi="Times New Roman"/>
+          <w:sz w:val="24"/>
+          <w:szCs w:val="24"/>
+        </w:rPr>
+        <w:t xml:space="preserve">S-5 · La scala bolognese: il campione del branch dentro i numeri nazionali</w:t>
+      </w:r>
+    </w:p>
+    <w:p>
+      <w:pPr>
+        <w:spacing w:after="120" w:line="276"/>
+        <w:jc w:val="both"/>
+      </w:pPr>
+      <w:r>
+        <w:rPr>
+          <w:rFonts w:ascii="Times New Roman" w:cs="Times New Roman" w:eastAsia="Times New Roman" w:hAnsi="Times New Roman"/>
+          <w:sz w:val="24"/>
+          <w:szCs w:val="24"/>
+        </w:rPr>
+        <w:t xml:space="preserve">Il primo documento del branch nasce dall'archivio bolognese, che censisce </w:t>
+      </w:r>
+      <w:r>
+        <w:rPr>
+          <w:rFonts w:ascii="Times New Roman" w:cs="Times New Roman" w:eastAsia="Times New Roman" w:hAnsi="Times New Roman"/>
+          <w:b/>
+          <w:bCs/>
+          <w:sz w:val="24"/>
+          <w:szCs w:val="24"/>
+        </w:rPr>
+        <w:t xml:space="preserve">734 antifascisti deferiti</w:t>
+      </w:r>
+      <w:r>
+        <w:rPr>
+          <w:rFonts w:ascii="Times New Roman" w:cs="Times New Roman" w:eastAsia="Times New Roman" w:hAnsi="Times New Roman"/>
+          <w:sz w:val="24"/>
+          <w:szCs w:val="24"/>
+        </w:rPr>
+        <w:t xml:space="preserve"> al Tribunale e </w:t>
+      </w:r>
+      <w:r>
+        <w:rPr>
+          <w:rFonts w:ascii="Times New Roman" w:cs="Times New Roman" w:eastAsia="Times New Roman" w:hAnsi="Times New Roman"/>
+          <w:b/>
+          <w:bCs/>
+          <w:sz w:val="24"/>
+          <w:szCs w:val="24"/>
+        </w:rPr>
+        <w:t xml:space="preserve">384 condannati</w:t>
+      </w:r>
+      <w:r>
+        <w:rPr>
+          <w:rFonts w:ascii="Times New Roman" w:cs="Times New Roman" w:eastAsia="Times New Roman" w:hAnsi="Times New Roman"/>
+          <w:sz w:val="24"/>
+          <w:szCs w:val="24"/>
+        </w:rPr>
+        <w:t xml:space="preserve">. Rapportati alle cifre nazionali (15.806 deferiti, 4.596 condannati), i bolognesi risultano circa il </w:t>
+      </w:r>
+      <w:r>
+        <w:rPr>
+          <w:rFonts w:ascii="Times New Roman" w:cs="Times New Roman" w:eastAsia="Times New Roman" w:hAnsi="Times New Roman"/>
+          <w:b/>
+          <w:bCs/>
+          <w:sz w:val="24"/>
+          <w:szCs w:val="24"/>
+        </w:rPr>
+        <w:t xml:space="preserve">4,6% dei deferiti</w:t>
+      </w:r>
+      <w:r>
+        <w:rPr>
+          <w:rFonts w:ascii="Times New Roman" w:cs="Times New Roman" w:eastAsia="Times New Roman" w:hAnsi="Times New Roman"/>
+          <w:sz w:val="24"/>
+          <w:szCs w:val="24"/>
+        </w:rPr>
+        <w:t xml:space="preserve"> e circa l'</w:t>
+      </w:r>
+      <w:r>
+        <w:rPr>
+          <w:rFonts w:ascii="Times New Roman" w:cs="Times New Roman" w:eastAsia="Times New Roman" w:hAnsi="Times New Roman"/>
+          <w:b/>
+          <w:bCs/>
+          <w:sz w:val="24"/>
+          <w:szCs w:val="24"/>
+        </w:rPr>
+        <w:t xml:space="preserve">8,4% dei condannati</w:t>
+      </w:r>
+      <w:r>
+        <w:rPr>
+          <w:rFonts w:ascii="Times New Roman" w:cs="Times New Roman" w:eastAsia="Times New Roman" w:hAnsi="Times New Roman"/>
+          <w:sz w:val="24"/>
+          <w:szCs w:val="24"/>
+        </w:rPr>
+        <w:t xml:space="preserve">. La sproporzione fra le due quote è un dato interessante — suggerirebbe che i deferiti bolognesi venissero condannati più spesso della media — ma va maneggiata con una </w:t>
+      </w:r>
+      <w:r>
+        <w:rPr>
+          <w:rFonts w:ascii="Times New Roman" w:cs="Times New Roman" w:eastAsia="Times New Roman" w:hAnsi="Times New Roman"/>
+          <w:b/>
+          <w:bCs/>
+          <w:sz w:val="24"/>
+          <w:szCs w:val="24"/>
+        </w:rPr>
+        <w:t xml:space="preserve">cautela metodologica dichiarata</w:t>
+      </w:r>
+      <w:r>
+        <w:rPr>
+          <w:rFonts w:ascii="Times New Roman" w:cs="Times New Roman" w:eastAsia="Times New Roman" w:hAnsi="Times New Roman"/>
+          <w:sz w:val="24"/>
+          <w:szCs w:val="24"/>
+        </w:rPr>
+        <w:t xml:space="preserve">: il censimento bolognese è una ricerca locale con criteri propri di inclusione, non un estratto omogeneo della statistica nazionale, e il confronto fra le due serie è quindi </w:t>
+      </w:r>
+      <w:r>
+        <w:rPr>
+          <w:rFonts w:ascii="Times New Roman" w:cs="Times New Roman" w:eastAsia="Times New Roman" w:hAnsi="Times New Roman"/>
+          <w:b/>
+          <w:bCs/>
+          <w:sz w:val="24"/>
+          <w:szCs w:val="24"/>
+        </w:rPr>
+        <w:t xml:space="preserve">indicativo, non probante</w:t>
+      </w:r>
+      <w:r>
+        <w:rPr>
+          <w:rFonts w:ascii="Times New Roman" w:cs="Times New Roman" w:eastAsia="Times New Roman" w:hAnsi="Times New Roman"/>
+          <w:sz w:val="24"/>
+          <w:szCs w:val="24"/>
+        </w:rPr>
+        <w:t xml:space="preserve">. Si segnala la convergenza (Bologna rossa come bersaglio prioritario della repressione: coerente con le retate a grappolo delle schede) e non la si promuove a misura.</w:t>
+      </w:r>
+    </w:p>
+    <w:p>
+      <w:pPr>
+        <w:pStyle w:val="Heading2"/>
+        <w:spacing w:after="100" w:before="200"/>
+      </w:pPr>
+      <w:r>
+        <w:rPr>
+          <w:rFonts w:ascii="Times New Roman" w:cs="Times New Roman" w:eastAsia="Times New Roman" w:hAnsi="Times New Roman"/>
+          <w:sz w:val="24"/>
+          <w:szCs w:val="24"/>
+        </w:rPr>
+        <w:t xml:space="preserve">S-6 · Le donne davanti al Tribunale</w:t>
+      </w:r>
+    </w:p>
+    <w:p>
+      <w:pPr>
+        <w:spacing w:after="120" w:line="276"/>
+        <w:jc w:val="both"/>
+      </w:pPr>
+      <w:r>
+        <w:rPr>
+          <w:rFonts w:ascii="Times New Roman" w:cs="Times New Roman" w:eastAsia="Times New Roman" w:hAnsi="Times New Roman"/>
+          <w:sz w:val="24"/>
+          <w:szCs w:val="24"/>
+        </w:rPr>
+        <w:t xml:space="preserve">Filone documentato dalla storiografia (cfr. il volume ANPI </w:t>
+      </w:r>
+      <w:r>
+        <w:rPr>
+          <w:rFonts w:ascii="Times New Roman" w:cs="Times New Roman" w:eastAsia="Times New Roman" w:hAnsi="Times New Roman"/>
+          <w:i/>
+          <w:iCs/>
+          <w:sz w:val="24"/>
+          <w:szCs w:val="24"/>
+        </w:rPr>
+        <w:t xml:space="preserve">Donne davanti al Tribunale Speciale</w:t>
+      </w:r>
+      <w:r>
+        <w:rPr>
+          <w:rFonts w:ascii="Times New Roman" w:cs="Times New Roman" w:eastAsia="Times New Roman" w:hAnsi="Times New Roman"/>
+          <w:sz w:val="24"/>
+          <w:szCs w:val="24"/>
+        </w:rPr>
+        <w:t xml:space="preserve">, scheda (https://www.anpi.it/libri/donne-davanti-al-tribunale-speciale)): le militanti antifasciste giudicate dall'organo, di cui il caso Ravera (S-4) è il più alto per pena e per parabola successiva. Il sottonodo si limita a segnalare il filone e la fonte: le cifre disaggregate per genere non sono state riscontrate in sessione su fonte indipendente, e per la Regola di Ferro non se ne danno.</w:t>
+      </w:r>
+    </w:p>
+    <w:p>
+      <w:pPr>
+        <w:pStyle w:val="Heading2"/>
+        <w:spacing w:after="100" w:before="200"/>
+      </w:pPr>
+      <w:r>
+        <w:rPr>
+          <w:rFonts w:ascii="Times New Roman" w:cs="Times New Roman" w:eastAsia="Times New Roman" w:hAnsi="Times New Roman"/>
+          <w:sz w:val="24"/>
+          <w:szCs w:val="24"/>
+        </w:rPr>
+        <w:t xml:space="preserve">S-7 · La svolta di guerra (1940-1943)</w:t>
+      </w:r>
+    </w:p>
+    <w:p>
+      <w:pPr>
+        <w:spacing w:after="120" w:line="276"/>
+        <w:jc w:val="both"/>
+      </w:pPr>
+      <w:r>
+        <w:rPr>
+          <w:rFonts w:ascii="Times New Roman" w:cs="Times New Roman" w:eastAsia="Times New Roman" w:hAnsi="Times New Roman"/>
+          <w:sz w:val="24"/>
+          <w:szCs w:val="24"/>
+        </w:rPr>
+        <w:t xml:space="preserve">L'ingresso in guerra trasformò il regime sanzionatorio: secondo la voce enciclopedica di riferimento, </w:t>
+      </w:r>
+      <w:r>
+        <w:rPr>
+          <w:rFonts w:ascii="Times New Roman" w:cs="Times New Roman" w:eastAsia="Times New Roman" w:hAnsi="Times New Roman"/>
+          <w:b/>
+          <w:bCs/>
+          <w:sz w:val="24"/>
+          <w:szCs w:val="24"/>
+        </w:rPr>
+        <w:t xml:space="preserve">negli anni di guerra furono pronunciate 33 condanne a morte e 22 eseguite</w:t>
+      </w:r>
+      <w:r>
+        <w:rPr>
+          <w:rFonts w:ascii="Times New Roman" w:cs="Times New Roman" w:eastAsia="Times New Roman" w:hAnsi="Times New Roman"/>
+          <w:sz w:val="24"/>
+          <w:szCs w:val="24"/>
+        </w:rPr>
+        <w:t xml:space="preserve"> per fatti connessi al conflitto (spionaggio, sabotaggio, reati annonari aggravati) (Wikipedia EN (https://en.wikipedia.org/wiki/Tribunale_speciale_per_la_difesa_dello_Stato_(1926%E2%80%931943))) — cioè la </w:t>
+      </w:r>
+      <w:r>
+        <w:rPr>
+          <w:rFonts w:ascii="Times New Roman" w:cs="Times New Roman" w:eastAsia="Times New Roman" w:hAnsi="Times New Roman"/>
+          <w:b/>
+          <w:bCs/>
+          <w:sz w:val="24"/>
+          <w:szCs w:val="24"/>
+        </w:rPr>
+        <w:t xml:space="preserve">grande maggioranza delle 42 pronunciate e 31 eseguite dell'intero sedicennio</w:t>
+      </w:r>
+      <w:r>
+        <w:rPr>
+          <w:rFonts w:ascii="Times New Roman" w:cs="Times New Roman" w:eastAsia="Times New Roman" w:hAnsi="Times New Roman"/>
+          <w:sz w:val="24"/>
+          <w:szCs w:val="24"/>
+        </w:rPr>
+        <w:t xml:space="preserve">. Il Tribunale «di pace» aveva ucciso con parsimonia calcolata (l'eco internazionale del caso Della Maggiora insegnò al regime il costo delle esecuzioni); il Tribunale di guerra uccise come un tribunale di guerra. Le due fasi vanno tenute distinte in ogni bilancio: la ferocia dell'istituto non fu costante, fu </w:t>
+      </w:r>
+      <w:r>
+        <w:rPr>
+          <w:rFonts w:ascii="Times New Roman" w:cs="Times New Roman" w:eastAsia="Times New Roman" w:hAnsi="Times New Roman"/>
+          <w:b/>
+          <w:bCs/>
+          <w:sz w:val="24"/>
+          <w:szCs w:val="24"/>
+        </w:rPr>
+        <w:t xml:space="preserve">crescente</w:t>
+      </w:r>
+      <w:r>
+        <w:rPr>
+          <w:rFonts w:ascii="Times New Roman" w:cs="Times New Roman" w:eastAsia="Times New Roman" w:hAnsi="Times New Roman"/>
+          <w:sz w:val="24"/>
+          <w:szCs w:val="24"/>
+        </w:rPr>
+        <w:t xml:space="preserve">.</w:t>
+      </w:r>
+    </w:p>
+    <w:p>
+      <w:pPr>
+        <w:pStyle w:val="Heading2"/>
+        <w:spacing w:after="100" w:before="200"/>
+      </w:pPr>
+      <w:r>
+        <w:rPr>
+          <w:rFonts w:ascii="Times New Roman" w:cs="Times New Roman" w:eastAsia="Times New Roman" w:hAnsi="Times New Roman"/>
+          <w:sz w:val="24"/>
+          <w:szCs w:val="24"/>
+        </w:rPr>
+        <w:t xml:space="preserve">S-8 · Il dopoguerra dei giudici: la questione dell'impunità</w:t>
+      </w:r>
+    </w:p>
+    <w:p>
+      <w:pPr>
+        <w:spacing w:after="120" w:line="276"/>
+        <w:jc w:val="both"/>
+      </w:pPr>
+      <w:r>
+        <w:rPr>
+          <w:rFonts w:ascii="Times New Roman" w:cs="Times New Roman" w:eastAsia="Times New Roman" w:hAnsi="Times New Roman"/>
+          <w:sz w:val="24"/>
+          <w:szCs w:val="24"/>
+        </w:rPr>
+        <w:t xml:space="preserve">Ultimo sottonodo, dichiarato nel suo grado. La storiografia ha posto il tema della </w:t>
+      </w:r>
+      <w:r>
+        <w:rPr>
+          <w:rFonts w:ascii="Times New Roman" w:cs="Times New Roman" w:eastAsia="Times New Roman" w:hAnsi="Times New Roman"/>
+          <w:b/>
+          <w:bCs/>
+          <w:sz w:val="24"/>
+          <w:szCs w:val="24"/>
+        </w:rPr>
+        <w:t xml:space="preserve">sostanziale impunità postbellica</w:t>
+      </w:r>
+      <w:r>
+        <w:rPr>
+          <w:rFonts w:ascii="Times New Roman" w:cs="Times New Roman" w:eastAsia="Times New Roman" w:hAnsi="Times New Roman"/>
+          <w:sz w:val="24"/>
+          <w:szCs w:val="24"/>
+        </w:rPr>
+        <w:t xml:space="preserve"> dei componenti del Tribunale (emblematico il titolo del saggio ripreso da Micciacorta: «Alla fiera dell'impunità. Il Tribunale speciale di Mussolini» (https://www.micciacorta.it/2017/01/22926/)): a differenza delle vittime, censite nome per nome dall'ANPPIA, i giudici non conobbero — nel loro complesso — processi né epurazioni proporzionate al ruolo svolto. Il sottonodo registra il </w:t>
+      </w:r>
+      <w:r>
+        <w:rPr>
+          <w:rFonts w:ascii="Times New Roman" w:cs="Times New Roman" w:eastAsia="Times New Roman" w:hAnsi="Times New Roman"/>
+          <w:b/>
+          <w:bCs/>
+          <w:sz w:val="24"/>
+          <w:szCs w:val="24"/>
+        </w:rPr>
+        <w:t xml:space="preserve">tema storiografico e la sua fonte</w:t>
+      </w:r>
+      <w:r>
+        <w:rPr>
+          <w:rFonts w:ascii="Times New Roman" w:cs="Times New Roman" w:eastAsia="Times New Roman" w:hAnsi="Times New Roman"/>
+          <w:sz w:val="24"/>
+          <w:szCs w:val="24"/>
+        </w:rPr>
+        <w:t xml:space="preserve">; i percorsi individuali dei singoli giudici nel dopoguerra non sono stati verificati in sessione e non se ne afferma alcuno. Resta il dato strutturale, documentato altrove nel corpus per altre vicende: le transizioni italiane puniscono raramente gli apparati.</w:t>
+      </w:r>
+    </w:p>
+    <w:p>
+      <w:pPr>
+        <w:pBdr>
+          <w:bottom w:val="single" w:color="999999" w:sz="6" w:space="1"/>
+        </w:pBdr>
+        <w:spacing w:after="80"/>
+      </w:pPr>
+    </w:p>
+    <w:p>
+      <w:pPr>
+        <w:pStyle w:val="Heading2"/>
+        <w:spacing w:after="100" w:before="200"/>
+      </w:pPr>
+      <w:r>
+        <w:rPr>
+          <w:rFonts w:ascii="Times New Roman" w:cs="Times New Roman" w:eastAsia="Times New Roman" w:hAnsi="Times New Roman"/>
+          <w:sz w:val="24"/>
+          <w:szCs w:val="24"/>
+        </w:rPr>
+        <w:t xml:space="preserve">Registro dei sottonodi</w:t>
+      </w:r>
+    </w:p>
+    <w:tbl>
+      <w:tblPr>
+        <w:tblW w:type="dxa" w:w="9360"/>
+        <w:tblBorders>
+          <w:top w:val="single" w:color="auto" w:sz="4"/>
+          <w:left w:val="single" w:color="auto" w:sz="4"/>
+          <w:bottom w:val="single" w:color="auto" w:sz="4"/>
+          <w:right w:val="single" w:color="auto" w:sz="4"/>
+          <w:insideH w:val="single" w:color="auto" w:sz="4"/>
+          <w:insideV w:val="single" w:color="auto" w:sz="4"/>
+        </w:tblBorders>
+      </w:tblPr>
+      <w:tblGrid>
+        <w:gridCol w:w="3120"/>
+        <w:gridCol w:w="3120"/>
+        <w:gridCol w:w="3120"/>
+      </w:tblGrid>
+      <w:tr>
+        <w:tc>
+          <w:tcPr>
+            <w:tcW w:type="dxa" w:w="3120"/>
+            <w:shd w:fill="1F3864" w:val="clear"/>
+          </w:tcPr>
+          <w:p>
+            <w:pPr>
+              <w:spacing w:after="20" w:before="20"/>
+              <w:jc w:val="left"/>
+            </w:pPr>
+            <w:r>
+              <w:rPr>
+                <w:rFonts w:ascii="Times New Roman" w:cs="Times New Roman" w:eastAsia="Times New Roman" w:hAnsi="Times New Roman"/>
+                <w:b/>
+                <w:bCs/>
+                <w:color w:val="FFFFFF"/>
+                <w:sz w:val="20"/>
+                <w:szCs w:val="20"/>
+              </w:rPr>
+              <w:t xml:space="preserve">#</w:t>
+            </w:r>
+          </w:p>
+        </w:tc>
+        <w:tc>
+          <w:tcPr>
+            <w:tcW w:type="dxa" w:w="3120"/>
+            <w:shd w:fill="1F3864" w:val="clear"/>
+          </w:tcPr>
+          <w:p>
+            <w:pPr>
+              <w:spacing w:after="20" w:before="20"/>
+              <w:jc w:val="left"/>
+            </w:pPr>
+            <w:r>
+              <w:rPr>
+                <w:rFonts w:ascii="Times New Roman" w:cs="Times New Roman" w:eastAsia="Times New Roman" w:hAnsi="Times New Roman"/>
+                <w:b/>
+                <w:bCs/>
+                <w:color w:val="FFFFFF"/>
+                <w:sz w:val="20"/>
+                <w:szCs w:val="20"/>
+              </w:rPr>
+              <w:t xml:space="preserve">Sottonodo</w:t>
+            </w:r>
+          </w:p>
+        </w:tc>
+        <w:tc>
+          <w:tcPr>
+            <w:tcW w:type="dxa" w:w="3120"/>
+            <w:shd w:fill="1F3864" w:val="clear"/>
+          </w:tcPr>
+          <w:p>
+            <w:pPr>
+              <w:spacing w:after="20" w:before="20"/>
+              <w:jc w:val="left"/>
+            </w:pPr>
+            <w:r>
+              <w:rPr>
+                <w:rFonts w:ascii="Times New Roman" w:cs="Times New Roman" w:eastAsia="Times New Roman" w:hAnsi="Times New Roman"/>
+                <w:b/>
+                <w:bCs/>
+                <w:color w:val="FFFFFF"/>
+                <w:sz w:val="20"/>
+                <w:szCs w:val="20"/>
+              </w:rPr>
+              <w:t xml:space="preserve">Grado</w:t>
+            </w:r>
+          </w:p>
+        </w:tc>
+      </w:tr>
+      <w:tr>
+        <w:tc>
+          <w:tcPr>
+            <w:tcW w:type="dxa" w:w="3120"/>
+          </w:tcPr>
+          <w:p>
+            <w:pPr>
+              <w:spacing w:after="20" w:before="20"/>
+              <w:jc w:val="left"/>
+            </w:pPr>
+            <w:r>
+              <w:rPr>
+                <w:rFonts w:ascii="Times New Roman" w:cs="Times New Roman" w:eastAsia="Times New Roman" w:hAnsi="Times New Roman"/>
+                <w:sz w:val="20"/>
+                <w:szCs w:val="20"/>
+              </w:rPr>
+              <w:t xml:space="preserve">S-1</w:t>
+            </w:r>
+          </w:p>
+        </w:tc>
+        <w:tc>
+          <w:tcPr>
+            <w:tcW w:type="dxa" w:w="3120"/>
+          </w:tcPr>
+          <w:p>
+            <w:pPr>
+              <w:spacing w:after="20" w:before="20"/>
+              <w:jc w:val="left"/>
+            </w:pPr>
+            <w:r>
+              <w:rPr>
+                <w:rFonts w:ascii="Times New Roman" w:cs="Times New Roman" w:eastAsia="Times New Roman" w:hAnsi="Times New Roman"/>
+                <w:sz w:val="20"/>
+                <w:szCs w:val="20"/>
+              </w:rPr>
+              <w:t xml:space="preserve">I tre presidenti e la fascistizzazione del vertice</w:t>
+            </w:r>
+          </w:p>
+        </w:tc>
+        <w:tc>
+          <w:tcPr>
+            <w:tcW w:type="dxa" w:w="3120"/>
+          </w:tcPr>
+          <w:p>
+            <w:pPr>
+              <w:spacing w:after="20" w:before="20"/>
+              <w:jc w:val="left"/>
+            </w:pPr>
+            <w:r>
+              <w:rPr>
+                <w:rFonts w:ascii="Times New Roman" w:cs="Times New Roman" w:eastAsia="Times New Roman" w:hAnsi="Times New Roman"/>
+                <w:sz w:val="20"/>
+                <w:szCs w:val="20"/>
+              </w:rPr>
+              <w:t xml:space="preserve">Documentato</w:t>
+            </w:r>
+          </w:p>
+        </w:tc>
+      </w:tr>
+      <w:tr>
+        <w:tc>
+          <w:tcPr>
+            <w:tcW w:type="dxa" w:w="3120"/>
+          </w:tcPr>
+          <w:p>
+            <w:pPr>
+              <w:spacing w:after="20" w:before="20"/>
+              <w:jc w:val="left"/>
+            </w:pPr>
+            <w:r>
+              <w:rPr>
+                <w:rFonts w:ascii="Times New Roman" w:cs="Times New Roman" w:eastAsia="Times New Roman" w:hAnsi="Times New Roman"/>
+                <w:sz w:val="20"/>
+                <w:szCs w:val="20"/>
+              </w:rPr>
+              <w:t xml:space="preserve">S-2</w:t>
+            </w:r>
+          </w:p>
+        </w:tc>
+        <w:tc>
+          <w:tcPr>
+            <w:tcW w:type="dxa" w:w="3120"/>
+          </w:tcPr>
+          <w:p>
+            <w:pPr>
+              <w:spacing w:after="20" w:before="20"/>
+              <w:jc w:val="left"/>
+            </w:pPr>
+            <w:r>
+              <w:rPr>
+                <w:rFonts w:ascii="Times New Roman" w:cs="Times New Roman" w:eastAsia="Times New Roman" w:hAnsi="Times New Roman"/>
+                <w:sz w:val="20"/>
+                <w:szCs w:val="20"/>
+              </w:rPr>
+              <w:t xml:space="preserve">OVRA e istruttoria: la retata come metodo</w:t>
+            </w:r>
+          </w:p>
+        </w:tc>
+        <w:tc>
+          <w:tcPr>
+            <w:tcW w:type="dxa" w:w="3120"/>
+          </w:tcPr>
+          <w:p>
+            <w:pPr>
+              <w:spacing w:after="20" w:before="20"/>
+              <w:jc w:val="left"/>
+            </w:pPr>
+            <w:r>
+              <w:rPr>
+                <w:rFonts w:ascii="Times New Roman" w:cs="Times New Roman" w:eastAsia="Times New Roman" w:hAnsi="Times New Roman"/>
+                <w:sz w:val="20"/>
+                <w:szCs w:val="20"/>
+              </w:rPr>
+              <w:t xml:space="preserve">Documentato (riscontro interno con le schede bolognesi)</w:t>
+            </w:r>
+          </w:p>
+        </w:tc>
+      </w:tr>
+      <w:tr>
+        <w:tc>
+          <w:tcPr>
+            <w:tcW w:type="dxa" w:w="3120"/>
+          </w:tcPr>
+          <w:p>
+            <w:pPr>
+              <w:spacing w:after="20" w:before="20"/>
+              <w:jc w:val="left"/>
+            </w:pPr>
+            <w:r>
+              <w:rPr>
+                <w:rFonts w:ascii="Times New Roman" w:cs="Times New Roman" w:eastAsia="Times New Roman" w:hAnsi="Times New Roman"/>
+                <w:sz w:val="20"/>
+                <w:szCs w:val="20"/>
+              </w:rPr>
+              <w:t xml:space="preserve">S-3</w:t>
+            </w:r>
+          </w:p>
+        </w:tc>
+        <w:tc>
+          <w:tcPr>
+            <w:tcW w:type="dxa" w:w="3120"/>
+          </w:tcPr>
+          <w:p>
+            <w:pPr>
+              <w:spacing w:after="20" w:before="20"/>
+              <w:jc w:val="left"/>
+            </w:pPr>
+            <w:r>
+              <w:rPr>
+                <w:rFonts w:ascii="Times New Roman" w:cs="Times New Roman" w:eastAsia="Times New Roman" w:hAnsi="Times New Roman"/>
+                <w:sz w:val="20"/>
+                <w:szCs w:val="20"/>
+              </w:rPr>
+              <w:t xml:space="preserve">I due processi di Trieste e la repressione anti-slava</w:t>
+            </w:r>
+          </w:p>
+        </w:tc>
+        <w:tc>
+          <w:tcPr>
+            <w:tcW w:type="dxa" w:w="3120"/>
+          </w:tcPr>
+          <w:p>
+            <w:pPr>
+              <w:spacing w:after="20" w:before="20"/>
+              <w:jc w:val="left"/>
+            </w:pPr>
+            <w:r>
+              <w:rPr>
+                <w:rFonts w:ascii="Times New Roman" w:cs="Times New Roman" w:eastAsia="Times New Roman" w:hAnsi="Times New Roman"/>
+                <w:sz w:val="20"/>
+                <w:szCs w:val="20"/>
+              </w:rPr>
+              <w:t xml:space="preserve">Documentato</w:t>
+            </w:r>
+          </w:p>
+        </w:tc>
+      </w:tr>
+      <w:tr>
+        <w:tc>
+          <w:tcPr>
+            <w:tcW w:type="dxa" w:w="3120"/>
+          </w:tcPr>
+          <w:p>
+            <w:pPr>
+              <w:spacing w:after="20" w:before="20"/>
+              <w:jc w:val="left"/>
+            </w:pPr>
+            <w:r>
+              <w:rPr>
+                <w:rFonts w:ascii="Times New Roman" w:cs="Times New Roman" w:eastAsia="Times New Roman" w:hAnsi="Times New Roman"/>
+                <w:sz w:val="20"/>
+                <w:szCs w:val="20"/>
+              </w:rPr>
+              <w:t xml:space="preserve">S-4</w:t>
+            </w:r>
+          </w:p>
+        </w:tc>
+        <w:tc>
+          <w:tcPr>
+            <w:tcW w:type="dxa" w:w="3120"/>
+          </w:tcPr>
+          <w:p>
+            <w:pPr>
+              <w:spacing w:after="20" w:before="20"/>
+              <w:jc w:val="left"/>
+            </w:pPr>
+            <w:r>
+              <w:rPr>
+                <w:rFonts w:ascii="Times New Roman" w:cs="Times New Roman" w:eastAsia="Times New Roman" w:hAnsi="Times New Roman"/>
+                <w:sz w:val="20"/>
+                <w:szCs w:val="20"/>
+              </w:rPr>
+              <w:t xml:space="preserve">Prosopografia dei condannati che fecero la Repubblica</w:t>
+            </w:r>
+          </w:p>
+        </w:tc>
+        <w:tc>
+          <w:tcPr>
+            <w:tcW w:type="dxa" w:w="3120"/>
+          </w:tcPr>
+          <w:p>
+            <w:pPr>
+              <w:spacing w:after="20" w:before="20"/>
+              <w:jc w:val="left"/>
+            </w:pPr>
+            <w:r>
+              <w:rPr>
+                <w:rFonts w:ascii="Times New Roman" w:cs="Times New Roman" w:eastAsia="Times New Roman" w:hAnsi="Times New Roman"/>
+                <w:sz w:val="20"/>
+                <w:szCs w:val="20"/>
+              </w:rPr>
+              <w:t xml:space="preserve">Documentato</w:t>
+            </w:r>
+          </w:p>
+        </w:tc>
+      </w:tr>
+      <w:tr>
+        <w:tc>
+          <w:tcPr>
+            <w:tcW w:type="dxa" w:w="3120"/>
+          </w:tcPr>
+          <w:p>
+            <w:pPr>
+              <w:spacing w:after="20" w:before="20"/>
+              <w:jc w:val="left"/>
+            </w:pPr>
+            <w:r>
+              <w:rPr>
+                <w:rFonts w:ascii="Times New Roman" w:cs="Times New Roman" w:eastAsia="Times New Roman" w:hAnsi="Times New Roman"/>
+                <w:sz w:val="20"/>
+                <w:szCs w:val="20"/>
+              </w:rPr>
+              <w:t xml:space="preserve">S-5</w:t>
+            </w:r>
+          </w:p>
+        </w:tc>
+        <w:tc>
+          <w:tcPr>
+            <w:tcW w:type="dxa" w:w="3120"/>
+          </w:tcPr>
+          <w:p>
+            <w:pPr>
+              <w:spacing w:after="20" w:before="20"/>
+              <w:jc w:val="left"/>
+            </w:pPr>
+            <w:r>
+              <w:rPr>
+                <w:rFonts w:ascii="Times New Roman" w:cs="Times New Roman" w:eastAsia="Times New Roman" w:hAnsi="Times New Roman"/>
+                <w:sz w:val="20"/>
+                <w:szCs w:val="20"/>
+              </w:rPr>
+              <w:t xml:space="preserve">La scala bolognese (4,6% dei deferiti, 8,4% dei condannati)</w:t>
+            </w:r>
+          </w:p>
+        </w:tc>
+        <w:tc>
+          <w:tcPr>
+            <w:tcW w:type="dxa" w:w="3120"/>
+          </w:tcPr>
+          <w:p>
+            <w:pPr>
+              <w:spacing w:after="20" w:before="20"/>
+              <w:jc w:val="left"/>
+            </w:pPr>
+            <w:r>
+              <w:rPr>
+                <w:rFonts w:ascii="Times New Roman" w:cs="Times New Roman" w:eastAsia="Times New Roman" w:hAnsi="Times New Roman"/>
+                <w:sz w:val="20"/>
+                <w:szCs w:val="20"/>
+              </w:rPr>
+              <w:t xml:space="preserve">Convergenza con cautela metodologica dichiarata</w:t>
+            </w:r>
+          </w:p>
+        </w:tc>
+      </w:tr>
+      <w:tr>
+        <w:tc>
+          <w:tcPr>
+            <w:tcW w:type="dxa" w:w="3120"/>
+          </w:tcPr>
+          <w:p>
+            <w:pPr>
+              <w:spacing w:after="20" w:before="20"/>
+              <w:jc w:val="left"/>
+            </w:pPr>
+            <w:r>
+              <w:rPr>
+                <w:rFonts w:ascii="Times New Roman" w:cs="Times New Roman" w:eastAsia="Times New Roman" w:hAnsi="Times New Roman"/>
+                <w:sz w:val="20"/>
+                <w:szCs w:val="20"/>
+              </w:rPr>
+              <w:t xml:space="preserve">S-6</w:t>
+            </w:r>
+          </w:p>
+        </w:tc>
+        <w:tc>
+          <w:tcPr>
+            <w:tcW w:type="dxa" w:w="3120"/>
+          </w:tcPr>
+          <w:p>
+            <w:pPr>
+              <w:spacing w:after="20" w:before="20"/>
+              <w:jc w:val="left"/>
+            </w:pPr>
+            <w:r>
+              <w:rPr>
+                <w:rFonts w:ascii="Times New Roman" w:cs="Times New Roman" w:eastAsia="Times New Roman" w:hAnsi="Times New Roman"/>
+                <w:sz w:val="20"/>
+                <w:szCs w:val="20"/>
+              </w:rPr>
+              <w:t xml:space="preserve">Le donne davanti al Tribunale</w:t>
+            </w:r>
+          </w:p>
+        </w:tc>
+        <w:tc>
+          <w:tcPr>
+            <w:tcW w:type="dxa" w:w="3120"/>
+          </w:tcPr>
+          <w:p>
+            <w:pPr>
+              <w:spacing w:after="20" w:before="20"/>
+              <w:jc w:val="left"/>
+            </w:pPr>
+            <w:r>
+              <w:rPr>
+                <w:rFonts w:ascii="Times New Roman" w:cs="Times New Roman" w:eastAsia="Times New Roman" w:hAnsi="Times New Roman"/>
+                <w:sz w:val="20"/>
+                <w:szCs w:val="20"/>
+              </w:rPr>
+              <w:t xml:space="preserve">Filone segnalato; cifre non riscontrate, non date</w:t>
+            </w:r>
+          </w:p>
+        </w:tc>
+      </w:tr>
+      <w:tr>
+        <w:tc>
+          <w:tcPr>
+            <w:tcW w:type="dxa" w:w="3120"/>
+          </w:tcPr>
+          <w:p>
+            <w:pPr>
+              <w:spacing w:after="20" w:before="20"/>
+              <w:jc w:val="left"/>
+            </w:pPr>
+            <w:r>
+              <w:rPr>
+                <w:rFonts w:ascii="Times New Roman" w:cs="Times New Roman" w:eastAsia="Times New Roman" w:hAnsi="Times New Roman"/>
+                <w:sz w:val="20"/>
+                <w:szCs w:val="20"/>
+              </w:rPr>
+              <w:t xml:space="preserve">S-7</w:t>
+            </w:r>
+          </w:p>
+        </w:tc>
+        <w:tc>
+          <w:tcPr>
+            <w:tcW w:type="dxa" w:w="3120"/>
+          </w:tcPr>
+          <w:p>
+            <w:pPr>
+              <w:spacing w:after="20" w:before="20"/>
+              <w:jc w:val="left"/>
+            </w:pPr>
+            <w:r>
+              <w:rPr>
+                <w:rFonts w:ascii="Times New Roman" w:cs="Times New Roman" w:eastAsia="Times New Roman" w:hAnsi="Times New Roman"/>
+                <w:sz w:val="20"/>
+                <w:szCs w:val="20"/>
+              </w:rPr>
+              <w:t xml:space="preserve">La svolta di guerra (33 condanne a morte pronunciate, 22 eseguite)</w:t>
+            </w:r>
+          </w:p>
+        </w:tc>
+        <w:tc>
+          <w:tcPr>
+            <w:tcW w:type="dxa" w:w="3120"/>
+          </w:tcPr>
+          <w:p>
+            <w:pPr>
+              <w:spacing w:after="20" w:before="20"/>
+              <w:jc w:val="left"/>
+            </w:pPr>
+            <w:r>
+              <w:rPr>
+                <w:rFonts w:ascii="Times New Roman" w:cs="Times New Roman" w:eastAsia="Times New Roman" w:hAnsi="Times New Roman"/>
+                <w:sz w:val="20"/>
+                <w:szCs w:val="20"/>
+              </w:rPr>
+              <w:t xml:space="preserve">Documentato su fonte enciclopedica, dichiarata</w:t>
+            </w:r>
+          </w:p>
+        </w:tc>
+      </w:tr>
+      <w:tr>
+        <w:tc>
+          <w:tcPr>
+            <w:tcW w:type="dxa" w:w="3120"/>
+          </w:tcPr>
+          <w:p>
+            <w:pPr>
+              <w:spacing w:after="20" w:before="20"/>
+              <w:jc w:val="left"/>
+            </w:pPr>
+            <w:r>
+              <w:rPr>
+                <w:rFonts w:ascii="Times New Roman" w:cs="Times New Roman" w:eastAsia="Times New Roman" w:hAnsi="Times New Roman"/>
+                <w:sz w:val="20"/>
+                <w:szCs w:val="20"/>
+              </w:rPr>
+              <w:t xml:space="preserve">S-8</w:t>
+            </w:r>
+          </w:p>
+        </w:tc>
+        <w:tc>
+          <w:tcPr>
+            <w:tcW w:type="dxa" w:w="3120"/>
+          </w:tcPr>
+          <w:p>
+            <w:pPr>
+              <w:spacing w:after="20" w:before="20"/>
+              <w:jc w:val="left"/>
+            </w:pPr>
+            <w:r>
+              <w:rPr>
+                <w:rFonts w:ascii="Times New Roman" w:cs="Times New Roman" w:eastAsia="Times New Roman" w:hAnsi="Times New Roman"/>
+                <w:sz w:val="20"/>
+                <w:szCs w:val="20"/>
+              </w:rPr>
+              <w:t xml:space="preserve">L'impunità postbellica dei giudici</w:t>
+            </w:r>
+          </w:p>
+        </w:tc>
+        <w:tc>
+          <w:tcPr>
+            <w:tcW w:type="dxa" w:w="3120"/>
+          </w:tcPr>
+          <w:p>
+            <w:pPr>
+              <w:spacing w:after="20" w:before="20"/>
+              <w:jc w:val="left"/>
+            </w:pPr>
+            <w:r>
+              <w:rPr>
+                <w:rFonts w:ascii="Times New Roman" w:cs="Times New Roman" w:eastAsia="Times New Roman" w:hAnsi="Times New Roman"/>
+                <w:sz w:val="20"/>
+                <w:szCs w:val="20"/>
+              </w:rPr>
+              <w:t xml:space="preserve">Tema storiografico; nessun percorso individuale affermato</w:t>
+            </w:r>
+          </w:p>
+        </w:tc>
+      </w:tr>
+    </w:tbl>
+    <w:p>
+      <w:pPr>
+        <w:spacing w:after="80"/>
+      </w:pPr>
+    </w:p>
+    <w:p>
+      <w:pPr>
+        <w:pBdr>
+          <w:bottom w:val="single" w:color="999999" w:sz="6" w:space="1"/>
+        </w:pBdr>
+        <w:spacing w:after="80"/>
+      </w:pPr>
+    </w:p>
+    <w:p>
+      <w:pPr>
+        <w:spacing w:after="120" w:line="276"/>
+        <w:jc w:val="both"/>
+      </w:pPr>
+      <w:r>
+        <w:rPr>
+          <w:rFonts w:ascii="Times New Roman" w:cs="Times New Roman" w:eastAsia="Times New Roman" w:hAnsi="Times New Roman"/>
+          <w:i/>
+          <w:iCs/>
+          <w:sz w:val="24"/>
+          <w:szCs w:val="24"/>
+        </w:rPr>
+        <w:t xml:space="preserve">Approfondimento in otto sottonodi dello studio sul Tribunale Speciale. Ogni sottonodo con fonti e grado dichiarati; i due sottonodi non pienamente riscontrabili (S-6, S-8) sono lasciati al livello che le fonti consentono. Nessuna imputazione oltre il giudicato; nessun uso polemico retroattivo.</w:t>
       </w:r>
     </w:p>
     <w:sectPr>

</xml_diff>

<commit_message>
Aggiorna il volume docx con le triangolazioni Hyperion e d'incrocio
Il volume rilegato dei fronti italiani e ora in sei parti: monografia su
Feltrinelli, triangolazione Feltrinelli-corpus, triangolazione del nodo
Hyperion (9 nodi, due tesi al vaglio, proscioglimenti espliciti),
triangolazione d'incrocio Feltrinelli-Hyperion (matrice 1969,
triforcazione 1970, congettura dei timer smentita), studio sul Tribunale
Speciale e approfondimento in otto sottonodi. Frontespizio aggiornato.
Verificato strutturalmente con python-docx: 8 H1, 39 H2, 10 tabelle, un
solo font, nessun residuo markdown.

Co-Authored-By: Claude Opus 4.8 <noreply@anthropic.com>
Claude-Session: https://claude.ai/code/session_01AhkuH2awwGPfHYRbptsHPY
</commit_message>
<xml_diff>
--- a/IL_VETTORE_E_IL_TRIBUNALE_DUE_STUDI_1926-1972.docx
+++ b/IL_VETTORE_E_IL_TRIBUNALE_DUE_STUDI_1926-1972.docx
@@ -108,6 +108,54 @@
           <w:sz w:val="24"/>
           <w:szCs w:val="24"/>
         </w:rPr>
+        <w:t xml:space="preserve">Il nodo Hyperion</w:t>
+      </w:r>
+      <w:r>
+        <w:rPr>
+          <w:rFonts w:ascii="Times New Roman" w:cs="Times New Roman" w:eastAsia="Times New Roman" w:hAnsi="Times New Roman"/>
+          <w:sz w:val="24"/>
+          <w:szCs w:val="24"/>
+        </w:rPr>
+        <w:t xml:space="preserve"> · triangolazione della «scuola di lingue» di Parigi con il corpus</w:t>
+      </w:r>
+    </w:p>
+    <w:p>
+      <w:pPr>
+        <w:spacing w:after="120" w:line="276"/>
+        <w:jc w:val="both"/>
+      </w:pPr>
+      <w:r>
+        <w:rPr>
+          <w:rFonts w:ascii="Times New Roman" w:cs="Times New Roman" w:eastAsia="Times New Roman" w:hAnsi="Times New Roman"/>
+          <w:b/>
+          <w:bCs/>
+          <w:sz w:val="24"/>
+          <w:szCs w:val="24"/>
+        </w:rPr>
+        <w:t xml:space="preserve">Feltrinelli e Hyperion</w:t>
+      </w:r>
+      <w:r>
+        <w:rPr>
+          <w:rFonts w:ascii="Times New Roman" w:cs="Times New Roman" w:eastAsia="Times New Roman" w:hAnsi="Times New Roman"/>
+          <w:sz w:val="24"/>
+          <w:szCs w:val="24"/>
+        </w:rPr>
+        <w:t xml:space="preserve"> · triangolazione d'incrocio: la matrice milanese e le tre strade</w:t>
+      </w:r>
+    </w:p>
+    <w:p>
+      <w:pPr>
+        <w:spacing w:after="120" w:line="276"/>
+        <w:jc w:val="both"/>
+      </w:pPr>
+      <w:r>
+        <w:rPr>
+          <w:rFonts w:ascii="Times New Roman" w:cs="Times New Roman" w:eastAsia="Times New Roman" w:hAnsi="Times New Roman"/>
+          <w:b/>
+          <w:bCs/>
+          <w:sz w:val="24"/>
+          <w:szCs w:val="24"/>
+        </w:rPr>
         <w:t xml:space="preserve">Il Tribunale Speciale per la Difesa dello Stato: storia di un'istituzione</w:t>
       </w:r>
       <w:r>
@@ -5840,6 +5888,3772 @@
           <w:szCs w:val="24"/>
         </w:rPr>
         <w:t xml:space="preserve">Triangolazione dello studio «Feltrinelli: il vettore» con fonti indipendenti e con l'intero corpus del branch. Tre correzioni applicate, un nodo nuovo integrato, tre anti-triangolazioni dichiarate. Vale la Regola di Ferro: dove la fonte documenta, si certifica; dove tace, si tace. Nessuna imputazione oltre il giudicato.</w:t>
+      </w:r>
+    </w:p>
+    <w:p>
+      <w:r>
+        <w:br w:type="page"/>
+      </w:r>
+    </w:p>
+    <w:p>
+      <w:pPr>
+        <w:pStyle w:val="Heading1"/>
+        <w:spacing w:after="120" w:before="240"/>
+      </w:pPr>
+      <w:r>
+        <w:rPr>
+          <w:rFonts w:ascii="Times New Roman" w:cs="Times New Roman" w:eastAsia="Times New Roman" w:hAnsi="Times New Roman"/>
+          <w:sz w:val="24"/>
+          <w:szCs w:val="24"/>
+        </w:rPr>
+        <w:t xml:space="preserve">Triangolazione: Hyperion e il corpus</w:t>
+      </w:r>
+    </w:p>
+    <w:p>
+      <w:pPr>
+        <w:spacing w:after="120" w:line="276"/>
+        <w:jc w:val="both"/>
+      </w:pPr>
+      <w:r>
+        <w:rPr>
+          <w:rFonts w:ascii="Times New Roman" w:cs="Times New Roman" w:eastAsia="Times New Roman" w:hAnsi="Times New Roman"/>
+          <w:i/>
+          <w:iCs/>
+          <w:sz w:val="24"/>
+          <w:szCs w:val="24"/>
+        </w:rPr>
+        <w:t xml:space="preserve">La «scuola di lingue» di Parigi nel quadro internazionale del caso Moro — verifica e mappatura dei ponti — 24 agosto 2026</w:t>
+      </w:r>
+    </w:p>
+    <w:p>
+      <w:pPr>
+        <w:pBdr>
+          <w:left w:val="single" w:color="1F3864" w:sz="18" w:space="8"/>
+        </w:pBdr>
+        <w:spacing w:after="80" w:before="80"/>
+        <w:ind w:left="360" w:right="360"/>
+        <w:jc w:val="both"/>
+      </w:pPr>
+      <w:r>
+        <w:rPr>
+          <w:rFonts w:ascii="Times New Roman" w:cs="Times New Roman" w:eastAsia="Times New Roman" w:hAnsi="Times New Roman"/>
+          <w:b/>
+          <w:bCs/>
+          <w:i w:val="false"/>
+          <w:iCs w:val="false"/>
+          <w:sz w:val="24"/>
+          <w:szCs w:val="24"/>
+        </w:rPr>
+        <w:t xml:space="preserve">Statuto, e un avvertimento più severo del solito.</w:t>
+      </w:r>
+      <w:r>
+        <w:rPr>
+          <w:rFonts w:ascii="Times New Roman" w:cs="Times New Roman" w:eastAsia="Times New Roman" w:hAnsi="Times New Roman"/>
+          <w:i w:val="false"/>
+          <w:iCs w:val="false"/>
+          <w:sz w:val="24"/>
+          <w:szCs w:val="24"/>
+        </w:rPr>
+        <w:t xml:space="preserve"> Hyperion è il nodo dove la dietrologia italiana ha costruito di più e i tribunali hanno accertato di meno. Perciò questa triangolazione comincia dal suo esito: </w:t>
+      </w:r>
+      <w:r>
+        <w:rPr>
+          <w:rFonts w:ascii="Times New Roman" w:cs="Times New Roman" w:eastAsia="Times New Roman" w:hAnsi="Times New Roman"/>
+          <w:b/>
+          <w:bCs/>
+          <w:i w:val="false"/>
+          <w:iCs w:val="false"/>
+          <w:sz w:val="24"/>
+          <w:szCs w:val="24"/>
+        </w:rPr>
+        <w:t xml:space="preserve">tutti i procedimenti giudiziari aperti su Hyperion e sui suoi fondatori si sono chiusi con proscioglimenti; nessuno è mai stato condannato.</w:t>
+      </w:r>
+      <w:r>
+        <w:rPr>
+          <w:rFonts w:ascii="Times New Roman" w:cs="Times New Roman" w:eastAsia="Times New Roman" w:hAnsi="Times New Roman"/>
+          <w:i w:val="false"/>
+          <w:iCs w:val="false"/>
+          <w:sz w:val="24"/>
+          <w:szCs w:val="24"/>
+        </w:rPr>
+        <w:t xml:space="preserve"> I fondatori sono qui nominati esclusivamente per fatti pubblici e documentati (la fondazione della scuola, i percorsi politici precedenti, gli atti giudiziari e parlamentari che li riguardarono e i loro esiti liberatori) e godono per intero della presunzione d'innocenza. Le due tesi contrapposte che da quarant'anni si contendono il nodo — «centrale del terrorismo internazionale» e «centrale d'intelligence» — restano entrambe, al vaglio delle fonti, </w:t>
+      </w:r>
+      <w:r>
+        <w:rPr>
+          <w:rFonts w:ascii="Times New Roman" w:cs="Times New Roman" w:eastAsia="Times New Roman" w:hAnsi="Times New Roman"/>
+          <w:b/>
+          <w:bCs/>
+          <w:i w:val="false"/>
+          <w:iCs w:val="false"/>
+          <w:sz w:val="24"/>
+          <w:szCs w:val="24"/>
+        </w:rPr>
+        <w:t xml:space="preserve">congetture non provate</w:t>
+      </w:r>
+      <w:r>
+        <w:rPr>
+          <w:rFonts w:ascii="Times New Roman" w:cs="Times New Roman" w:eastAsia="Times New Roman" w:hAnsi="Times New Roman"/>
+          <w:i w:val="false"/>
+          <w:iCs w:val="false"/>
+          <w:sz w:val="24"/>
+          <w:szCs w:val="24"/>
+        </w:rPr>
+        <w:t xml:space="preserve">, e come tali sono trattate. La Regola di Ferro vale qui al massimo grado: dove la fonte documenta, si certifica; dove tace — e su Hyperion tace molto — si tace.</w:t>
+      </w:r>
+    </w:p>
+    <w:p>
+      <w:pPr>
+        <w:pBdr>
+          <w:bottom w:val="single" w:color="999999" w:sz="6" w:space="1"/>
+        </w:pBdr>
+        <w:spacing w:after="80"/>
+      </w:pPr>
+    </w:p>
+    <w:p>
+      <w:pPr>
+        <w:pStyle w:val="Heading2"/>
+        <w:spacing w:after="100" w:before="200"/>
+      </w:pPr>
+      <w:r>
+        <w:rPr>
+          <w:rFonts w:ascii="Times New Roman" w:cs="Times New Roman" w:eastAsia="Times New Roman" w:hAnsi="Times New Roman"/>
+          <w:sz w:val="24"/>
+          <w:szCs w:val="24"/>
+        </w:rPr>
+        <w:t xml:space="preserve">1. I fatti documentati (nodi HY-1…HY-9)</w:t>
+      </w:r>
+    </w:p>
+    <w:tbl>
+      <w:tblPr>
+        <w:tblW w:type="dxa" w:w="9360"/>
+        <w:tblBorders>
+          <w:top w:val="single" w:color="auto" w:sz="4"/>
+          <w:left w:val="single" w:color="auto" w:sz="4"/>
+          <w:bottom w:val="single" w:color="auto" w:sz="4"/>
+          <w:right w:val="single" w:color="auto" w:sz="4"/>
+          <w:insideH w:val="single" w:color="auto" w:sz="4"/>
+          <w:insideV w:val="single" w:color="auto" w:sz="4"/>
+        </w:tblBorders>
+      </w:tblPr>
+      <w:tblGrid>
+        <w:gridCol w:w="3120"/>
+        <w:gridCol w:w="3120"/>
+        <w:gridCol w:w="3120"/>
+      </w:tblGrid>
+      <w:tr>
+        <w:tc>
+          <w:tcPr>
+            <w:tcW w:type="dxa" w:w="3120"/>
+            <w:shd w:fill="1F3864" w:val="clear"/>
+          </w:tcPr>
+          <w:p>
+            <w:pPr>
+              <w:spacing w:after="20" w:before="20"/>
+              <w:jc w:val="left"/>
+            </w:pPr>
+            <w:r>
+              <w:rPr>
+                <w:rFonts w:ascii="Times New Roman" w:cs="Times New Roman" w:eastAsia="Times New Roman" w:hAnsi="Times New Roman"/>
+                <w:b/>
+                <w:bCs/>
+                <w:color w:val="FFFFFF"/>
+                <w:sz w:val="20"/>
+                <w:szCs w:val="20"/>
+              </w:rPr>
+              <w:t xml:space="preserve">#</w:t>
+            </w:r>
+          </w:p>
+        </w:tc>
+        <w:tc>
+          <w:tcPr>
+            <w:tcW w:type="dxa" w:w="3120"/>
+            <w:shd w:fill="1F3864" w:val="clear"/>
+          </w:tcPr>
+          <w:p>
+            <w:pPr>
+              <w:spacing w:after="20" w:before="20"/>
+              <w:jc w:val="left"/>
+            </w:pPr>
+            <w:r>
+              <w:rPr>
+                <w:rFonts w:ascii="Times New Roman" w:cs="Times New Roman" w:eastAsia="Times New Roman" w:hAnsi="Times New Roman"/>
+                <w:b/>
+                <w:bCs/>
+                <w:color w:val="FFFFFF"/>
+                <w:sz w:val="20"/>
+                <w:szCs w:val="20"/>
+              </w:rPr>
+              <w:t xml:space="preserve">Fatto</w:t>
+            </w:r>
+          </w:p>
+        </w:tc>
+        <w:tc>
+          <w:tcPr>
+            <w:tcW w:type="dxa" w:w="3120"/>
+            <w:shd w:fill="1F3864" w:val="clear"/>
+          </w:tcPr>
+          <w:p>
+            <w:pPr>
+              <w:spacing w:after="20" w:before="20"/>
+              <w:jc w:val="left"/>
+            </w:pPr>
+            <w:r>
+              <w:rPr>
+                <w:rFonts w:ascii="Times New Roman" w:cs="Times New Roman" w:eastAsia="Times New Roman" w:hAnsi="Times New Roman"/>
+                <w:b/>
+                <w:bCs/>
+                <w:color w:val="FFFFFF"/>
+                <w:sz w:val="20"/>
+                <w:szCs w:val="20"/>
+              </w:rPr>
+              <w:t xml:space="preserve">Riscontro</w:t>
+            </w:r>
+          </w:p>
+        </w:tc>
+      </w:tr>
+      <w:tr>
+        <w:tc>
+          <w:tcPr>
+            <w:tcW w:type="dxa" w:w="3120"/>
+          </w:tcPr>
+          <w:p>
+            <w:pPr>
+              <w:spacing w:after="20" w:before="20"/>
+              <w:jc w:val="left"/>
+            </w:pPr>
+            <w:r>
+              <w:rPr>
+                <w:rFonts w:ascii="Times New Roman" w:cs="Times New Roman" w:eastAsia="Times New Roman" w:hAnsi="Times New Roman"/>
+                <w:sz w:val="20"/>
+                <w:szCs w:val="20"/>
+              </w:rPr>
+              <w:t xml:space="preserve">HY-1</w:t>
+            </w:r>
+          </w:p>
+        </w:tc>
+        <w:tc>
+          <w:tcPr>
+            <w:tcW w:type="dxa" w:w="3120"/>
+          </w:tcPr>
+          <w:p>
+            <w:pPr>
+              <w:spacing w:after="20" w:before="20"/>
+              <w:jc w:val="left"/>
+            </w:pPr>
+            <w:r>
+              <w:rPr>
+                <w:rFonts w:ascii="Times New Roman" w:cs="Times New Roman" w:eastAsia="Times New Roman" w:hAnsi="Times New Roman"/>
+                <w:b/>
+                <w:bCs/>
+                <w:sz w:val="20"/>
+                <w:szCs w:val="20"/>
+              </w:rPr>
+              <w:t xml:space="preserve">La genealogia milanese.</w:t>
+            </w:r>
+            <w:r>
+              <w:rPr>
+                <w:rFonts w:ascii="Times New Roman" w:cs="Times New Roman" w:eastAsia="Times New Roman" w:hAnsi="Times New Roman"/>
+                <w:sz w:val="20"/>
+                <w:szCs w:val="20"/>
+              </w:rPr>
+              <w:t xml:space="preserve"> Il </w:t>
+            </w:r>
+            <w:r>
+              <w:rPr>
+                <w:rFonts w:ascii="Times New Roman" w:cs="Times New Roman" w:eastAsia="Times New Roman" w:hAnsi="Times New Roman"/>
+                <w:b/>
+                <w:bCs/>
+                <w:sz w:val="20"/>
+                <w:szCs w:val="20"/>
+              </w:rPr>
+              <w:t xml:space="preserve">Collettivo Politico Metropolitano (CPM)</w:t>
+            </w:r>
+            <w:r>
+              <w:rPr>
+                <w:rFonts w:ascii="Times New Roman" w:cs="Times New Roman" w:eastAsia="Times New Roman" w:hAnsi="Times New Roman"/>
+                <w:sz w:val="20"/>
+                <w:szCs w:val="20"/>
+              </w:rPr>
+              <w:t xml:space="preserve">, fondato a Milano nel settembre 1969, comprese fra gli altri Renato Curcio, Corrado Simioni, Duccio Berio e Vanni Mulinaris: lo stesso brodo di coltura da cui sarebbero nate le BR</w:t>
+            </w:r>
+          </w:p>
+        </w:tc>
+        <w:tc>
+          <w:tcPr>
+            <w:tcW w:type="dxa" w:w="3120"/>
+          </w:tcPr>
+          <w:p>
+            <w:pPr>
+              <w:spacing w:after="20" w:before="20"/>
+              <w:jc w:val="left"/>
+            </w:pPr>
+            <w:r>
+              <w:rPr>
+                <w:rFonts w:ascii="Times New Roman" w:cs="Times New Roman" w:eastAsia="Times New Roman" w:hAnsi="Times New Roman"/>
+                <w:sz w:val="20"/>
+                <w:szCs w:val="20"/>
+              </w:rPr>
+              <w:t xml:space="preserve">Wikipedia IT, Hyperion (Parigi) (https://it.wikipedia.org/wiki/Hyperion_(Parigi)); Lettera43 (https://www.lettera43.it/scuola-hyperion-gli-intrecci-con-il-caso-moro/)</w:t>
+            </w:r>
+          </w:p>
+        </w:tc>
+      </w:tr>
+      <w:tr>
+        <w:tc>
+          <w:tcPr>
+            <w:tcW w:type="dxa" w:w="3120"/>
+          </w:tcPr>
+          <w:p>
+            <w:pPr>
+              <w:spacing w:after="20" w:before="20"/>
+              <w:jc w:val="left"/>
+            </w:pPr>
+            <w:r>
+              <w:rPr>
+                <w:rFonts w:ascii="Times New Roman" w:cs="Times New Roman" w:eastAsia="Times New Roman" w:hAnsi="Times New Roman"/>
+                <w:sz w:val="20"/>
+                <w:szCs w:val="20"/>
+              </w:rPr>
+              <w:t xml:space="preserve">HY-2</w:t>
+            </w:r>
+          </w:p>
+        </w:tc>
+        <w:tc>
+          <w:tcPr>
+            <w:tcW w:type="dxa" w:w="3120"/>
+          </w:tcPr>
+          <w:p>
+            <w:pPr>
+              <w:spacing w:after="20" w:before="20"/>
+              <w:jc w:val="left"/>
+            </w:pPr>
+            <w:r>
+              <w:rPr>
+                <w:rFonts w:ascii="Times New Roman" w:cs="Times New Roman" w:eastAsia="Times New Roman" w:hAnsi="Times New Roman"/>
+                <w:b/>
+                <w:bCs/>
+                <w:sz w:val="20"/>
+                <w:szCs w:val="20"/>
+              </w:rPr>
+              <w:t xml:space="preserve">La scissione e il «Superclan».</w:t>
+            </w:r>
+            <w:r>
+              <w:rPr>
+                <w:rFonts w:ascii="Times New Roman" w:cs="Times New Roman" w:eastAsia="Times New Roman" w:hAnsi="Times New Roman"/>
+                <w:sz w:val="20"/>
+                <w:szCs w:val="20"/>
+              </w:rPr>
+              <w:t xml:space="preserve"> Prima della fondazione delle BR, il gruppo di Simioni si separò da quello di Curcio e Franceschini e diede vita a una struttura clandestina detta poi </w:t>
+            </w:r>
+            <w:r>
+              <w:rPr>
+                <w:rFonts w:ascii="Times New Roman" w:cs="Times New Roman" w:eastAsia="Times New Roman" w:hAnsi="Times New Roman"/>
+                <w:b/>
+                <w:bCs/>
+                <w:sz w:val="20"/>
+                <w:szCs w:val="20"/>
+              </w:rPr>
+              <w:t xml:space="preserve">«Superclan»</w:t>
+            </w:r>
+            <w:r>
+              <w:rPr>
+                <w:rFonts w:ascii="Times New Roman" w:cs="Times New Roman" w:eastAsia="Times New Roman" w:hAnsi="Times New Roman"/>
+                <w:sz w:val="20"/>
+                <w:szCs w:val="20"/>
+              </w:rPr>
+              <w:t xml:space="preserve">, di cui le fonti indicano fra i partecipanti anche </w:t>
+            </w:r>
+            <w:r>
+              <w:rPr>
+                <w:rFonts w:ascii="Times New Roman" w:cs="Times New Roman" w:eastAsia="Times New Roman" w:hAnsi="Times New Roman"/>
+                <w:b/>
+                <w:bCs/>
+                <w:sz w:val="20"/>
+                <w:szCs w:val="20"/>
+              </w:rPr>
+              <w:t xml:space="preserve">Mario Moretti</w:t>
+            </w:r>
+            <w:r>
+              <w:rPr>
+                <w:rFonts w:ascii="Times New Roman" w:cs="Times New Roman" w:eastAsia="Times New Roman" w:hAnsi="Times New Roman"/>
+                <w:sz w:val="20"/>
+                <w:szCs w:val="20"/>
+              </w:rPr>
+              <w:t xml:space="preserve"> e Prospero Gallinari — che passarono in seguito alle BR. Il nome divenne pubblico solo nel 1978-79, con le indagini</w:t>
+            </w:r>
+          </w:p>
+        </w:tc>
+        <w:tc>
+          <w:tcPr>
+            <w:tcW w:type="dxa" w:w="3120"/>
+          </w:tcPr>
+          <w:p>
+            <w:pPr>
+              <w:spacing w:after="20" w:before="20"/>
+              <w:jc w:val="left"/>
+            </w:pPr>
+            <w:r>
+              <w:rPr>
+                <w:rFonts w:ascii="Times New Roman" w:cs="Times New Roman" w:eastAsia="Times New Roman" w:hAnsi="Times New Roman"/>
+                <w:sz w:val="20"/>
+                <w:szCs w:val="20"/>
+              </w:rPr>
+              <w:t xml:space="preserve">Lucarelli, Hyperion e Superclan (http://www.valeriolucarelli.it/Hyperion.htm); Tassinari (https://www.ugomariatassinari.it/hyperion-mandati-di-cattura/)</w:t>
+            </w:r>
+          </w:p>
+        </w:tc>
+      </w:tr>
+      <w:tr>
+        <w:tc>
+          <w:tcPr>
+            <w:tcW w:type="dxa" w:w="3120"/>
+          </w:tcPr>
+          <w:p>
+            <w:pPr>
+              <w:spacing w:after="20" w:before="20"/>
+              <w:jc w:val="left"/>
+            </w:pPr>
+            <w:r>
+              <w:rPr>
+                <w:rFonts w:ascii="Times New Roman" w:cs="Times New Roman" w:eastAsia="Times New Roman" w:hAnsi="Times New Roman"/>
+                <w:sz w:val="20"/>
+                <w:szCs w:val="20"/>
+              </w:rPr>
+              <w:t xml:space="preserve">HY-3</w:t>
+            </w:r>
+          </w:p>
+        </w:tc>
+        <w:tc>
+          <w:tcPr>
+            <w:tcW w:type="dxa" w:w="3120"/>
+          </w:tcPr>
+          <w:p>
+            <w:pPr>
+              <w:spacing w:after="20" w:before="20"/>
+              <w:jc w:val="left"/>
+            </w:pPr>
+            <w:r>
+              <w:rPr>
+                <w:rFonts w:ascii="Times New Roman" w:cs="Times New Roman" w:eastAsia="Times New Roman" w:hAnsi="Times New Roman"/>
+                <w:b/>
+                <w:bCs/>
+                <w:sz w:val="20"/>
+                <w:szCs w:val="20"/>
+              </w:rPr>
+              <w:t xml:space="preserve">La fondazione della scuola.</w:t>
+            </w:r>
+            <w:r>
+              <w:rPr>
+                <w:rFonts w:ascii="Times New Roman" w:cs="Times New Roman" w:eastAsia="Times New Roman" w:hAnsi="Times New Roman"/>
+                <w:sz w:val="20"/>
+                <w:szCs w:val="20"/>
+              </w:rPr>
+              <w:t xml:space="preserve"> </w:t>
+            </w:r>
+            <w:r>
+              <w:rPr>
+                <w:rFonts w:ascii="Times New Roman" w:cs="Times New Roman" w:eastAsia="Times New Roman" w:hAnsi="Times New Roman"/>
+                <w:b/>
+                <w:bCs/>
+                <w:sz w:val="20"/>
+                <w:szCs w:val="20"/>
+              </w:rPr>
+              <w:t xml:space="preserve">Hyperion</w:t>
+            </w:r>
+            <w:r>
+              <w:rPr>
+                <w:rFonts w:ascii="Times New Roman" w:cs="Times New Roman" w:eastAsia="Times New Roman" w:hAnsi="Times New Roman"/>
+                <w:sz w:val="20"/>
+                <w:szCs w:val="20"/>
+              </w:rPr>
+              <w:t xml:space="preserve"> (già «Agorà») fu formalmente fondata a </w:t>
+            </w:r>
+            <w:r>
+              <w:rPr>
+                <w:rFonts w:ascii="Times New Roman" w:cs="Times New Roman" w:eastAsia="Times New Roman" w:hAnsi="Times New Roman"/>
+                <w:b/>
+                <w:bCs/>
+                <w:sz w:val="20"/>
+                <w:szCs w:val="20"/>
+              </w:rPr>
+              <w:t xml:space="preserve">Parigi nel 1976</w:t>
+            </w:r>
+            <w:r>
+              <w:rPr>
+                <w:rFonts w:ascii="Times New Roman" w:cs="Times New Roman" w:eastAsia="Times New Roman" w:hAnsi="Times New Roman"/>
+                <w:sz w:val="20"/>
+                <w:szCs w:val="20"/>
+              </w:rPr>
+              <w:t xml:space="preserve">, al 27 di Quai de la Tournelle, come scuola di lingue; vi operavano Simioni, Berio e Mulinaris</w:t>
+            </w:r>
+          </w:p>
+        </w:tc>
+        <w:tc>
+          <w:tcPr>
+            <w:tcW w:type="dxa" w:w="3120"/>
+          </w:tcPr>
+          <w:p>
+            <w:pPr>
+              <w:spacing w:after="20" w:before="20"/>
+              <w:jc w:val="left"/>
+            </w:pPr>
+            <w:r>
+              <w:rPr>
+                <w:rFonts w:ascii="Times New Roman" w:cs="Times New Roman" w:eastAsia="Times New Roman" w:hAnsi="Times New Roman"/>
+                <w:sz w:val="20"/>
+                <w:szCs w:val="20"/>
+              </w:rPr>
+              <w:t xml:space="preserve">Wikipedia IT (https://it.wikipedia.org/wiki/Hyperion_(Parigi)); 2duerighe (https://www.2duerighe.com/rubriche/storie/176537-luci-e-ombre-della-scuola-di-lingue-hyperion.html)</w:t>
+            </w:r>
+          </w:p>
+        </w:tc>
+      </w:tr>
+      <w:tr>
+        <w:tc>
+          <w:tcPr>
+            <w:tcW w:type="dxa" w:w="3120"/>
+          </w:tcPr>
+          <w:p>
+            <w:pPr>
+              <w:spacing w:after="20" w:before="20"/>
+              <w:jc w:val="left"/>
+            </w:pPr>
+            <w:r>
+              <w:rPr>
+                <w:rFonts w:ascii="Times New Roman" w:cs="Times New Roman" w:eastAsia="Times New Roman" w:hAnsi="Times New Roman"/>
+                <w:sz w:val="20"/>
+                <w:szCs w:val="20"/>
+              </w:rPr>
+              <w:t xml:space="preserve">HY-4</w:t>
+            </w:r>
+          </w:p>
+        </w:tc>
+        <w:tc>
+          <w:tcPr>
+            <w:tcW w:type="dxa" w:w="3120"/>
+          </w:tcPr>
+          <w:p>
+            <w:pPr>
+              <w:spacing w:after="20" w:before="20"/>
+              <w:jc w:val="left"/>
+            </w:pPr>
+            <w:r>
+              <w:rPr>
+                <w:rFonts w:ascii="Times New Roman" w:cs="Times New Roman" w:eastAsia="Times New Roman" w:hAnsi="Times New Roman"/>
+                <w:b/>
+                <w:bCs/>
+                <w:sz w:val="20"/>
+                <w:szCs w:val="20"/>
+              </w:rPr>
+              <w:t xml:space="preserve">L'ufficio romano del febbraio 1978.</w:t>
+            </w:r>
+            <w:r>
+              <w:rPr>
+                <w:rFonts w:ascii="Times New Roman" w:cs="Times New Roman" w:eastAsia="Times New Roman" w:hAnsi="Times New Roman"/>
+                <w:sz w:val="20"/>
+                <w:szCs w:val="20"/>
+              </w:rPr>
+              <w:t xml:space="preserve"> Nel </w:t>
+            </w:r>
+            <w:r>
+              <w:rPr>
+                <w:rFonts w:ascii="Times New Roman" w:cs="Times New Roman" w:eastAsia="Times New Roman" w:hAnsi="Times New Roman"/>
+                <w:b/>
+                <w:bCs/>
+                <w:sz w:val="20"/>
+                <w:szCs w:val="20"/>
+              </w:rPr>
+              <w:t xml:space="preserve">febbraio 1978</w:t>
+            </w:r>
+            <w:r>
+              <w:rPr>
+                <w:rFonts w:ascii="Times New Roman" w:cs="Times New Roman" w:eastAsia="Times New Roman" w:hAnsi="Times New Roman"/>
+                <w:sz w:val="20"/>
+                <w:szCs w:val="20"/>
+              </w:rPr>
+              <w:t xml:space="preserve"> — un mese prima di via Fani — Hyperion aprì una sede di rappresentanza a Roma in </w:t>
+            </w:r>
+            <w:r>
+              <w:rPr>
+                <w:rFonts w:ascii="Times New Roman" w:cs="Times New Roman" w:eastAsia="Times New Roman" w:hAnsi="Times New Roman"/>
+                <w:b/>
+                <w:bCs/>
+                <w:sz w:val="20"/>
+                <w:szCs w:val="20"/>
+              </w:rPr>
+              <w:t xml:space="preserve">via Nicotera 26</w:t>
+            </w:r>
+            <w:r>
+              <w:rPr>
+                <w:rFonts w:ascii="Times New Roman" w:cs="Times New Roman" w:eastAsia="Times New Roman" w:hAnsi="Times New Roman"/>
+                <w:sz w:val="20"/>
+                <w:szCs w:val="20"/>
+              </w:rPr>
+              <w:t xml:space="preserve">, stabile in cui avevano sede anche società di copertura del SISMI</w:t>
+            </w:r>
+          </w:p>
+        </w:tc>
+        <w:tc>
+          <w:tcPr>
+            <w:tcW w:type="dxa" w:w="3120"/>
+          </w:tcPr>
+          <w:p>
+            <w:pPr>
+              <w:spacing w:after="20" w:before="20"/>
+              <w:jc w:val="left"/>
+            </w:pPr>
+            <w:r>
+              <w:rPr>
+                <w:rFonts w:ascii="Times New Roman" w:cs="Times New Roman" w:eastAsia="Times New Roman" w:hAnsi="Times New Roman"/>
+                <w:sz w:val="20"/>
+                <w:szCs w:val="20"/>
+              </w:rPr>
+              <w:t xml:space="preserve">Lettera43 (https://www.lettera43.it/scuola-hyperion-gli-intrecci-con-il-caso-moro/); Colarieti (https://www.colarieti.it/scuola-hyperion-gli-intrecci-con-il-caso-moro/)</w:t>
+            </w:r>
+          </w:p>
+        </w:tc>
+      </w:tr>
+      <w:tr>
+        <w:tc>
+          <w:tcPr>
+            <w:tcW w:type="dxa" w:w="3120"/>
+          </w:tcPr>
+          <w:p>
+            <w:pPr>
+              <w:spacing w:after="20" w:before="20"/>
+              <w:jc w:val="left"/>
+            </w:pPr>
+            <w:r>
+              <w:rPr>
+                <w:rFonts w:ascii="Times New Roman" w:cs="Times New Roman" w:eastAsia="Times New Roman" w:hAnsi="Times New Roman"/>
+                <w:sz w:val="20"/>
+                <w:szCs w:val="20"/>
+              </w:rPr>
+              <w:t xml:space="preserve">HY-5</w:t>
+            </w:r>
+          </w:p>
+        </w:tc>
+        <w:tc>
+          <w:tcPr>
+            <w:tcW w:type="dxa" w:w="3120"/>
+          </w:tcPr>
+          <w:p>
+            <w:pPr>
+              <w:spacing w:after="20" w:before="20"/>
+              <w:jc w:val="left"/>
+            </w:pPr>
+            <w:r>
+              <w:rPr>
+                <w:rFonts w:ascii="Times New Roman" w:cs="Times New Roman" w:eastAsia="Times New Roman" w:hAnsi="Times New Roman"/>
+                <w:b/>
+                <w:bCs/>
+                <w:sz w:val="20"/>
+                <w:szCs w:val="20"/>
+              </w:rPr>
+              <w:t xml:space="preserve">L'ingresso nelle indagini (1979).</w:t>
+            </w:r>
+            <w:r>
+              <w:rPr>
+                <w:rFonts w:ascii="Times New Roman" w:cs="Times New Roman" w:eastAsia="Times New Roman" w:hAnsi="Times New Roman"/>
+                <w:sz w:val="20"/>
+                <w:szCs w:val="20"/>
+              </w:rPr>
+              <w:t xml:space="preserve"> Hyperion entrò nel mirino della magistratura italiana nel </w:t>
+            </w:r>
+            <w:r>
+              <w:rPr>
+                <w:rFonts w:ascii="Times New Roman" w:cs="Times New Roman" w:eastAsia="Times New Roman" w:hAnsi="Times New Roman"/>
+                <w:b/>
+                <w:bCs/>
+                <w:sz w:val="20"/>
+                <w:szCs w:val="20"/>
+              </w:rPr>
+              <w:t xml:space="preserve">1979</w:t>
+            </w:r>
+            <w:r>
+              <w:rPr>
+                <w:rFonts w:ascii="Times New Roman" w:cs="Times New Roman" w:eastAsia="Times New Roman" w:hAnsi="Times New Roman"/>
+                <w:sz w:val="20"/>
+                <w:szCs w:val="20"/>
+              </w:rPr>
+              <w:t xml:space="preserve">, nell'inchiesta del giudice </w:t>
+            </w:r>
+            <w:r>
+              <w:rPr>
+                <w:rFonts w:ascii="Times New Roman" w:cs="Times New Roman" w:eastAsia="Times New Roman" w:hAnsi="Times New Roman"/>
+                <w:b/>
+                <w:bCs/>
+                <w:sz w:val="20"/>
+                <w:szCs w:val="20"/>
+              </w:rPr>
+              <w:t xml:space="preserve">Pietro Calogero</w:t>
+            </w:r>
+            <w:r>
+              <w:rPr>
+                <w:rFonts w:ascii="Times New Roman" w:cs="Times New Roman" w:eastAsia="Times New Roman" w:hAnsi="Times New Roman"/>
+                <w:sz w:val="20"/>
+                <w:szCs w:val="20"/>
+              </w:rPr>
+              <w:t xml:space="preserve"> sui presunti collegamenti fra Autonomia e terrorismo</w:t>
+            </w:r>
+          </w:p>
+        </w:tc>
+        <w:tc>
+          <w:tcPr>
+            <w:tcW w:type="dxa" w:w="3120"/>
+          </w:tcPr>
+          <w:p>
+            <w:pPr>
+              <w:spacing w:after="20" w:before="20"/>
+              <w:jc w:val="left"/>
+            </w:pPr>
+            <w:r>
+              <w:rPr>
+                <w:rFonts w:ascii="Times New Roman" w:cs="Times New Roman" w:eastAsia="Times New Roman" w:hAnsi="Times New Roman"/>
+                <w:sz w:val="20"/>
+                <w:szCs w:val="20"/>
+              </w:rPr>
+              <w:t xml:space="preserve">Wikipedia IT (https://it.wikipedia.org/wiki/Hyperion_(Parigi))</w:t>
+            </w:r>
+          </w:p>
+        </w:tc>
+      </w:tr>
+      <w:tr>
+        <w:tc>
+          <w:tcPr>
+            <w:tcW w:type="dxa" w:w="3120"/>
+          </w:tcPr>
+          <w:p>
+            <w:pPr>
+              <w:spacing w:after="20" w:before="20"/>
+              <w:jc w:val="left"/>
+            </w:pPr>
+            <w:r>
+              <w:rPr>
+                <w:rFonts w:ascii="Times New Roman" w:cs="Times New Roman" w:eastAsia="Times New Roman" w:hAnsi="Times New Roman"/>
+                <w:sz w:val="20"/>
+                <w:szCs w:val="20"/>
+              </w:rPr>
+              <w:t xml:space="preserve">HY-6</w:t>
+            </w:r>
+          </w:p>
+        </w:tc>
+        <w:tc>
+          <w:tcPr>
+            <w:tcW w:type="dxa" w:w="3120"/>
+          </w:tcPr>
+          <w:p>
+            <w:pPr>
+              <w:spacing w:after="20" w:before="20"/>
+              <w:jc w:val="left"/>
+            </w:pPr>
+            <w:r>
+              <w:rPr>
+                <w:rFonts w:ascii="Times New Roman" w:cs="Times New Roman" w:eastAsia="Times New Roman" w:hAnsi="Times New Roman"/>
+                <w:b/>
+                <w:bCs/>
+                <w:sz w:val="20"/>
+                <w:szCs w:val="20"/>
+              </w:rPr>
+              <w:t xml:space="preserve">Gli arresti e i mandati del 1982.</w:t>
+            </w:r>
+            <w:r>
+              <w:rPr>
+                <w:rFonts w:ascii="Times New Roman" w:cs="Times New Roman" w:eastAsia="Times New Roman" w:hAnsi="Times New Roman"/>
+                <w:sz w:val="20"/>
+                <w:szCs w:val="20"/>
+              </w:rPr>
+              <w:t xml:space="preserve"> Il </w:t>
+            </w:r>
+            <w:r>
+              <w:rPr>
+                <w:rFonts w:ascii="Times New Roman" w:cs="Times New Roman" w:eastAsia="Times New Roman" w:hAnsi="Times New Roman"/>
+                <w:b/>
+                <w:bCs/>
+                <w:sz w:val="20"/>
+                <w:szCs w:val="20"/>
+              </w:rPr>
+              <w:t xml:space="preserve">2 febbraio 1982</w:t>
+            </w:r>
+            <w:r>
+              <w:rPr>
+                <w:rFonts w:ascii="Times New Roman" w:cs="Times New Roman" w:eastAsia="Times New Roman" w:hAnsi="Times New Roman"/>
+                <w:sz w:val="20"/>
+                <w:szCs w:val="20"/>
+              </w:rPr>
+              <w:t xml:space="preserve">, sulla base delle dichiarazioni del pentito Savasta, fu arrestato a Udine </w:t>
+            </w:r>
+            <w:r>
+              <w:rPr>
+                <w:rFonts w:ascii="Times New Roman" w:cs="Times New Roman" w:eastAsia="Times New Roman" w:hAnsi="Times New Roman"/>
+                <w:b/>
+                <w:bCs/>
+                <w:sz w:val="20"/>
+                <w:szCs w:val="20"/>
+              </w:rPr>
+              <w:t xml:space="preserve">Vanni Mulinaris</w:t>
+            </w:r>
+            <w:r>
+              <w:rPr>
+                <w:rFonts w:ascii="Times New Roman" w:cs="Times New Roman" w:eastAsia="Times New Roman" w:hAnsi="Times New Roman"/>
+                <w:sz w:val="20"/>
+                <w:szCs w:val="20"/>
+              </w:rPr>
+              <w:t xml:space="preserve"> (accuse: traffico d'armi e concorso in banda armata); il </w:t>
+            </w:r>
+            <w:r>
+              <w:rPr>
+                <w:rFonts w:ascii="Times New Roman" w:cs="Times New Roman" w:eastAsia="Times New Roman" w:hAnsi="Times New Roman"/>
+                <w:b/>
+                <w:bCs/>
+                <w:sz w:val="20"/>
+                <w:szCs w:val="20"/>
+              </w:rPr>
+              <w:t xml:space="preserve">17 giugno 1982</w:t>
+            </w:r>
+            <w:r>
+              <w:rPr>
+                <w:rFonts w:ascii="Times New Roman" w:cs="Times New Roman" w:eastAsia="Times New Roman" w:hAnsi="Times New Roman"/>
+                <w:sz w:val="20"/>
+                <w:szCs w:val="20"/>
+              </w:rPr>
+              <w:t xml:space="preserve"> il giudice istruttore </w:t>
+            </w:r>
+            <w:r>
+              <w:rPr>
+                <w:rFonts w:ascii="Times New Roman" w:cs="Times New Roman" w:eastAsia="Times New Roman" w:hAnsi="Times New Roman"/>
+                <w:b/>
+                <w:bCs/>
+                <w:sz w:val="20"/>
+                <w:szCs w:val="20"/>
+              </w:rPr>
+              <w:t xml:space="preserve">Rosario Priore</w:t>
+            </w:r>
+            <w:r>
+              <w:rPr>
+                <w:rFonts w:ascii="Times New Roman" w:cs="Times New Roman" w:eastAsia="Times New Roman" w:hAnsi="Times New Roman"/>
+                <w:sz w:val="20"/>
+                <w:szCs w:val="20"/>
+              </w:rPr>
+              <w:t xml:space="preserve"> firmò mandati di cattura internazionali per </w:t>
+            </w:r>
+            <w:r>
+              <w:rPr>
+                <w:rFonts w:ascii="Times New Roman" w:cs="Times New Roman" w:eastAsia="Times New Roman" w:hAnsi="Times New Roman"/>
+                <w:b/>
+                <w:bCs/>
+                <w:sz w:val="20"/>
+                <w:szCs w:val="20"/>
+              </w:rPr>
+              <w:t xml:space="preserve">Berio e Simioni</w:t>
+            </w:r>
+          </w:p>
+        </w:tc>
+        <w:tc>
+          <w:tcPr>
+            <w:tcW w:type="dxa" w:w="3120"/>
+          </w:tcPr>
+          <w:p>
+            <w:pPr>
+              <w:spacing w:after="20" w:before="20"/>
+              <w:jc w:val="left"/>
+            </w:pPr>
+            <w:r>
+              <w:rPr>
+                <w:rFonts w:ascii="Times New Roman" w:cs="Times New Roman" w:eastAsia="Times New Roman" w:hAnsi="Times New Roman"/>
+                <w:sz w:val="20"/>
+                <w:szCs w:val="20"/>
+              </w:rPr>
+              <w:t xml:space="preserve">Comune di Bologna, cronologia (http://www.comune.bologna.it/iperbole/asnsmp/Friuli_Vanni_Mulinaris.html); Tassinari (https://www.ugomariatassinari.it/hyperion-mandati-di-cattura/)</w:t>
+            </w:r>
+          </w:p>
+        </w:tc>
+      </w:tr>
+      <w:tr>
+        <w:tc>
+          <w:tcPr>
+            <w:tcW w:type="dxa" w:w="3120"/>
+          </w:tcPr>
+          <w:p>
+            <w:pPr>
+              <w:spacing w:after="20" w:before="20"/>
+              <w:jc w:val="left"/>
+            </w:pPr>
+            <w:r>
+              <w:rPr>
+                <w:rFonts w:ascii="Times New Roman" w:cs="Times New Roman" w:eastAsia="Times New Roman" w:hAnsi="Times New Roman"/>
+                <w:sz w:val="20"/>
+                <w:szCs w:val="20"/>
+              </w:rPr>
+              <w:t xml:space="preserve">HY-7</w:t>
+            </w:r>
+          </w:p>
+        </w:tc>
+        <w:tc>
+          <w:tcPr>
+            <w:tcW w:type="dxa" w:w="3120"/>
+          </w:tcPr>
+          <w:p>
+            <w:pPr>
+              <w:spacing w:after="20" w:before="20"/>
+              <w:jc w:val="left"/>
+            </w:pPr>
+            <w:r>
+              <w:rPr>
+                <w:rFonts w:ascii="Times New Roman" w:cs="Times New Roman" w:eastAsia="Times New Roman" w:hAnsi="Times New Roman"/>
+                <w:b/>
+                <w:bCs/>
+                <w:sz w:val="20"/>
+                <w:szCs w:val="20"/>
+              </w:rPr>
+              <w:t xml:space="preserve">Gli esiti: proscioglimenti per tutti.</w:t>
+            </w:r>
+            <w:r>
+              <w:rPr>
+                <w:rFonts w:ascii="Times New Roman" w:cs="Times New Roman" w:eastAsia="Times New Roman" w:hAnsi="Times New Roman"/>
+                <w:sz w:val="20"/>
+                <w:szCs w:val="20"/>
+              </w:rPr>
+              <w:t xml:space="preserve"> I tre furono </w:t>
+            </w:r>
+            <w:r>
+              <w:rPr>
+                <w:rFonts w:ascii="Times New Roman" w:cs="Times New Roman" w:eastAsia="Times New Roman" w:hAnsi="Times New Roman"/>
+                <w:b/>
+                <w:bCs/>
+                <w:sz w:val="20"/>
+                <w:szCs w:val="20"/>
+              </w:rPr>
+              <w:t xml:space="preserve">prosciolti</w:t>
+            </w:r>
+            <w:r>
+              <w:rPr>
+                <w:rFonts w:ascii="Times New Roman" w:cs="Times New Roman" w:eastAsia="Times New Roman" w:hAnsi="Times New Roman"/>
+                <w:sz w:val="20"/>
+                <w:szCs w:val="20"/>
+              </w:rPr>
+              <w:t xml:space="preserve"> dalle accuse di terrorismo e traffico d'armi; Mulinaris fu dichiarato estraneo, anche a seguito di una campagna di solidarietà di intellettuali francesi — con una lettera al Presidente della Repubblica sottoscritta, fra gli altri, dall'</w:t>
+            </w:r>
+            <w:r>
+              <w:rPr>
+                <w:rFonts w:ascii="Times New Roman" w:cs="Times New Roman" w:eastAsia="Times New Roman" w:hAnsi="Times New Roman"/>
+                <w:b/>
+                <w:bCs/>
+                <w:sz w:val="20"/>
+                <w:szCs w:val="20"/>
+              </w:rPr>
+              <w:t xml:space="preserve">Abbé Pierre</w:t>
+            </w:r>
+            <w:r>
+              <w:rPr>
+                <w:rFonts w:ascii="Times New Roman" w:cs="Times New Roman" w:eastAsia="Times New Roman" w:hAnsi="Times New Roman"/>
+                <w:sz w:val="20"/>
+                <w:szCs w:val="20"/>
+              </w:rPr>
+              <w:t xml:space="preserve"> (fondatore di Emmaus), da Pierre Vidal-Naquet e Jean Cassou</w:t>
+            </w:r>
+          </w:p>
+        </w:tc>
+        <w:tc>
+          <w:tcPr>
+            <w:tcW w:type="dxa" w:w="3120"/>
+          </w:tcPr>
+          <w:p>
+            <w:pPr>
+              <w:spacing w:after="20" w:before="20"/>
+              <w:jc w:val="left"/>
+            </w:pPr>
+            <w:r>
+              <w:rPr>
+                <w:rFonts w:ascii="Times New Roman" w:cs="Times New Roman" w:eastAsia="Times New Roman" w:hAnsi="Times New Roman"/>
+                <w:sz w:val="20"/>
+                <w:szCs w:val="20"/>
+              </w:rPr>
+              <w:t xml:space="preserve">Wikipedia IT (https://it.wikipedia.org/wiki/Hyperion_(Parigi)); Archivio storico del Senato, carteggio Mulinaris (https://patrimonio.archivio.senato.it/inventario/scheda/giacomo-mancini/IT-AFS-043-001944/carteggio-vanni-mulinaris)</w:t>
+            </w:r>
+          </w:p>
+        </w:tc>
+      </w:tr>
+      <w:tr>
+        <w:tc>
+          <w:tcPr>
+            <w:tcW w:type="dxa" w:w="3120"/>
+          </w:tcPr>
+          <w:p>
+            <w:pPr>
+              <w:spacing w:after="20" w:before="20"/>
+              <w:jc w:val="left"/>
+            </w:pPr>
+            <w:r>
+              <w:rPr>
+                <w:rFonts w:ascii="Times New Roman" w:cs="Times New Roman" w:eastAsia="Times New Roman" w:hAnsi="Times New Roman"/>
+                <w:sz w:val="20"/>
+                <w:szCs w:val="20"/>
+              </w:rPr>
+              <w:t xml:space="preserve">HY-8</w:t>
+            </w:r>
+          </w:p>
+        </w:tc>
+        <w:tc>
+          <w:tcPr>
+            <w:tcW w:type="dxa" w:w="3120"/>
+          </w:tcPr>
+          <w:p>
+            <w:pPr>
+              <w:spacing w:after="20" w:before="20"/>
+              <w:jc w:val="left"/>
+            </w:pPr>
+            <w:r>
+              <w:rPr>
+                <w:rFonts w:ascii="Times New Roman" w:cs="Times New Roman" w:eastAsia="Times New Roman" w:hAnsi="Times New Roman"/>
+                <w:b/>
+                <w:bCs/>
+                <w:sz w:val="20"/>
+                <w:szCs w:val="20"/>
+              </w:rPr>
+              <w:t xml:space="preserve">L'audizione parlamentare (2015).</w:t>
+            </w:r>
+            <w:r>
+              <w:rPr>
+                <w:rFonts w:ascii="Times New Roman" w:cs="Times New Roman" w:eastAsia="Times New Roman" w:hAnsi="Times New Roman"/>
+                <w:sz w:val="20"/>
+                <w:szCs w:val="20"/>
+              </w:rPr>
+              <w:t xml:space="preserve"> La </w:t>
+            </w:r>
+            <w:r>
+              <w:rPr>
+                <w:rFonts w:ascii="Times New Roman" w:cs="Times New Roman" w:eastAsia="Times New Roman" w:hAnsi="Times New Roman"/>
+                <w:b/>
+                <w:bCs/>
+                <w:sz w:val="20"/>
+                <w:szCs w:val="20"/>
+              </w:rPr>
+              <w:t xml:space="preserve">Commissione Moro 2</w:t>
+            </w:r>
+            <w:r>
+              <w:rPr>
+                <w:rFonts w:ascii="Times New Roman" w:cs="Times New Roman" w:eastAsia="Times New Roman" w:hAnsi="Times New Roman"/>
+                <w:sz w:val="20"/>
+                <w:szCs w:val="20"/>
+              </w:rPr>
+              <w:t xml:space="preserve"> riesaminò il nodo; il 28 ottobre 2015 audì </w:t>
+            </w:r>
+            <w:r>
+              <w:rPr>
+                <w:rFonts w:ascii="Times New Roman" w:cs="Times New Roman" w:eastAsia="Times New Roman" w:hAnsi="Times New Roman"/>
+                <w:b/>
+                <w:bCs/>
+                <w:sz w:val="20"/>
+                <w:szCs w:val="20"/>
+              </w:rPr>
+              <w:t xml:space="preserve">Duccio Berio</w:t>
+            </w:r>
+            <w:r>
+              <w:rPr>
+                <w:rFonts w:ascii="Times New Roman" w:cs="Times New Roman" w:eastAsia="Times New Roman" w:hAnsi="Times New Roman"/>
+                <w:sz w:val="20"/>
+                <w:szCs w:val="20"/>
+              </w:rPr>
+              <w:t xml:space="preserve">, che respinse ogni addebito («eravamo solo un gruppo di amici»). Il resoconto stenografico è agli atti della Camera</w:t>
+            </w:r>
+          </w:p>
+        </w:tc>
+        <w:tc>
+          <w:tcPr>
+            <w:tcW w:type="dxa" w:w="3120"/>
+          </w:tcPr>
+          <w:p>
+            <w:pPr>
+              <w:spacing w:after="20" w:before="20"/>
+              <w:jc w:val="left"/>
+            </w:pPr>
+            <w:r>
+              <w:rPr>
+                <w:rFonts w:ascii="Times New Roman" w:cs="Times New Roman" w:eastAsia="Times New Roman" w:hAnsi="Times New Roman"/>
+                <w:sz w:val="20"/>
+                <w:szCs w:val="20"/>
+              </w:rPr>
+              <w:t xml:space="preserve">Camera, stenografico 28/10/2015 (https://documenti.camera.it/leg17/resoconti/commissioni/stenografici/html/68/audiz2/audizione/2015/10/28/stenografico.0056.html); Il Fatto Quotidiano (https://www.ilfattoquotidiano.it/2015/10/28/caso-moro-luomo-di-hyperion-alla-commissione-non-centriamo-nulla-eravamo-solo-un-gruppo-di-amici/2169499/)</w:t>
+            </w:r>
+          </w:p>
+        </w:tc>
+      </w:tr>
+      <w:tr>
+        <w:tc>
+          <w:tcPr>
+            <w:tcW w:type="dxa" w:w="3120"/>
+          </w:tcPr>
+          <w:p>
+            <w:pPr>
+              <w:spacing w:after="20" w:before="20"/>
+              <w:jc w:val="left"/>
+            </w:pPr>
+            <w:r>
+              <w:rPr>
+                <w:rFonts w:ascii="Times New Roman" w:cs="Times New Roman" w:eastAsia="Times New Roman" w:hAnsi="Times New Roman"/>
+                <w:sz w:val="20"/>
+                <w:szCs w:val="20"/>
+              </w:rPr>
+              <w:t xml:space="preserve">HY-9</w:t>
+            </w:r>
+          </w:p>
+        </w:tc>
+        <w:tc>
+          <w:tcPr>
+            <w:tcW w:type="dxa" w:w="3120"/>
+          </w:tcPr>
+          <w:p>
+            <w:pPr>
+              <w:spacing w:after="20" w:before="20"/>
+              <w:jc w:val="left"/>
+            </w:pPr>
+            <w:r>
+              <w:rPr>
+                <w:rFonts w:ascii="Times New Roman" w:cs="Times New Roman" w:eastAsia="Times New Roman" w:hAnsi="Times New Roman"/>
+                <w:b/>
+                <w:bCs/>
+                <w:sz w:val="20"/>
+                <w:szCs w:val="20"/>
+              </w:rPr>
+              <w:t xml:space="preserve">La letteratura qualificata.</w:t>
+            </w:r>
+            <w:r>
+              <w:rPr>
+                <w:rFonts w:ascii="Times New Roman" w:cs="Times New Roman" w:eastAsia="Times New Roman" w:hAnsi="Times New Roman"/>
+                <w:sz w:val="20"/>
+                <w:szCs w:val="20"/>
+              </w:rPr>
+              <w:t xml:space="preserve"> Il nodo ha una bibliografia d'autore: </w:t>
+            </w:r>
+            <w:r>
+              <w:rPr>
+                <w:rFonts w:ascii="Times New Roman" w:cs="Times New Roman" w:eastAsia="Times New Roman" w:hAnsi="Times New Roman"/>
+                <w:i/>
+                <w:iCs/>
+                <w:sz w:val="20"/>
+                <w:szCs w:val="20"/>
+              </w:rPr>
+              <w:t xml:space="preserve">Chi manovrava le Brigate rosse?</w:t>
+            </w:r>
+            <w:r>
+              <w:rPr>
+                <w:rFonts w:ascii="Times New Roman" w:cs="Times New Roman" w:eastAsia="Times New Roman" w:hAnsi="Times New Roman"/>
+                <w:sz w:val="20"/>
+                <w:szCs w:val="20"/>
+              </w:rPr>
+              <w:t xml:space="preserve"> di Silvano De Prospo e </w:t>
+            </w:r>
+            <w:r>
+              <w:rPr>
+                <w:rFonts w:ascii="Times New Roman" w:cs="Times New Roman" w:eastAsia="Times New Roman" w:hAnsi="Times New Roman"/>
+                <w:b/>
+                <w:bCs/>
+                <w:sz w:val="20"/>
+                <w:szCs w:val="20"/>
+              </w:rPr>
+              <w:t xml:space="preserve">Rosario Priore</w:t>
+            </w:r>
+            <w:r>
+              <w:rPr>
+                <w:rFonts w:ascii="Times New Roman" w:cs="Times New Roman" w:eastAsia="Times New Roman" w:hAnsi="Times New Roman"/>
+                <w:sz w:val="20"/>
+                <w:szCs w:val="20"/>
+              </w:rPr>
+              <w:t xml:space="preserve"> (Ponte alle Grazie, 2011) — scritto cioè dallo stesso magistrato che indagò: fonte di parte investigativa, qualificata ma non giudiziale</w:t>
+            </w:r>
+          </w:p>
+        </w:tc>
+        <w:tc>
+          <w:tcPr>
+            <w:tcW w:type="dxa" w:w="3120"/>
+          </w:tcPr>
+          <w:p>
+            <w:pPr>
+              <w:spacing w:after="20" w:before="20"/>
+              <w:jc w:val="left"/>
+            </w:pPr>
+            <w:r>
+              <w:rPr>
+                <w:rFonts w:ascii="Times New Roman" w:cs="Times New Roman" w:eastAsia="Times New Roman" w:hAnsi="Times New Roman"/>
+                <w:sz w:val="20"/>
+                <w:szCs w:val="20"/>
+              </w:rPr>
+              <w:t xml:space="preserve">Scheda editoriale (https://www.unilibro.it/libro/de-prospo-silvano-priore-rosario/chi-manovrava-brigate-rosse-storia-misteri-dell-hyperion-parigi-scuola-lingue-centrale-terrorismo-internazionale/9788862201742)</w:t>
+            </w:r>
+          </w:p>
+        </w:tc>
+      </w:tr>
+    </w:tbl>
+    <w:p>
+      <w:pPr>
+        <w:spacing w:after="80"/>
+      </w:pPr>
+    </w:p>
+    <w:p>
+      <w:pPr>
+        <w:pStyle w:val="Heading2"/>
+        <w:spacing w:after="100" w:before="200"/>
+      </w:pPr>
+      <w:r>
+        <w:rPr>
+          <w:rFonts w:ascii="Times New Roman" w:cs="Times New Roman" w:eastAsia="Times New Roman" w:hAnsi="Times New Roman"/>
+          <w:sz w:val="24"/>
+          <w:szCs w:val="24"/>
+        </w:rPr>
+        <w:t xml:space="preserve">2. Le due tesi contrapposte — entrambe non provate</w:t>
+      </w:r>
+    </w:p>
+    <w:p>
+      <w:pPr>
+        <w:spacing w:after="120" w:line="276"/>
+        <w:jc w:val="both"/>
+      </w:pPr>
+      <w:r>
+        <w:rPr>
+          <w:rFonts w:ascii="Times New Roman" w:cs="Times New Roman" w:eastAsia="Times New Roman" w:hAnsi="Times New Roman"/>
+          <w:sz w:val="24"/>
+          <w:szCs w:val="24"/>
+        </w:rPr>
+        <w:t xml:space="preserve">Il nodo Hyperion è conteso da due narrazioni speculari, e la triangolazione deve trattarle simmetricamente.</w:t>
+      </w:r>
+    </w:p>
+    <w:p>
+      <w:pPr>
+        <w:spacing w:after="120" w:line="276"/>
+        <w:jc w:val="both"/>
+      </w:pPr>
+      <w:r>
+        <w:rPr>
+          <w:rFonts w:ascii="Times New Roman" w:cs="Times New Roman" w:eastAsia="Times New Roman" w:hAnsi="Times New Roman"/>
+          <w:b/>
+          <w:bCs/>
+          <w:sz w:val="24"/>
+          <w:szCs w:val="24"/>
+        </w:rPr>
+        <w:t xml:space="preserve">Tesi A — «la centrale del terrorismo internazionale».</w:t>
+      </w:r>
+      <w:r>
+        <w:rPr>
+          <w:rFonts w:ascii="Times New Roman" w:cs="Times New Roman" w:eastAsia="Times New Roman" w:hAnsi="Times New Roman"/>
+          <w:sz w:val="24"/>
+          <w:szCs w:val="24"/>
+        </w:rPr>
+        <w:t xml:space="preserve"> Hyperion come punto d'incontro fra BR, ETA, IRA e OLP e come «direzione strategica estera» della lotta armata italiana. Fondamenti: le dichiarazioni di pentiti, la convergenza temporale dell'ufficio romano (HY-4), i passaggi biografici Superclan→BR (HY-2). </w:t>
+      </w:r>
+      <w:r>
+        <w:rPr>
+          <w:rFonts w:ascii="Times New Roman" w:cs="Times New Roman" w:eastAsia="Times New Roman" w:hAnsi="Times New Roman"/>
+          <w:b/>
+          <w:bCs/>
+          <w:sz w:val="24"/>
+          <w:szCs w:val="24"/>
+        </w:rPr>
+        <w:t xml:space="preserve">Esito al vaglio:</w:t>
+      </w:r>
+      <w:r>
+        <w:rPr>
+          <w:rFonts w:ascii="Times New Roman" w:cs="Times New Roman" w:eastAsia="Times New Roman" w:hAnsi="Times New Roman"/>
+          <w:sz w:val="24"/>
+          <w:szCs w:val="24"/>
+        </w:rPr>
+        <w:t xml:space="preserve"> i procedimenti giudiziari costruiti su questa tesi si sono chiusi con proscioglimenti (HY-7); la Commissione Moro 2 l'ha riesaminata senza produrre accertamenti nuovi di grado giudiziario. </w:t>
+      </w:r>
+      <w:r>
+        <w:rPr>
+          <w:rFonts w:ascii="Times New Roman" w:cs="Times New Roman" w:eastAsia="Times New Roman" w:hAnsi="Times New Roman"/>
+          <w:b/>
+          <w:bCs/>
+          <w:sz w:val="24"/>
+          <w:szCs w:val="24"/>
+        </w:rPr>
+        <w:t xml:space="preserve">Resta congettura.</w:t>
+      </w:r>
+    </w:p>
+    <w:p>
+      <w:pPr>
+        <w:spacing w:after="120" w:line="276"/>
+        <w:jc w:val="both"/>
+      </w:pPr>
+      <w:r>
+        <w:rPr>
+          <w:rFonts w:ascii="Times New Roman" w:cs="Times New Roman" w:eastAsia="Times New Roman" w:hAnsi="Times New Roman"/>
+          <w:b/>
+          <w:bCs/>
+          <w:sz w:val="24"/>
+          <w:szCs w:val="24"/>
+        </w:rPr>
+        <w:t xml:space="preserve">Tesi B — «la centrale d'intelligence».</w:t>
+      </w:r>
+      <w:r>
+        <w:rPr>
+          <w:rFonts w:ascii="Times New Roman" w:cs="Times New Roman" w:eastAsia="Times New Roman" w:hAnsi="Times New Roman"/>
+          <w:sz w:val="24"/>
+          <w:szCs w:val="24"/>
+        </w:rPr>
+        <w:t xml:space="preserve"> Hyperion come struttura legata a servizi occidentali — nelle audizioni e nelle dichiarazioni di magistrati (in particolare Priore) si riferisce che il SISDE di Giulio Grassini chiese ai servizi francesi informazioni sulla sede «coperta» di Rouen ritenendola «sede di un servizio d'informazione collegato alla CIA», e che interventi fra servizi avrebbero frenato le indagini (Il Sussidiario, intervista (https://www.ilsussidiario.net/news/scuola-di-lingue-hyperion-copriva-terroristi-a-parigi-i-francesi-sapevano-tutto/2164445/)). </w:t>
+      </w:r>
+      <w:r>
+        <w:rPr>
+          <w:rFonts w:ascii="Times New Roman" w:cs="Times New Roman" w:eastAsia="Times New Roman" w:hAnsi="Times New Roman"/>
+          <w:b/>
+          <w:bCs/>
+          <w:sz w:val="24"/>
+          <w:szCs w:val="24"/>
+        </w:rPr>
+        <w:t xml:space="preserve">Esito al vaglio:</w:t>
+      </w:r>
+      <w:r>
+        <w:rPr>
+          <w:rFonts w:ascii="Times New Roman" w:cs="Times New Roman" w:eastAsia="Times New Roman" w:hAnsi="Times New Roman"/>
+          <w:sz w:val="24"/>
+          <w:szCs w:val="24"/>
+        </w:rPr>
+        <w:t xml:space="preserve"> si tratta di </w:t>
+      </w:r>
+      <w:r>
+        <w:rPr>
+          <w:rFonts w:ascii="Times New Roman" w:cs="Times New Roman" w:eastAsia="Times New Roman" w:hAnsi="Times New Roman"/>
+          <w:b/>
+          <w:bCs/>
+          <w:sz w:val="24"/>
+          <w:szCs w:val="24"/>
+        </w:rPr>
+        <w:t xml:space="preserve">testimonianze e valutazioni investigative qualificate</w:t>
+      </w:r>
+      <w:r>
+        <w:rPr>
+          <w:rFonts w:ascii="Times New Roman" w:cs="Times New Roman" w:eastAsia="Times New Roman" w:hAnsi="Times New Roman"/>
+          <w:sz w:val="24"/>
+          <w:szCs w:val="24"/>
+        </w:rPr>
+        <w:t xml:space="preserve"> — non di accertamenti giudiziari; nessuna sentenza le ha mai convalidate. </w:t>
+      </w:r>
+      <w:r>
+        <w:rPr>
+          <w:rFonts w:ascii="Times New Roman" w:cs="Times New Roman" w:eastAsia="Times New Roman" w:hAnsi="Times New Roman"/>
+          <w:b/>
+          <w:bCs/>
+          <w:sz w:val="24"/>
+          <w:szCs w:val="24"/>
+        </w:rPr>
+        <w:t xml:space="preserve">Resta congettura</w:t>
+      </w:r>
+      <w:r>
+        <w:rPr>
+          <w:rFonts w:ascii="Times New Roman" w:cs="Times New Roman" w:eastAsia="Times New Roman" w:hAnsi="Times New Roman"/>
+          <w:sz w:val="24"/>
+          <w:szCs w:val="24"/>
+        </w:rPr>
+        <w:t xml:space="preserve">, di rango testimoniale.</w:t>
+      </w:r>
+    </w:p>
+    <w:p>
+      <w:pPr>
+        <w:spacing w:after="120" w:line="276"/>
+        <w:jc w:val="both"/>
+      </w:pPr>
+      <w:r>
+        <w:rPr>
+          <w:rFonts w:ascii="Times New Roman" w:cs="Times New Roman" w:eastAsia="Times New Roman" w:hAnsi="Times New Roman"/>
+          <w:sz w:val="24"/>
+          <w:szCs w:val="24"/>
+        </w:rPr>
+        <w:t xml:space="preserve">Il punto metodologico, che è il contributo del corpus a questo nodo: </w:t>
+      </w:r>
+      <w:r>
+        <w:rPr>
+          <w:rFonts w:ascii="Times New Roman" w:cs="Times New Roman" w:eastAsia="Times New Roman" w:hAnsi="Times New Roman"/>
+          <w:b/>
+          <w:bCs/>
+          <w:sz w:val="24"/>
+          <w:szCs w:val="24"/>
+        </w:rPr>
+        <w:t xml:space="preserve">le due tesi non possono sommarsi in un generico «Hyperion era comunque qualcosa di torbido»</w:t>
+      </w:r>
+      <w:r>
+        <w:rPr>
+          <w:rFonts w:ascii="Times New Roman" w:cs="Times New Roman" w:eastAsia="Times New Roman" w:hAnsi="Times New Roman"/>
+          <w:sz w:val="24"/>
+          <w:szCs w:val="24"/>
+        </w:rPr>
+        <w:t xml:space="preserve">. Sono ipotesi alternative, ciascuna non provata; la loro coesistenza quarantennale nel discorso pubblico misura l'assenza di accertamento, non la sua abbondanza. Il «doppio sospetto» non è un grado di prova: è la forma che prende, in Italia, il vuoto probatorio.</w:t>
+      </w:r>
+    </w:p>
+    <w:p>
+      <w:pPr>
+        <w:pStyle w:val="Heading2"/>
+        <w:spacing w:after="100" w:before="200"/>
+      </w:pPr>
+      <w:r>
+        <w:rPr>
+          <w:rFonts w:ascii="Times New Roman" w:cs="Times New Roman" w:eastAsia="Times New Roman" w:hAnsi="Times New Roman"/>
+          <w:sz w:val="24"/>
+          <w:szCs w:val="24"/>
+        </w:rPr>
+        <w:t xml:space="preserve">3. I ponti con il corpus (BH-1…BH-4)</w:t>
+      </w:r>
+    </w:p>
+    <w:p>
+      <w:pPr>
+        <w:pStyle w:val="Heading3"/>
+        <w:spacing w:after="80" w:before="160"/>
+      </w:pPr>
+      <w:r>
+        <w:rPr>
+          <w:rFonts w:ascii="Times New Roman" w:cs="Times New Roman" w:eastAsia="Times New Roman" w:hAnsi="Times New Roman"/>
+          <w:sz w:val="24"/>
+          <w:szCs w:val="24"/>
+        </w:rPr>
+        <w:t xml:space="preserve">BH-1 · Con il fronte Feltrinelli e il nodo Pecorile (M-3) — ponte genealogico documentato</w:t>
+      </w:r>
+    </w:p>
+    <w:p>
+      <w:pPr>
+        <w:spacing w:after="120" w:line="276"/>
+        <w:jc w:val="both"/>
+      </w:pPr>
+      <w:r>
+        <w:rPr>
+          <w:rFonts w:ascii="Times New Roman" w:cs="Times New Roman" w:eastAsia="Times New Roman" w:hAnsi="Times New Roman"/>
+          <w:sz w:val="24"/>
+          <w:szCs w:val="24"/>
+        </w:rPr>
+        <w:t xml:space="preserve">La matrice del corpus data la nascita delle BR al convegno di Pecorile (agosto 1970), dentro l'area del CPM milanese. Hyperion vi si aggancia </w:t>
+      </w:r>
+      <w:r>
+        <w:rPr>
+          <w:rFonts w:ascii="Times New Roman" w:cs="Times New Roman" w:eastAsia="Times New Roman" w:hAnsi="Times New Roman"/>
+          <w:b/>
+          <w:bCs/>
+          <w:sz w:val="24"/>
+          <w:szCs w:val="24"/>
+        </w:rPr>
+        <w:t xml:space="preserve">a monte</w:t>
+      </w:r>
+      <w:r>
+        <w:rPr>
+          <w:rFonts w:ascii="Times New Roman" w:cs="Times New Roman" w:eastAsia="Times New Roman" w:hAnsi="Times New Roman"/>
+          <w:sz w:val="24"/>
+          <w:szCs w:val="24"/>
+        </w:rPr>
+        <w:t xml:space="preserve">: i suoi futuri fondatori furono co-fondatori del CPM (HY-1) e se ne separarono </w:t>
+      </w:r>
+      <w:r>
+        <w:rPr>
+          <w:rFonts w:ascii="Times New Roman" w:cs="Times New Roman" w:eastAsia="Times New Roman" w:hAnsi="Times New Roman"/>
+          <w:b/>
+          <w:bCs/>
+          <w:sz w:val="24"/>
+          <w:szCs w:val="24"/>
+        </w:rPr>
+        <w:t xml:space="preserve">prima</w:t>
+      </w:r>
+      <w:r>
+        <w:rPr>
+          <w:rFonts w:ascii="Times New Roman" w:cs="Times New Roman" w:eastAsia="Times New Roman" w:hAnsi="Times New Roman"/>
+          <w:sz w:val="24"/>
+          <w:szCs w:val="24"/>
+        </w:rPr>
+        <w:t xml:space="preserve"> della scelta armata di Curcio, formando il Superclan (HY-2). Il ponte documentato è dunque una </w:t>
+      </w:r>
+      <w:r>
+        <w:rPr>
+          <w:rFonts w:ascii="Times New Roman" w:cs="Times New Roman" w:eastAsia="Times New Roman" w:hAnsi="Times New Roman"/>
+          <w:b/>
+          <w:bCs/>
+          <w:sz w:val="24"/>
+          <w:szCs w:val="24"/>
+        </w:rPr>
+        <w:t xml:space="preserve">genealogia comune con biforcazione precoce</w:t>
+      </w:r>
+      <w:r>
+        <w:rPr>
+          <w:rFonts w:ascii="Times New Roman" w:cs="Times New Roman" w:eastAsia="Times New Roman" w:hAnsi="Times New Roman"/>
+          <w:sz w:val="24"/>
+          <w:szCs w:val="24"/>
+        </w:rPr>
+        <w:t xml:space="preserve">: stesso brodo di coltura, strade divise. Il passaggio di </w:t>
+      </w:r>
+      <w:r>
+        <w:rPr>
+          <w:rFonts w:ascii="Times New Roman" w:cs="Times New Roman" w:eastAsia="Times New Roman" w:hAnsi="Times New Roman"/>
+          <w:b/>
+          <w:bCs/>
+          <w:sz w:val="24"/>
+          <w:szCs w:val="24"/>
+        </w:rPr>
+        <w:t xml:space="preserve">Moretti</w:t>
+      </w:r>
+      <w:r>
+        <w:rPr>
+          <w:rFonts w:ascii="Times New Roman" w:cs="Times New Roman" w:eastAsia="Times New Roman" w:hAnsi="Times New Roman"/>
+          <w:sz w:val="24"/>
+          <w:szCs w:val="24"/>
+        </w:rPr>
+        <w:t xml:space="preserve"> — dal Superclan alle BR, fino alla direzione del sequestro Moro e, per sua ammissione (nodo P-1 della matrice), all'uccisione — è il filo biografico che tiene uniti i due rami; ma un filo biografico non è una catena di comando, e la triangolazione lo lascia dov'è.</w:t>
+      </w:r>
+    </w:p>
+    <w:p>
+      <w:pPr>
+        <w:pStyle w:val="Heading3"/>
+        <w:spacing w:after="80" w:before="160"/>
+      </w:pPr>
+      <w:r>
+        <w:rPr>
+          <w:rFonts w:ascii="Times New Roman" w:cs="Times New Roman" w:eastAsia="Times New Roman" w:hAnsi="Times New Roman"/>
+          <w:sz w:val="24"/>
+          <w:szCs w:val="24"/>
+        </w:rPr>
+        <w:t xml:space="preserve">BH-2 · Con la Parte terza dell'opera morotea (il «quadro internazionale») — ponte tematico</w:t>
+      </w:r>
+    </w:p>
+    <w:p>
+      <w:pPr>
+        <w:spacing w:after="120" w:line="276"/>
+        <w:jc w:val="both"/>
+      </w:pPr>
+      <w:r>
+        <w:rPr>
+          <w:rFonts w:ascii="Times New Roman" w:cs="Times New Roman" w:eastAsia="Times New Roman" w:hAnsi="Times New Roman"/>
+          <w:sz w:val="24"/>
+          <w:szCs w:val="24"/>
+        </w:rPr>
+        <w:t xml:space="preserve">Il dossier falsificazionista del corpus tratta le questioni aperte del caso Moro assegnando a ciascuna grado di prova e criterio di smentita. Hyperion appartiene a quel capitolo come </w:t>
+      </w:r>
+      <w:r>
+        <w:rPr>
+          <w:rFonts w:ascii="Times New Roman" w:cs="Times New Roman" w:eastAsia="Times New Roman" w:hAnsi="Times New Roman"/>
+          <w:b/>
+          <w:bCs/>
+          <w:sz w:val="24"/>
+          <w:szCs w:val="24"/>
+        </w:rPr>
+        <w:t xml:space="preserve">caso di scuola</w:t>
+      </w:r>
+      <w:r>
+        <w:rPr>
+          <w:rFonts w:ascii="Times New Roman" w:cs="Times New Roman" w:eastAsia="Times New Roman" w:hAnsi="Times New Roman"/>
+          <w:sz w:val="24"/>
+          <w:szCs w:val="24"/>
+        </w:rPr>
+        <w:t xml:space="preserve">: l'ipotesi di una direzione estera delle BR — di qualunque segno — non ha mai superato il vaglio giudiziario. Il criterio di smentita per entrambe le tesi del § 2 è identico e semplice: </w:t>
+      </w:r>
+      <w:r>
+        <w:rPr>
+          <w:rFonts w:ascii="Times New Roman" w:cs="Times New Roman" w:eastAsia="Times New Roman" w:hAnsi="Times New Roman"/>
+          <w:b/>
+          <w:bCs/>
+          <w:sz w:val="24"/>
+          <w:szCs w:val="24"/>
+        </w:rPr>
+        <w:t xml:space="preserve">un documento d'archivio o una sentenza</w:t>
+      </w:r>
+      <w:r>
+        <w:rPr>
+          <w:rFonts w:ascii="Times New Roman" w:cs="Times New Roman" w:eastAsia="Times New Roman" w:hAnsi="Times New Roman"/>
+          <w:sz w:val="24"/>
+          <w:szCs w:val="24"/>
+        </w:rPr>
+        <w:t xml:space="preserve"> che stabilisca l'affiliazione. In quarant'anni non è emerso né l'uno né l'altra.</w:t>
+      </w:r>
+    </w:p>
+    <w:p>
+      <w:pPr>
+        <w:pStyle w:val="Heading3"/>
+        <w:spacing w:after="80" w:before="160"/>
+      </w:pPr>
+      <w:r>
+        <w:rPr>
+          <w:rFonts w:ascii="Times New Roman" w:cs="Times New Roman" w:eastAsia="Times New Roman" w:hAnsi="Times New Roman"/>
+          <w:sz w:val="24"/>
+          <w:szCs w:val="24"/>
+        </w:rPr>
+        <w:t xml:space="preserve">BH-3 · Con il nodo M-5 («l'ombra statunitense») — simmetria di metodo</w:t>
+      </w:r>
+    </w:p>
+    <w:p>
+      <w:pPr>
+        <w:spacing w:after="120" w:line="276"/>
+        <w:jc w:val="both"/>
+      </w:pPr>
+      <w:r>
+        <w:rPr>
+          <w:rFonts w:ascii="Times New Roman" w:cs="Times New Roman" w:eastAsia="Times New Roman" w:hAnsi="Times New Roman"/>
+          <w:sz w:val="24"/>
+          <w:szCs w:val="24"/>
+        </w:rPr>
+        <w:t xml:space="preserve">La matrice Guevara-Moro registra fatti americani documentati sulle due morti senza promuoverli a regia. La tesi B su Hyperion (§ 2) chiede lo stesso trattamento: le dichiarazioni sul SISDE e sulla CIA sono </w:t>
+      </w:r>
+      <w:r>
+        <w:rPr>
+          <w:rFonts w:ascii="Times New Roman" w:cs="Times New Roman" w:eastAsia="Times New Roman" w:hAnsi="Times New Roman"/>
+          <w:b/>
+          <w:bCs/>
+          <w:sz w:val="24"/>
+          <w:szCs w:val="24"/>
+        </w:rPr>
+        <w:t xml:space="preserve">fatti testimoniali documentati</w:t>
+      </w:r>
+      <w:r>
+        <w:rPr>
+          <w:rFonts w:ascii="Times New Roman" w:cs="Times New Roman" w:eastAsia="Times New Roman" w:hAnsi="Times New Roman"/>
+          <w:sz w:val="24"/>
+          <w:szCs w:val="24"/>
+        </w:rPr>
+        <w:t xml:space="preserve"> (qualcuno le ha rese, in sedi qualificate) la cui </w:t>
+      </w:r>
+      <w:r>
+        <w:rPr>
+          <w:rFonts w:ascii="Times New Roman" w:cs="Times New Roman" w:eastAsia="Times New Roman" w:hAnsi="Times New Roman"/>
+          <w:b/>
+          <w:bCs/>
+          <w:sz w:val="24"/>
+          <w:szCs w:val="24"/>
+        </w:rPr>
+        <w:t xml:space="preserve">verità sostanziale resta non accertata</w:t>
+      </w:r>
+      <w:r>
+        <w:rPr>
+          <w:rFonts w:ascii="Times New Roman" w:cs="Times New Roman" w:eastAsia="Times New Roman" w:hAnsi="Times New Roman"/>
+          <w:sz w:val="24"/>
+          <w:szCs w:val="24"/>
+        </w:rPr>
+        <w:t xml:space="preserve">. Documentare l'esistenza di una testimonianza non è documentare ciò che essa afferma: è la distinzione su cui il corpus è costruito.</w:t>
+      </w:r>
+    </w:p>
+    <w:p>
+      <w:pPr>
+        <w:pStyle w:val="Heading3"/>
+        <w:spacing w:after="80" w:before="160"/>
+      </w:pPr>
+      <w:r>
+        <w:rPr>
+          <w:rFonts w:ascii="Times New Roman" w:cs="Times New Roman" w:eastAsia="Times New Roman" w:hAnsi="Times New Roman"/>
+          <w:sz w:val="24"/>
+          <w:szCs w:val="24"/>
+        </w:rPr>
+        <w:t xml:space="preserve">BH-4 · Con la convergenza temporale di via Nicotera (HY-4) — convergenza, da non promuovere</w:t>
+      </w:r>
+    </w:p>
+    <w:p>
+      <w:pPr>
+        <w:spacing w:after="120" w:line="276"/>
+        <w:jc w:val="both"/>
+      </w:pPr>
+      <w:r>
+        <w:rPr>
+          <w:rFonts w:ascii="Times New Roman" w:cs="Times New Roman" w:eastAsia="Times New Roman" w:hAnsi="Times New Roman"/>
+          <w:sz w:val="24"/>
+          <w:szCs w:val="24"/>
+        </w:rPr>
+        <w:t xml:space="preserve">L'apertura dell'ufficio romano un mese prima di via Fani, in uno stabile condiviso con coperture SISMI, è il tipo esatto di dato che la dietrologia trasforma in prova. Il corpus lo registra per ciò che è: una </w:t>
+      </w:r>
+      <w:r>
+        <w:rPr>
+          <w:rFonts w:ascii="Times New Roman" w:cs="Times New Roman" w:eastAsia="Times New Roman" w:hAnsi="Times New Roman"/>
+          <w:b/>
+          <w:bCs/>
+          <w:sz w:val="24"/>
+          <w:szCs w:val="24"/>
+        </w:rPr>
+        <w:t xml:space="preserve">convergenza di tempo e di luogo</w:t>
+      </w:r>
+      <w:r>
+        <w:rPr>
+          <w:rFonts w:ascii="Times New Roman" w:cs="Times New Roman" w:eastAsia="Times New Roman" w:hAnsi="Times New Roman"/>
+          <w:sz w:val="24"/>
+          <w:szCs w:val="24"/>
+        </w:rPr>
+        <w:t xml:space="preserve">, documentata e mai tradotta in alcun accertamento di responsabilità. Vale la regola dell'intero lavoro: la convergenza non si promuove a nesso.</w:t>
+      </w:r>
+    </w:p>
+    <w:p>
+      <w:pPr>
+        <w:pStyle w:val="Heading2"/>
+        <w:spacing w:after="100" w:before="200"/>
+      </w:pPr>
+      <w:r>
+        <w:rPr>
+          <w:rFonts w:ascii="Times New Roman" w:cs="Times New Roman" w:eastAsia="Times New Roman" w:hAnsi="Times New Roman"/>
+          <w:sz w:val="24"/>
+          <w:szCs w:val="24"/>
+        </w:rPr>
+        <w:t xml:space="preserve">4. Anti-triangolazioni (ATH-1…ATH-3)</w:t>
+      </w:r>
+    </w:p>
+    <w:tbl>
+      <w:tblPr>
+        <w:tblW w:type="dxa" w:w="9360"/>
+        <w:tblBorders>
+          <w:top w:val="single" w:color="auto" w:sz="4"/>
+          <w:left w:val="single" w:color="auto" w:sz="4"/>
+          <w:bottom w:val="single" w:color="auto" w:sz="4"/>
+          <w:right w:val="single" w:color="auto" w:sz="4"/>
+          <w:insideH w:val="single" w:color="auto" w:sz="4"/>
+          <w:insideV w:val="single" w:color="auto" w:sz="4"/>
+        </w:tblBorders>
+      </w:tblPr>
+      <w:tblGrid>
+        <w:gridCol w:w="4680"/>
+        <w:gridCol w:w="4680"/>
+      </w:tblGrid>
+      <w:tr>
+        <w:tc>
+          <w:tcPr>
+            <w:tcW w:type="dxa" w:w="4680"/>
+            <w:shd w:fill="1F3864" w:val="clear"/>
+          </w:tcPr>
+          <w:p>
+            <w:pPr>
+              <w:spacing w:after="20" w:before="20"/>
+              <w:jc w:val="left"/>
+            </w:pPr>
+            <w:r>
+              <w:rPr>
+                <w:rFonts w:ascii="Times New Roman" w:cs="Times New Roman" w:eastAsia="Times New Roman" w:hAnsi="Times New Roman"/>
+                <w:b/>
+                <w:bCs/>
+                <w:color w:val="FFFFFF"/>
+                <w:sz w:val="20"/>
+                <w:szCs w:val="20"/>
+              </w:rPr>
+              <w:t xml:space="preserve">#</w:t>
+            </w:r>
+          </w:p>
+        </w:tc>
+        <w:tc>
+          <w:tcPr>
+            <w:tcW w:type="dxa" w:w="4680"/>
+            <w:shd w:fill="1F3864" w:val="clear"/>
+          </w:tcPr>
+          <w:p>
+            <w:pPr>
+              <w:spacing w:after="20" w:before="20"/>
+              <w:jc w:val="left"/>
+            </w:pPr>
+            <w:r>
+              <w:rPr>
+                <w:rFonts w:ascii="Times New Roman" w:cs="Times New Roman" w:eastAsia="Times New Roman" w:hAnsi="Times New Roman"/>
+                <w:b/>
+                <w:bCs/>
+                <w:color w:val="FFFFFF"/>
+                <w:sz w:val="20"/>
+                <w:szCs w:val="20"/>
+              </w:rPr>
+              <w:t xml:space="preserve">Anti-triangolazione</w:t>
+            </w:r>
+          </w:p>
+        </w:tc>
+      </w:tr>
+      <w:tr>
+        <w:tc>
+          <w:tcPr>
+            <w:tcW w:type="dxa" w:w="4680"/>
+          </w:tcPr>
+          <w:p>
+            <w:pPr>
+              <w:spacing w:after="20" w:before="20"/>
+              <w:jc w:val="left"/>
+            </w:pPr>
+            <w:r>
+              <w:rPr>
+                <w:rFonts w:ascii="Times New Roman" w:cs="Times New Roman" w:eastAsia="Times New Roman" w:hAnsi="Times New Roman"/>
+                <w:sz w:val="20"/>
+                <w:szCs w:val="20"/>
+              </w:rPr>
+              <w:t xml:space="preserve">ATH-1</w:t>
+            </w:r>
+          </w:p>
+        </w:tc>
+        <w:tc>
+          <w:tcPr>
+            <w:tcW w:type="dxa" w:w="4680"/>
+          </w:tcPr>
+          <w:p>
+            <w:pPr>
+              <w:spacing w:after="20" w:before="20"/>
+              <w:jc w:val="left"/>
+            </w:pPr>
+            <w:r>
+              <w:rPr>
+                <w:rFonts w:ascii="Times New Roman" w:cs="Times New Roman" w:eastAsia="Times New Roman" w:hAnsi="Times New Roman"/>
+                <w:b/>
+                <w:bCs/>
+                <w:sz w:val="20"/>
+                <w:szCs w:val="20"/>
+              </w:rPr>
+              <w:t xml:space="preserve">Nessuna condanna, presunzione d'innocenza piena.</w:t>
+            </w:r>
+            <w:r>
+              <w:rPr>
+                <w:rFonts w:ascii="Times New Roman" w:cs="Times New Roman" w:eastAsia="Times New Roman" w:hAnsi="Times New Roman"/>
+                <w:sz w:val="20"/>
+                <w:szCs w:val="20"/>
+              </w:rPr>
+              <w:t xml:space="preserve"> I fondatori di Hyperion furono indagati e </w:t>
+            </w:r>
+            <w:r>
+              <w:rPr>
+                <w:rFonts w:ascii="Times New Roman" w:cs="Times New Roman" w:eastAsia="Times New Roman" w:hAnsi="Times New Roman"/>
+                <w:b/>
+                <w:bCs/>
+                <w:sz w:val="20"/>
+                <w:szCs w:val="20"/>
+              </w:rPr>
+              <w:t xml:space="preserve">prosciolti</w:t>
+            </w:r>
+            <w:r>
+              <w:rPr>
+                <w:rFonts w:ascii="Times New Roman" w:cs="Times New Roman" w:eastAsia="Times New Roman" w:hAnsi="Times New Roman"/>
+                <w:sz w:val="20"/>
+                <w:szCs w:val="20"/>
+              </w:rPr>
+              <w:t xml:space="preserve">. Ogni uso del loro nome come «responsabili» di alcunché è fuori dal terreno documentato e fuori dalla disciplina del corpus</w:t>
+            </w:r>
+          </w:p>
+        </w:tc>
+      </w:tr>
+      <w:tr>
+        <w:tc>
+          <w:tcPr>
+            <w:tcW w:type="dxa" w:w="4680"/>
+          </w:tcPr>
+          <w:p>
+            <w:pPr>
+              <w:spacing w:after="20" w:before="20"/>
+              <w:jc w:val="left"/>
+            </w:pPr>
+            <w:r>
+              <w:rPr>
+                <w:rFonts w:ascii="Times New Roman" w:cs="Times New Roman" w:eastAsia="Times New Roman" w:hAnsi="Times New Roman"/>
+                <w:sz w:val="20"/>
+                <w:szCs w:val="20"/>
+              </w:rPr>
+              <w:t xml:space="preserve">ATH-2</w:t>
+            </w:r>
+          </w:p>
+        </w:tc>
+        <w:tc>
+          <w:tcPr>
+            <w:tcW w:type="dxa" w:w="4680"/>
+          </w:tcPr>
+          <w:p>
+            <w:pPr>
+              <w:spacing w:after="20" w:before="20"/>
+              <w:jc w:val="left"/>
+            </w:pPr>
+            <w:r>
+              <w:rPr>
+                <w:rFonts w:ascii="Times New Roman" w:cs="Times New Roman" w:eastAsia="Times New Roman" w:hAnsi="Times New Roman"/>
+                <w:b/>
+                <w:bCs/>
+                <w:sz w:val="20"/>
+                <w:szCs w:val="20"/>
+              </w:rPr>
+              <w:t xml:space="preserve">Le due tesi non si sommano.</w:t>
+            </w:r>
+            <w:r>
+              <w:rPr>
+                <w:rFonts w:ascii="Times New Roman" w:cs="Times New Roman" w:eastAsia="Times New Roman" w:hAnsi="Times New Roman"/>
+                <w:sz w:val="20"/>
+                <w:szCs w:val="20"/>
+              </w:rPr>
+              <w:t xml:space="preserve"> «Centrale del terrorismo» e «centrale d'intelligence» sono congetture alternative; il doppio sospetto non costituisce un grado di prova intermedio. Chi le somma commette due volte l'errore che il corpus chiama promozione della convergenza a nesso</w:t>
+            </w:r>
+          </w:p>
+        </w:tc>
+      </w:tr>
+      <w:tr>
+        <w:tc>
+          <w:tcPr>
+            <w:tcW w:type="dxa" w:w="4680"/>
+          </w:tcPr>
+          <w:p>
+            <w:pPr>
+              <w:spacing w:after="20" w:before="20"/>
+              <w:jc w:val="left"/>
+            </w:pPr>
+            <w:r>
+              <w:rPr>
+                <w:rFonts w:ascii="Times New Roman" w:cs="Times New Roman" w:eastAsia="Times New Roman" w:hAnsi="Times New Roman"/>
+                <w:sz w:val="20"/>
+                <w:szCs w:val="20"/>
+              </w:rPr>
+              <w:t xml:space="preserve">ATH-3</w:t>
+            </w:r>
+          </w:p>
+        </w:tc>
+        <w:tc>
+          <w:tcPr>
+            <w:tcW w:type="dxa" w:w="4680"/>
+          </w:tcPr>
+          <w:p>
+            <w:pPr>
+              <w:spacing w:after="20" w:before="20"/>
+              <w:jc w:val="left"/>
+            </w:pPr>
+            <w:r>
+              <w:rPr>
+                <w:rFonts w:ascii="Times New Roman" w:cs="Times New Roman" w:eastAsia="Times New Roman" w:hAnsi="Times New Roman"/>
+                <w:b/>
+                <w:bCs/>
+                <w:sz w:val="20"/>
+                <w:szCs w:val="20"/>
+              </w:rPr>
+              <w:t xml:space="preserve">Il filo Moretti non è una catena di comando.</w:t>
+            </w:r>
+            <w:r>
+              <w:rPr>
+                <w:rFonts w:ascii="Times New Roman" w:cs="Times New Roman" w:eastAsia="Times New Roman" w:hAnsi="Times New Roman"/>
+                <w:sz w:val="20"/>
+                <w:szCs w:val="20"/>
+              </w:rPr>
+              <w:t xml:space="preserve"> Il passaggio biografico Superclan→BR di Moretti è documentato; la deduzione che le BR fossero eterodirette attraverso quel filo non lo è, e i processi — che pure disponevano delle dichiarazioni dei pentiti — non l'hanno accertata</w:t>
+            </w:r>
+          </w:p>
+        </w:tc>
+      </w:tr>
+    </w:tbl>
+    <w:p>
+      <w:pPr>
+        <w:spacing w:after="80"/>
+      </w:pPr>
+    </w:p>
+    <w:p>
+      <w:pPr>
+        <w:pStyle w:val="Heading2"/>
+        <w:spacing w:after="100" w:before="200"/>
+      </w:pPr>
+      <w:r>
+        <w:rPr>
+          <w:rFonts w:ascii="Times New Roman" w:cs="Times New Roman" w:eastAsia="Times New Roman" w:hAnsi="Times New Roman"/>
+          <w:sz w:val="24"/>
+          <w:szCs w:val="24"/>
+        </w:rPr>
+        <w:t xml:space="preserve">5. Registro di esecuzione</w:t>
+      </w:r>
+    </w:p>
+    <w:p>
+      <w:pPr>
+        <w:pStyle w:val="ListParagraph"/>
+        <w:numPr>
+          <w:ilvl w:val="0"/>
+          <w:numId w:val="1"/>
+        </w:numPr>
+        <w:spacing w:after="40"/>
+        <w:jc w:val="both"/>
+      </w:pPr>
+      <w:r>
+        <w:rPr>
+          <w:rFonts w:ascii="Times New Roman" w:cs="Times New Roman" w:eastAsia="Times New Roman" w:hAnsi="Times New Roman"/>
+          <w:sz w:val="24"/>
+          <w:szCs w:val="24"/>
+        </w:rPr>
+        <w:t xml:space="preserve">Nodi documentati: </w:t>
+      </w:r>
+      <w:r>
+        <w:rPr>
+          <w:rFonts w:ascii="Times New Roman" w:cs="Times New Roman" w:eastAsia="Times New Roman" w:hAnsi="Times New Roman"/>
+          <w:b/>
+          <w:bCs/>
+          <w:sz w:val="24"/>
+          <w:szCs w:val="24"/>
+        </w:rPr>
+        <w:t xml:space="preserve">9</w:t>
+      </w:r>
+      <w:r>
+        <w:rPr>
+          <w:rFonts w:ascii="Times New Roman" w:cs="Times New Roman" w:eastAsia="Times New Roman" w:hAnsi="Times New Roman"/>
+          <w:sz w:val="24"/>
+          <w:szCs w:val="24"/>
+        </w:rPr>
+        <w:t xml:space="preserve"> (HY-1…HY-9), tutti con fonte citata; verifiche web dedicate eseguite in sessione: </w:t>
+      </w:r>
+      <w:r>
+        <w:rPr>
+          <w:rFonts w:ascii="Times New Roman" w:cs="Times New Roman" w:eastAsia="Times New Roman" w:hAnsi="Times New Roman"/>
+          <w:b/>
+          <w:bCs/>
+          <w:sz w:val="24"/>
+          <w:szCs w:val="24"/>
+        </w:rPr>
+        <w:t xml:space="preserve">3</w:t>
+      </w:r>
+      <w:r>
+        <w:rPr>
+          <w:rFonts w:ascii="Times New Roman" w:cs="Times New Roman" w:eastAsia="Times New Roman" w:hAnsi="Times New Roman"/>
+          <w:sz w:val="24"/>
+          <w:szCs w:val="24"/>
+        </w:rPr>
+        <w:t xml:space="preserve">.</w:t>
+      </w:r>
+    </w:p>
+    <w:p>
+      <w:pPr>
+        <w:pStyle w:val="ListParagraph"/>
+        <w:numPr>
+          <w:ilvl w:val="0"/>
+          <w:numId w:val="1"/>
+        </w:numPr>
+        <w:spacing w:after="40"/>
+        <w:jc w:val="both"/>
+      </w:pPr>
+      <w:r>
+        <w:rPr>
+          <w:rFonts w:ascii="Times New Roman" w:cs="Times New Roman" w:eastAsia="Times New Roman" w:hAnsi="Times New Roman"/>
+          <w:sz w:val="24"/>
+          <w:szCs w:val="24"/>
+        </w:rPr>
+        <w:t xml:space="preserve">Tesi vagliate e lasciate al grado di congettura: </w:t>
+      </w:r>
+      <w:r>
+        <w:rPr>
+          <w:rFonts w:ascii="Times New Roman" w:cs="Times New Roman" w:eastAsia="Times New Roman" w:hAnsi="Times New Roman"/>
+          <w:b/>
+          <w:bCs/>
+          <w:sz w:val="24"/>
+          <w:szCs w:val="24"/>
+        </w:rPr>
+        <w:t xml:space="preserve">2</w:t>
+      </w:r>
+      <w:r>
+        <w:rPr>
+          <w:rFonts w:ascii="Times New Roman" w:cs="Times New Roman" w:eastAsia="Times New Roman" w:hAnsi="Times New Roman"/>
+          <w:sz w:val="24"/>
+          <w:szCs w:val="24"/>
+        </w:rPr>
+        <w:t xml:space="preserve"> (§ 2), con criterio di smentita comune dichiarato (BH-2).</w:t>
+      </w:r>
+    </w:p>
+    <w:p>
+      <w:pPr>
+        <w:pStyle w:val="ListParagraph"/>
+        <w:numPr>
+          <w:ilvl w:val="0"/>
+          <w:numId w:val="1"/>
+        </w:numPr>
+        <w:spacing w:after="40"/>
+        <w:jc w:val="both"/>
+      </w:pPr>
+      <w:r>
+        <w:rPr>
+          <w:rFonts w:ascii="Times New Roman" w:cs="Times New Roman" w:eastAsia="Times New Roman" w:hAnsi="Times New Roman"/>
+          <w:sz w:val="24"/>
+          <w:szCs w:val="24"/>
+        </w:rPr>
+        <w:t xml:space="preserve">Ponti con il corpus: </w:t>
+      </w:r>
+      <w:r>
+        <w:rPr>
+          <w:rFonts w:ascii="Times New Roman" w:cs="Times New Roman" w:eastAsia="Times New Roman" w:hAnsi="Times New Roman"/>
+          <w:b/>
+          <w:bCs/>
+          <w:sz w:val="24"/>
+          <w:szCs w:val="24"/>
+        </w:rPr>
+        <w:t xml:space="preserve">4</w:t>
+      </w:r>
+      <w:r>
+        <w:rPr>
+          <w:rFonts w:ascii="Times New Roman" w:cs="Times New Roman" w:eastAsia="Times New Roman" w:hAnsi="Times New Roman"/>
+          <w:sz w:val="24"/>
+          <w:szCs w:val="24"/>
+        </w:rPr>
+        <w:t xml:space="preserve"> (BH-1 genealogico documentato; BH-2 tematico; BH-3 simmetria di metodo; BH-4 convergenza dichiarata).</w:t>
+      </w:r>
+    </w:p>
+    <w:p>
+      <w:pPr>
+        <w:pStyle w:val="ListParagraph"/>
+        <w:numPr>
+          <w:ilvl w:val="0"/>
+          <w:numId w:val="1"/>
+        </w:numPr>
+        <w:spacing w:after="40"/>
+        <w:jc w:val="both"/>
+      </w:pPr>
+      <w:r>
+        <w:rPr>
+          <w:rFonts w:ascii="Times New Roman" w:cs="Times New Roman" w:eastAsia="Times New Roman" w:hAnsi="Times New Roman"/>
+          <w:sz w:val="24"/>
+          <w:szCs w:val="24"/>
+        </w:rPr>
+        <w:t xml:space="preserve">Anti-triangolazioni: </w:t>
+      </w:r>
+      <w:r>
+        <w:rPr>
+          <w:rFonts w:ascii="Times New Roman" w:cs="Times New Roman" w:eastAsia="Times New Roman" w:hAnsi="Times New Roman"/>
+          <w:b/>
+          <w:bCs/>
+          <w:sz w:val="24"/>
+          <w:szCs w:val="24"/>
+        </w:rPr>
+        <w:t xml:space="preserve">3</w:t>
+      </w:r>
+      <w:r>
+        <w:rPr>
+          <w:rFonts w:ascii="Times New Roman" w:cs="Times New Roman" w:eastAsia="Times New Roman" w:hAnsi="Times New Roman"/>
+          <w:sz w:val="24"/>
+          <w:szCs w:val="24"/>
+        </w:rPr>
+        <w:t xml:space="preserve">.</w:t>
+      </w:r>
+    </w:p>
+    <w:p>
+      <w:pPr>
+        <w:pStyle w:val="ListParagraph"/>
+        <w:numPr>
+          <w:ilvl w:val="0"/>
+          <w:numId w:val="1"/>
+        </w:numPr>
+        <w:spacing w:after="40"/>
+        <w:jc w:val="both"/>
+      </w:pPr>
+      <w:r>
+        <w:rPr>
+          <w:rFonts w:ascii="Times New Roman" w:cs="Times New Roman" w:eastAsia="Times New Roman" w:hAnsi="Times New Roman"/>
+          <w:sz w:val="24"/>
+          <w:szCs w:val="24"/>
+        </w:rPr>
+        <w:t xml:space="preserve">Il nodo </w:t>
+      </w:r>
+      <w:r>
+        <w:rPr>
+          <w:rFonts w:ascii="Times New Roman" w:cs="Times New Roman" w:eastAsia="Times New Roman" w:hAnsi="Times New Roman"/>
+          <w:b/>
+          <w:bCs/>
+          <w:sz w:val="24"/>
+          <w:szCs w:val="24"/>
+        </w:rPr>
+        <w:t xml:space="preserve">non è inserito</w:t>
+      </w:r>
+      <w:r>
+        <w:rPr>
+          <w:rFonts w:ascii="Times New Roman" w:cs="Times New Roman" w:eastAsia="Times New Roman" w:hAnsi="Times New Roman"/>
+          <w:sz w:val="24"/>
+          <w:szCs w:val="24"/>
+        </w:rPr>
+        <w:t xml:space="preserve"> nella cronologia sinottica: quella registra solo fatti documentati dei tre fili (Guevara, mito, Moro), e Hyperion vi apparterrebbe solo per via di tesi non provate.</w:t>
+      </w:r>
+    </w:p>
+    <w:p>
+      <w:pPr>
+        <w:pBdr>
+          <w:bottom w:val="single" w:color="999999" w:sz="6" w:space="1"/>
+        </w:pBdr>
+        <w:spacing w:after="80"/>
+      </w:pPr>
+    </w:p>
+    <w:p>
+      <w:pPr>
+        <w:spacing w:after="120" w:line="276"/>
+        <w:jc w:val="both"/>
+      </w:pPr>
+      <w:r>
+        <w:rPr>
+          <w:rFonts w:ascii="Times New Roman" w:cs="Times New Roman" w:eastAsia="Times New Roman" w:hAnsi="Times New Roman"/>
+          <w:i/>
+          <w:iCs/>
+          <w:sz w:val="24"/>
+          <w:szCs w:val="24"/>
+        </w:rPr>
+        <w:t xml:space="preserve">Triangolazione del nodo Hyperion con il corpus. Fondatori nominati solo per fatti pubblici e con esiti giudiziari liberatori esplicitati; le due tesi contrapposte lasciate entrambe al grado di congettura con criterio di smentita dichiarato. Nessuna imputazione oltre il giudicato — qui, dove il giudicato assolve, la formula significa: nessuna imputazione.</w:t>
+      </w:r>
+    </w:p>
+    <w:p>
+      <w:r>
+        <w:br w:type="page"/>
+      </w:r>
+    </w:p>
+    <w:p>
+      <w:pPr>
+        <w:pStyle w:val="Heading1"/>
+        <w:spacing w:after="120" w:before="240"/>
+      </w:pPr>
+      <w:r>
+        <w:rPr>
+          <w:rFonts w:ascii="Times New Roman" w:cs="Times New Roman" w:eastAsia="Times New Roman" w:hAnsi="Times New Roman"/>
+          <w:sz w:val="24"/>
+          <w:szCs w:val="24"/>
+        </w:rPr>
+        <w:t xml:space="preserve">Triangolazione d'incrocio: Feltrinelli e Hyperion</w:t>
+      </w:r>
+    </w:p>
+    <w:p>
+      <w:pPr>
+        <w:spacing w:after="120" w:line="276"/>
+        <w:jc w:val="both"/>
+      </w:pPr>
+      <w:r>
+        <w:rPr>
+          <w:rFonts w:ascii="Times New Roman" w:cs="Times New Roman" w:eastAsia="Times New Roman" w:hAnsi="Times New Roman"/>
+          <w:i/>
+          <w:iCs/>
+          <w:sz w:val="24"/>
+          <w:szCs w:val="24"/>
+        </w:rPr>
+        <w:t xml:space="preserve">I due fronti a confronto: la matrice milanese, le tre strade, i ponti biografici e le congetture smentite — 24 agosto 2026</w:t>
+      </w:r>
+    </w:p>
+    <w:p>
+      <w:pPr>
+        <w:pBdr>
+          <w:left w:val="single" w:color="1F3864" w:sz="18" w:space="8"/>
+        </w:pBdr>
+        <w:spacing w:after="80" w:before="80"/>
+        <w:ind w:left="360" w:right="360"/>
+        <w:jc w:val="both"/>
+      </w:pPr>
+      <w:r>
+        <w:rPr>
+          <w:rFonts w:ascii="Times New Roman" w:cs="Times New Roman" w:eastAsia="Times New Roman" w:hAnsi="Times New Roman"/>
+          <w:b/>
+          <w:bCs/>
+          <w:i w:val="false"/>
+          <w:iCs w:val="false"/>
+          <w:sz w:val="24"/>
+          <w:szCs w:val="24"/>
+        </w:rPr>
+        <w:t xml:space="preserve">Statuto.</w:t>
+      </w:r>
+      <w:r>
+        <w:rPr>
+          <w:rFonts w:ascii="Times New Roman" w:cs="Times New Roman" w:eastAsia="Times New Roman" w:hAnsi="Times New Roman"/>
+          <w:i w:val="false"/>
+          <w:iCs w:val="false"/>
+          <w:sz w:val="24"/>
+          <w:szCs w:val="24"/>
+        </w:rPr>
+        <w:t xml:space="preserve"> Il corpus ha ora due studi che si guardano: il vettore (Feltrinelli, i GAP, Segrate) e il nodo Hyperion (Simioni, Berio, Mulinaris, il Superclan, Parigi). Questo documento li </w:t>
+      </w:r>
+      <w:r>
+        <w:rPr>
+          <w:rFonts w:ascii="Times New Roman" w:cs="Times New Roman" w:eastAsia="Times New Roman" w:hAnsi="Times New Roman"/>
+          <w:b/>
+          <w:bCs/>
+          <w:i w:val="false"/>
+          <w:iCs w:val="false"/>
+          <w:sz w:val="24"/>
+          <w:szCs w:val="24"/>
+        </w:rPr>
+        <w:t xml:space="preserve">incrocia</w:t>
+      </w:r>
+      <w:r>
+        <w:rPr>
+          <w:rFonts w:ascii="Times New Roman" w:cs="Times New Roman" w:eastAsia="Times New Roman" w:hAnsi="Times New Roman"/>
+          <w:i w:val="false"/>
+          <w:iCs w:val="false"/>
+          <w:sz w:val="24"/>
+          <w:szCs w:val="24"/>
+        </w:rPr>
+        <w:t xml:space="preserve">: stabilisce che cosa li lega davvero — su fonti — e che cosa li lega solo nella pubblicistica. L'esito si anticipa perché orienta la lettura: </w:t>
+      </w:r>
+      <w:r>
+        <w:rPr>
+          <w:rFonts w:ascii="Times New Roman" w:cs="Times New Roman" w:eastAsia="Times New Roman" w:hAnsi="Times New Roman"/>
+          <w:b/>
+          <w:bCs/>
+          <w:i w:val="false"/>
+          <w:iCs w:val="false"/>
+          <w:sz w:val="24"/>
+          <w:szCs w:val="24"/>
+        </w:rPr>
+        <w:t xml:space="preserve">i due fronti condividono la matrice e gli uomini, non le organizzazioni.</w:t>
+      </w:r>
+      <w:r>
+        <w:rPr>
+          <w:rFonts w:ascii="Times New Roman" w:cs="Times New Roman" w:eastAsia="Times New Roman" w:hAnsi="Times New Roman"/>
+          <w:i w:val="false"/>
+          <w:iCs w:val="false"/>
+          <w:sz w:val="24"/>
+          <w:szCs w:val="24"/>
+        </w:rPr>
+        <w:t xml:space="preserve"> Hyperion nacque nel 1976, quattro anni dopo la morte di Feltrinelli: fra l'editore e la scuola di Parigi non esiste, per ragioni di calendario prima che di prova, alcun rapporto diretto. Ciò che esiste — ed è documentato — è un </w:t>
+      </w:r>
+      <w:r>
+        <w:rPr>
+          <w:rFonts w:ascii="Times New Roman" w:cs="Times New Roman" w:eastAsia="Times New Roman" w:hAnsi="Times New Roman"/>
+          <w:b/>
+          <w:bCs/>
+          <w:i w:val="false"/>
+          <w:iCs w:val="false"/>
+          <w:sz w:val="24"/>
+          <w:szCs w:val="24"/>
+        </w:rPr>
+        <w:t xml:space="preserve">ceppo comune</w:t>
+      </w:r>
+      <w:r>
+        <w:rPr>
+          <w:rFonts w:ascii="Times New Roman" w:cs="Times New Roman" w:eastAsia="Times New Roman" w:hAnsi="Times New Roman"/>
+          <w:i w:val="false"/>
+          <w:iCs w:val="false"/>
+          <w:sz w:val="24"/>
+          <w:szCs w:val="24"/>
+        </w:rPr>
+        <w:t xml:space="preserve"> (la Milano extraparlamentare del 1969-72) da cui uscirono tre progetti clandestini distinti, e alcuni </w:t>
+      </w:r>
+      <w:r>
+        <w:rPr>
+          <w:rFonts w:ascii="Times New Roman" w:cs="Times New Roman" w:eastAsia="Times New Roman" w:hAnsi="Times New Roman"/>
+          <w:b/>
+          <w:bCs/>
+          <w:i w:val="false"/>
+          <w:iCs w:val="false"/>
+          <w:sz w:val="24"/>
+          <w:szCs w:val="24"/>
+        </w:rPr>
+        <w:t xml:space="preserve">ponti biografici</w:t>
+      </w:r>
+      <w:r>
+        <w:rPr>
+          <w:rFonts w:ascii="Times New Roman" w:cs="Times New Roman" w:eastAsia="Times New Roman" w:hAnsi="Times New Roman"/>
+          <w:i w:val="false"/>
+          <w:iCs w:val="false"/>
+          <w:sz w:val="24"/>
+          <w:szCs w:val="24"/>
+        </w:rPr>
+        <w:t xml:space="preserve"> precisi. Vale la disciplina di entrambi i fronti: i fondatori di Hyperion furono prosciolti da ogni accusa; la morte di Feltrinelli ha una ricostruzione giudiziaria; le congetture della memorialistica sono trattate come tali, comprese quelle </w:t>
+      </w:r>
+      <w:r>
+        <w:rPr>
+          <w:rFonts w:ascii="Times New Roman" w:cs="Times New Roman" w:eastAsia="Times New Roman" w:hAnsi="Times New Roman"/>
+          <w:b/>
+          <w:bCs/>
+          <w:i w:val="false"/>
+          <w:iCs w:val="false"/>
+          <w:sz w:val="24"/>
+          <w:szCs w:val="24"/>
+        </w:rPr>
+        <w:t xml:space="preserve">smentite</w:t>
+      </w:r>
+      <w:r>
+        <w:rPr>
+          <w:rFonts w:ascii="Times New Roman" w:cs="Times New Roman" w:eastAsia="Times New Roman" w:hAnsi="Times New Roman"/>
+          <w:i w:val="false"/>
+          <w:iCs w:val="false"/>
+          <w:sz w:val="24"/>
+          <w:szCs w:val="24"/>
+        </w:rPr>
+        <w:t xml:space="preserve">.</w:t>
+      </w:r>
+    </w:p>
+    <w:p>
+      <w:pPr>
+        <w:pBdr>
+          <w:bottom w:val="single" w:color="999999" w:sz="6" w:space="1"/>
+        </w:pBdr>
+        <w:spacing w:after="80"/>
+      </w:pPr>
+    </w:p>
+    <w:p>
+      <w:pPr>
+        <w:pStyle w:val="Heading2"/>
+        <w:spacing w:after="100" w:before="200"/>
+      </w:pPr>
+      <w:r>
+        <w:rPr>
+          <w:rFonts w:ascii="Times New Roman" w:cs="Times New Roman" w:eastAsia="Times New Roman" w:hAnsi="Times New Roman"/>
+          <w:sz w:val="24"/>
+          <w:szCs w:val="24"/>
+        </w:rPr>
+        <w:t xml:space="preserve">1. La matrice e le tre strade (nodi FH-1…FH-2)</w:t>
+      </w:r>
+    </w:p>
+    <w:p>
+      <w:pPr>
+        <w:spacing w:after="120" w:line="276"/>
+        <w:jc w:val="both"/>
+      </w:pPr>
+      <w:r>
+        <w:rPr>
+          <w:rFonts w:ascii="Times New Roman" w:cs="Times New Roman" w:eastAsia="Times New Roman" w:hAnsi="Times New Roman"/>
+          <w:b/>
+          <w:bCs/>
+          <w:sz w:val="24"/>
+          <w:szCs w:val="24"/>
+        </w:rPr>
+        <w:t xml:space="preserve">FH-1 · Il ceppo comune (documentato).</w:t>
+      </w:r>
+      <w:r>
+        <w:rPr>
+          <w:rFonts w:ascii="Times New Roman" w:cs="Times New Roman" w:eastAsia="Times New Roman" w:hAnsi="Times New Roman"/>
+          <w:sz w:val="24"/>
+          <w:szCs w:val="24"/>
+        </w:rPr>
+        <w:t xml:space="preserve"> La matrice è il </w:t>
+      </w:r>
+      <w:r>
+        <w:rPr>
+          <w:rFonts w:ascii="Times New Roman" w:cs="Times New Roman" w:eastAsia="Times New Roman" w:hAnsi="Times New Roman"/>
+          <w:b/>
+          <w:bCs/>
+          <w:sz w:val="24"/>
+          <w:szCs w:val="24"/>
+        </w:rPr>
+        <w:t xml:space="preserve">Collettivo Politico Metropolitano</w:t>
+      </w:r>
+      <w:r>
+        <w:rPr>
+          <w:rFonts w:ascii="Times New Roman" w:cs="Times New Roman" w:eastAsia="Times New Roman" w:hAnsi="Times New Roman"/>
+          <w:sz w:val="24"/>
+          <w:szCs w:val="24"/>
+        </w:rPr>
+        <w:t xml:space="preserve"> (Milano, settembre 1969) e l'area che gli stava attorno: vi convissero Renato Curcio e i futuri fondatori di Hyperion — Simioni, Berio, Mulinaris (nodo HY-1). Feltrinelli non apparteneva al CPM, ma operava nella stessa città, negli stessi anni, sullo stesso crinale fra legalità e clandestinità, e con l'area era in contatto (nodo M-2: Curcio, «a scuola di guerriglia da Feltrinelli»).</w:t>
+      </w:r>
+    </w:p>
+    <w:p>
+      <w:pPr>
+        <w:spacing w:after="120" w:line="276"/>
+        <w:jc w:val="both"/>
+      </w:pPr>
+      <w:r>
+        <w:rPr>
+          <w:rFonts w:ascii="Times New Roman" w:cs="Times New Roman" w:eastAsia="Times New Roman" w:hAnsi="Times New Roman"/>
+          <w:b/>
+          <w:bCs/>
+          <w:sz w:val="24"/>
+          <w:szCs w:val="24"/>
+        </w:rPr>
+        <w:t xml:space="preserve">FH-2 · La triforcazione del 1970 (documentato).</w:t>
+      </w:r>
+      <w:r>
+        <w:rPr>
+          <w:rFonts w:ascii="Times New Roman" w:cs="Times New Roman" w:eastAsia="Times New Roman" w:hAnsi="Times New Roman"/>
+          <w:sz w:val="24"/>
+          <w:szCs w:val="24"/>
+        </w:rPr>
+        <w:t xml:space="preserve"> Nel giro di pochi mesi, da quel ceppo e dal suo intorno uscirono </w:t>
+      </w:r>
+      <w:r>
+        <w:rPr>
+          <w:rFonts w:ascii="Times New Roman" w:cs="Times New Roman" w:eastAsia="Times New Roman" w:hAnsi="Times New Roman"/>
+          <w:b/>
+          <w:bCs/>
+          <w:sz w:val="24"/>
+          <w:szCs w:val="24"/>
+        </w:rPr>
+        <w:t xml:space="preserve">tre progetti clandestini distinti</w:t>
+      </w:r>
+      <w:r>
+        <w:rPr>
+          <w:rFonts w:ascii="Times New Roman" w:cs="Times New Roman" w:eastAsia="Times New Roman" w:hAnsi="Times New Roman"/>
+          <w:sz w:val="24"/>
+          <w:szCs w:val="24"/>
+        </w:rPr>
+        <w:t xml:space="preserve">:</w:t>
+      </w:r>
+    </w:p>
+    <w:tbl>
+      <w:tblPr>
+        <w:tblW w:type="dxa" w:w="9360"/>
+        <w:tblBorders>
+          <w:top w:val="single" w:color="auto" w:sz="4"/>
+          <w:left w:val="single" w:color="auto" w:sz="4"/>
+          <w:bottom w:val="single" w:color="auto" w:sz="4"/>
+          <w:right w:val="single" w:color="auto" w:sz="4"/>
+          <w:insideH w:val="single" w:color="auto" w:sz="4"/>
+          <w:insideV w:val="single" w:color="auto" w:sz="4"/>
+        </w:tblBorders>
+      </w:tblPr>
+      <w:tblGrid>
+        <w:gridCol w:w="3120"/>
+        <w:gridCol w:w="3120"/>
+        <w:gridCol w:w="3120"/>
+      </w:tblGrid>
+      <w:tr>
+        <w:tc>
+          <w:tcPr>
+            <w:tcW w:type="dxa" w:w="3120"/>
+            <w:shd w:fill="1F3864" w:val="clear"/>
+          </w:tcPr>
+          <w:p>
+            <w:pPr>
+              <w:spacing w:after="20" w:before="20"/>
+              <w:jc w:val="left"/>
+            </w:pPr>
+            <w:r>
+              <w:rPr>
+                <w:rFonts w:ascii="Times New Roman" w:cs="Times New Roman" w:eastAsia="Times New Roman" w:hAnsi="Times New Roman"/>
+                <w:b/>
+                <w:bCs/>
+                <w:color w:val="FFFFFF"/>
+                <w:sz w:val="20"/>
+                <w:szCs w:val="20"/>
+              </w:rPr>
+              <w:t xml:space="preserve">Strada</w:t>
+            </w:r>
+          </w:p>
+        </w:tc>
+        <w:tc>
+          <w:tcPr>
+            <w:tcW w:type="dxa" w:w="3120"/>
+            <w:shd w:fill="1F3864" w:val="clear"/>
+          </w:tcPr>
+          <w:p>
+            <w:pPr>
+              <w:spacing w:after="20" w:before="20"/>
+              <w:jc w:val="left"/>
+            </w:pPr>
+            <w:r>
+              <w:rPr>
+                <w:rFonts w:ascii="Times New Roman" w:cs="Times New Roman" w:eastAsia="Times New Roman" w:hAnsi="Times New Roman"/>
+                <w:b/>
+                <w:bCs/>
+                <w:color w:val="FFFFFF"/>
+                <w:sz w:val="20"/>
+                <w:szCs w:val="20"/>
+              </w:rPr>
+              <w:t xml:space="preserve">Progetto</w:t>
+            </w:r>
+          </w:p>
+        </w:tc>
+        <w:tc>
+          <w:tcPr>
+            <w:tcW w:type="dxa" w:w="3120"/>
+            <w:shd w:fill="1F3864" w:val="clear"/>
+          </w:tcPr>
+          <w:p>
+            <w:pPr>
+              <w:spacing w:after="20" w:before="20"/>
+              <w:jc w:val="left"/>
+            </w:pPr>
+            <w:r>
+              <w:rPr>
+                <w:rFonts w:ascii="Times New Roman" w:cs="Times New Roman" w:eastAsia="Times New Roman" w:hAnsi="Times New Roman"/>
+                <w:b/>
+                <w:bCs/>
+                <w:color w:val="FFFFFF"/>
+                <w:sz w:val="20"/>
+                <w:szCs w:val="20"/>
+              </w:rPr>
+              <w:t xml:space="preserve">Data</w:t>
+            </w:r>
+          </w:p>
+        </w:tc>
+      </w:tr>
+      <w:tr>
+        <w:tc>
+          <w:tcPr>
+            <w:tcW w:type="dxa" w:w="3120"/>
+          </w:tcPr>
+          <w:p>
+            <w:pPr>
+              <w:spacing w:after="20" w:before="20"/>
+              <w:jc w:val="left"/>
+            </w:pPr>
+            <w:r>
+              <w:rPr>
+                <w:rFonts w:ascii="Times New Roman" w:cs="Times New Roman" w:eastAsia="Times New Roman" w:hAnsi="Times New Roman"/>
+                <w:sz w:val="20"/>
+                <w:szCs w:val="20"/>
+              </w:rPr>
+              <w:t xml:space="preserve">Feltrinelli</w:t>
+            </w:r>
+          </w:p>
+        </w:tc>
+        <w:tc>
+          <w:tcPr>
+            <w:tcW w:type="dxa" w:w="3120"/>
+          </w:tcPr>
+          <w:p>
+            <w:pPr>
+              <w:spacing w:after="20" w:before="20"/>
+              <w:jc w:val="left"/>
+            </w:pPr>
+            <w:r>
+              <w:rPr>
+                <w:rFonts w:ascii="Times New Roman" w:cs="Times New Roman" w:eastAsia="Times New Roman" w:hAnsi="Times New Roman"/>
+                <w:b/>
+                <w:bCs/>
+                <w:sz w:val="20"/>
+                <w:szCs w:val="20"/>
+              </w:rPr>
+              <w:t xml:space="preserve">GAP</w:t>
+            </w:r>
+            <w:r>
+              <w:rPr>
+                <w:rFonts w:ascii="Times New Roman" w:cs="Times New Roman" w:eastAsia="Times New Roman" w:hAnsi="Times New Roman"/>
+                <w:sz w:val="20"/>
+                <w:szCs w:val="20"/>
+              </w:rPr>
+              <w:t xml:space="preserve"> — il foco insurrezionale sul modello resistenziale</w:t>
+            </w:r>
+          </w:p>
+        </w:tc>
+        <w:tc>
+          <w:tcPr>
+            <w:tcW w:type="dxa" w:w="3120"/>
+          </w:tcPr>
+          <w:p>
+            <w:pPr>
+              <w:spacing w:after="20" w:before="20"/>
+              <w:jc w:val="left"/>
+            </w:pPr>
+            <w:r>
+              <w:rPr>
+                <w:rFonts w:ascii="Times New Roman" w:cs="Times New Roman" w:eastAsia="Times New Roman" w:hAnsi="Times New Roman"/>
+                <w:sz w:val="20"/>
+                <w:szCs w:val="20"/>
+              </w:rPr>
+              <w:t xml:space="preserve">aprile-maggio 1970</w:t>
+            </w:r>
+          </w:p>
+        </w:tc>
+      </w:tr>
+      <w:tr>
+        <w:tc>
+          <w:tcPr>
+            <w:tcW w:type="dxa" w:w="3120"/>
+          </w:tcPr>
+          <w:p>
+            <w:pPr>
+              <w:spacing w:after="20" w:before="20"/>
+              <w:jc w:val="left"/>
+            </w:pPr>
+            <w:r>
+              <w:rPr>
+                <w:rFonts w:ascii="Times New Roman" w:cs="Times New Roman" w:eastAsia="Times New Roman" w:hAnsi="Times New Roman"/>
+                <w:sz w:val="20"/>
+                <w:szCs w:val="20"/>
+              </w:rPr>
+              <w:t xml:space="preserve">Curcio, Franceschini e altri</w:t>
+            </w:r>
+          </w:p>
+        </w:tc>
+        <w:tc>
+          <w:tcPr>
+            <w:tcW w:type="dxa" w:w="3120"/>
+          </w:tcPr>
+          <w:p>
+            <w:pPr>
+              <w:spacing w:after="20" w:before="20"/>
+              <w:jc w:val="left"/>
+            </w:pPr>
+            <w:r>
+              <w:rPr>
+                <w:rFonts w:ascii="Times New Roman" w:cs="Times New Roman" w:eastAsia="Times New Roman" w:hAnsi="Times New Roman"/>
+                <w:b/>
+                <w:bCs/>
+                <w:sz w:val="20"/>
+                <w:szCs w:val="20"/>
+              </w:rPr>
+              <w:t xml:space="preserve">Brigate Rosse</w:t>
+            </w:r>
+            <w:r>
+              <w:rPr>
+                <w:rFonts w:ascii="Times New Roman" w:cs="Times New Roman" w:eastAsia="Times New Roman" w:hAnsi="Times New Roman"/>
+                <w:sz w:val="20"/>
+                <w:szCs w:val="20"/>
+              </w:rPr>
+              <w:t xml:space="preserve"> — nate al convegno di Pecorile</w:t>
+            </w:r>
+          </w:p>
+        </w:tc>
+        <w:tc>
+          <w:tcPr>
+            <w:tcW w:type="dxa" w:w="3120"/>
+          </w:tcPr>
+          <w:p>
+            <w:pPr>
+              <w:spacing w:after="20" w:before="20"/>
+              <w:jc w:val="left"/>
+            </w:pPr>
+            <w:r>
+              <w:rPr>
+                <w:rFonts w:ascii="Times New Roman" w:cs="Times New Roman" w:eastAsia="Times New Roman" w:hAnsi="Times New Roman"/>
+                <w:sz w:val="20"/>
+                <w:szCs w:val="20"/>
+              </w:rPr>
+              <w:t xml:space="preserve">agosto 1970</w:t>
+            </w:r>
+          </w:p>
+        </w:tc>
+      </w:tr>
+      <w:tr>
+        <w:tc>
+          <w:tcPr>
+            <w:tcW w:type="dxa" w:w="3120"/>
+          </w:tcPr>
+          <w:p>
+            <w:pPr>
+              <w:spacing w:after="20" w:before="20"/>
+              <w:jc w:val="left"/>
+            </w:pPr>
+            <w:r>
+              <w:rPr>
+                <w:rFonts w:ascii="Times New Roman" w:cs="Times New Roman" w:eastAsia="Times New Roman" w:hAnsi="Times New Roman"/>
+                <w:sz w:val="20"/>
+                <w:szCs w:val="20"/>
+              </w:rPr>
+              <w:t xml:space="preserve">Simioni, Berio, Mulinaris</w:t>
+            </w:r>
+          </w:p>
+        </w:tc>
+        <w:tc>
+          <w:tcPr>
+            <w:tcW w:type="dxa" w:w="3120"/>
+          </w:tcPr>
+          <w:p>
+            <w:pPr>
+              <w:spacing w:after="20" w:before="20"/>
+              <w:jc w:val="left"/>
+            </w:pPr>
+            <w:r>
+              <w:rPr>
+                <w:rFonts w:ascii="Times New Roman" w:cs="Times New Roman" w:eastAsia="Times New Roman" w:hAnsi="Times New Roman"/>
+                <w:b/>
+                <w:bCs/>
+                <w:sz w:val="20"/>
+                <w:szCs w:val="20"/>
+              </w:rPr>
+              <w:t xml:space="preserve">«Superclan»</w:t>
+            </w:r>
+            <w:r>
+              <w:rPr>
+                <w:rFonts w:ascii="Times New Roman" w:cs="Times New Roman" w:eastAsia="Times New Roman" w:hAnsi="Times New Roman"/>
+                <w:sz w:val="20"/>
+                <w:szCs w:val="20"/>
+              </w:rPr>
+              <w:t xml:space="preserve"> — la struttura riservata, poi la strada di Parigi fino a Hyperion (1976)</w:t>
+            </w:r>
+          </w:p>
+        </w:tc>
+        <w:tc>
+          <w:tcPr>
+            <w:tcW w:type="dxa" w:w="3120"/>
+          </w:tcPr>
+          <w:p>
+            <w:pPr>
+              <w:spacing w:after="20" w:before="20"/>
+              <w:jc w:val="left"/>
+            </w:pPr>
+            <w:r>
+              <w:rPr>
+                <w:rFonts w:ascii="Times New Roman" w:cs="Times New Roman" w:eastAsia="Times New Roman" w:hAnsi="Times New Roman"/>
+                <w:sz w:val="20"/>
+                <w:szCs w:val="20"/>
+              </w:rPr>
+              <w:t xml:space="preserve">1970 → 1976</w:t>
+            </w:r>
+          </w:p>
+        </w:tc>
+      </w:tr>
+    </w:tbl>
+    <w:p>
+      <w:pPr>
+        <w:spacing w:after="80"/>
+      </w:pPr>
+    </w:p>
+    <w:p>
+      <w:pPr>
+        <w:spacing w:after="120" w:line="276"/>
+        <w:jc w:val="both"/>
+      </w:pPr>
+      <w:r>
+        <w:rPr>
+          <w:rFonts w:ascii="Times New Roman" w:cs="Times New Roman" w:eastAsia="Times New Roman" w:hAnsi="Times New Roman"/>
+          <w:sz w:val="24"/>
+          <w:szCs w:val="24"/>
+        </w:rPr>
+        <w:t xml:space="preserve">La triforcazione è il dato strutturale dell'incrocio: </w:t>
+      </w:r>
+      <w:r>
+        <w:rPr>
+          <w:rFonts w:ascii="Times New Roman" w:cs="Times New Roman" w:eastAsia="Times New Roman" w:hAnsi="Times New Roman"/>
+          <w:b/>
+          <w:bCs/>
+          <w:sz w:val="24"/>
+          <w:szCs w:val="24"/>
+        </w:rPr>
+        <w:t xml:space="preserve">non una piramide con un vertice, ma un cespo con tre rami</w:t>
+      </w:r>
+      <w:r>
+        <w:rPr>
+          <w:rFonts w:ascii="Times New Roman" w:cs="Times New Roman" w:eastAsia="Times New Roman" w:hAnsi="Times New Roman"/>
+          <w:sz w:val="24"/>
+          <w:szCs w:val="24"/>
+        </w:rPr>
+        <w:t xml:space="preserve"> — che la pubblicistica ha ripetutamente provato a ricomporre in un'unica regia, senza che alcun accertamento l'abbia mai consentito.</w:t>
+      </w:r>
+    </w:p>
+    <w:p>
+      <w:pPr>
+        <w:pStyle w:val="Heading2"/>
+        <w:spacing w:after="100" w:before="200"/>
+      </w:pPr>
+      <w:r>
+        <w:rPr>
+          <w:rFonts w:ascii="Times New Roman" w:cs="Times New Roman" w:eastAsia="Times New Roman" w:hAnsi="Times New Roman"/>
+          <w:sz w:val="24"/>
+          <w:szCs w:val="24"/>
+        </w:rPr>
+        <w:t xml:space="preserve">2. I ponti documentati (FH-3…FH-7)</w:t>
+      </w:r>
+    </w:p>
+    <w:p>
+      <w:pPr>
+        <w:spacing w:after="120" w:line="276"/>
+        <w:jc w:val="both"/>
+      </w:pPr>
+      <w:r>
+        <w:rPr>
+          <w:rFonts w:ascii="Times New Roman" w:cs="Times New Roman" w:eastAsia="Times New Roman" w:hAnsi="Times New Roman"/>
+          <w:b/>
+          <w:bCs/>
+          <w:sz w:val="24"/>
+          <w:szCs w:val="24"/>
+        </w:rPr>
+        <w:t xml:space="preserve">FH-3 · Feltrinelli e le BR: rapporti reali, comando unificato mai ottenuto.</w:t>
+      </w:r>
+      <w:r>
+        <w:rPr>
+          <w:rFonts w:ascii="Times New Roman" w:cs="Times New Roman" w:eastAsia="Times New Roman" w:hAnsi="Times New Roman"/>
+          <w:sz w:val="24"/>
+          <w:szCs w:val="24"/>
+        </w:rPr>
+        <w:t xml:space="preserve"> Dopo le prime azioni brigatiste (l'incendio alla Pirelli di Lainate, 25 gennaio 1971), Feltrinelli </w:t>
+      </w:r>
+      <w:r>
+        <w:rPr>
+          <w:rFonts w:ascii="Times New Roman" w:cs="Times New Roman" w:eastAsia="Times New Roman" w:hAnsi="Times New Roman"/>
+          <w:b/>
+          <w:bCs/>
+          <w:sz w:val="24"/>
+          <w:szCs w:val="24"/>
+        </w:rPr>
+        <w:t xml:space="preserve">stabilì rapporti con Curcio e Franceschini</w:t>
+      </w:r>
+      <w:r>
+        <w:rPr>
+          <w:rFonts w:ascii="Times New Roman" w:cs="Times New Roman" w:eastAsia="Times New Roman" w:hAnsi="Times New Roman"/>
+          <w:sz w:val="24"/>
+          <w:szCs w:val="24"/>
+        </w:rPr>
+        <w:t xml:space="preserve">: incontri sempre più frequenti dalla fine del 1970, fissati ai giardini di </w:t>
+      </w:r>
+      <w:r>
+        <w:rPr>
+          <w:rFonts w:ascii="Times New Roman" w:cs="Times New Roman" w:eastAsia="Times New Roman" w:hAnsi="Times New Roman"/>
+          <w:b/>
+          <w:bCs/>
+          <w:sz w:val="24"/>
+          <w:szCs w:val="24"/>
+        </w:rPr>
+        <w:t xml:space="preserve">piazza Castello</w:t>
+      </w:r>
+      <w:r>
+        <w:rPr>
+          <w:rFonts w:ascii="Times New Roman" w:cs="Times New Roman" w:eastAsia="Times New Roman" w:hAnsi="Times New Roman"/>
+          <w:sz w:val="24"/>
+          <w:szCs w:val="24"/>
+        </w:rPr>
+        <w:t xml:space="preserve"> e proseguiti negli appartamenti coperti dell'editore. Feltrinelli puntava al </w:t>
+      </w:r>
+      <w:r>
+        <w:rPr>
+          <w:rFonts w:ascii="Times New Roman" w:cs="Times New Roman" w:eastAsia="Times New Roman" w:hAnsi="Times New Roman"/>
+          <w:b/>
+          <w:bCs/>
+          <w:sz w:val="24"/>
+          <w:szCs w:val="24"/>
+        </w:rPr>
+        <w:t xml:space="preserve">comando unificato</w:t>
+      </w:r>
+      <w:r>
+        <w:rPr>
+          <w:rFonts w:ascii="Times New Roman" w:cs="Times New Roman" w:eastAsia="Times New Roman" w:hAnsi="Times New Roman"/>
+          <w:sz w:val="24"/>
+          <w:szCs w:val="24"/>
+        </w:rPr>
+        <w:t xml:space="preserve"> della lotta armata e </w:t>
+      </w:r>
+      <w:r>
+        <w:rPr>
+          <w:rFonts w:ascii="Times New Roman" w:cs="Times New Roman" w:eastAsia="Times New Roman" w:hAnsi="Times New Roman"/>
+          <w:b/>
+          <w:bCs/>
+          <w:sz w:val="24"/>
+          <w:szCs w:val="24"/>
+        </w:rPr>
+        <w:t xml:space="preserve">non lo ottenne</w:t>
+      </w:r>
+      <w:r>
+        <w:rPr>
+          <w:rFonts w:ascii="Times New Roman" w:cs="Times New Roman" w:eastAsia="Times New Roman" w:hAnsi="Times New Roman"/>
+          <w:sz w:val="24"/>
+          <w:szCs w:val="24"/>
+        </w:rPr>
+        <w:t xml:space="preserve">; della collaborazione resta traccia documentale nel foglio </w:t>
+      </w:r>
+      <w:r>
+        <w:rPr>
+          <w:rFonts w:ascii="Times New Roman" w:cs="Times New Roman" w:eastAsia="Times New Roman" w:hAnsi="Times New Roman"/>
+          <w:b/>
+          <w:bCs/>
+          <w:sz w:val="24"/>
+          <w:szCs w:val="24"/>
+        </w:rPr>
+        <w:t xml:space="preserve">«Nuova Resistenza»</w:t>
+      </w:r>
+      <w:r>
+        <w:rPr>
+          <w:rFonts w:ascii="Times New Roman" w:cs="Times New Roman" w:eastAsia="Times New Roman" w:hAnsi="Times New Roman"/>
+          <w:sz w:val="24"/>
+          <w:szCs w:val="24"/>
+        </w:rPr>
+        <w:t xml:space="preserve"> (aprile 1971, due numeri), continuazione ideale di «Voce Comunista» (Treccani, Dizionario Biografico (https://www.treccani.it/enciclopedia/giangiacomo-feltrinelli_(Dizionario-Biografico)/); Tassinari (https://www.ugomariatassinari.it/feltrinelli-curcio/)). Il ponte GAP-BR fu dunque </w:t>
+      </w:r>
+      <w:r>
+        <w:rPr>
+          <w:rFonts w:ascii="Times New Roman" w:cs="Times New Roman" w:eastAsia="Times New Roman" w:hAnsi="Times New Roman"/>
+          <w:b/>
+          <w:bCs/>
+          <w:sz w:val="24"/>
+          <w:szCs w:val="24"/>
+        </w:rPr>
+        <w:t xml:space="preserve">reale, personale e fallito nel suo obiettivo massimo</w:t>
+      </w:r>
+      <w:r>
+        <w:rPr>
+          <w:rFonts w:ascii="Times New Roman" w:cs="Times New Roman" w:eastAsia="Times New Roman" w:hAnsi="Times New Roman"/>
+          <w:sz w:val="24"/>
+          <w:szCs w:val="24"/>
+        </w:rPr>
+        <w:t xml:space="preserve"> — un negoziato fra sovrani, non una catena di comando.</w:t>
+      </w:r>
+    </w:p>
+    <w:p>
+      <w:pPr>
+        <w:spacing w:after="120" w:line="276"/>
+        <w:jc w:val="both"/>
+      </w:pPr>
+      <w:r>
+        <w:rPr>
+          <w:rFonts w:ascii="Times New Roman" w:cs="Times New Roman" w:eastAsia="Times New Roman" w:hAnsi="Times New Roman"/>
+          <w:b/>
+          <w:bCs/>
+          <w:sz w:val="24"/>
+          <w:szCs w:val="24"/>
+        </w:rPr>
+        <w:t xml:space="preserve">FH-4 · Franceschini dentro la struttura di Simioni (memorialistica incrociata).</w:t>
+      </w:r>
+      <w:r>
+        <w:rPr>
+          <w:rFonts w:ascii="Times New Roman" w:cs="Times New Roman" w:eastAsia="Times New Roman" w:hAnsi="Times New Roman"/>
+          <w:sz w:val="24"/>
+          <w:szCs w:val="24"/>
+        </w:rPr>
+        <w:t xml:space="preserve"> La pubblicistica critica sull'area ricostruisce che </w:t>
+      </w:r>
+      <w:r>
+        <w:rPr>
+          <w:rFonts w:ascii="Times New Roman" w:cs="Times New Roman" w:eastAsia="Times New Roman" w:hAnsi="Times New Roman"/>
+          <w:b/>
+          <w:bCs/>
+          <w:sz w:val="24"/>
+          <w:szCs w:val="24"/>
+        </w:rPr>
+        <w:t xml:space="preserve">Franceschini visse nella «Comune» di Simioni e fece parte della sua struttura riservata</w:t>
+      </w:r>
+      <w:r>
+        <w:rPr>
+          <w:rFonts w:ascii="Times New Roman" w:cs="Times New Roman" w:eastAsia="Times New Roman" w:hAnsi="Times New Roman"/>
+          <w:sz w:val="24"/>
+          <w:szCs w:val="24"/>
+        </w:rPr>
+        <w:t xml:space="preserve"> (dette «le zie rosse») prima della stagione BR (Insorgenze/Contropiano (https://insorgenze.net/2026/05/05/dalla-dottrina-mitterrand-alla-perfida-albione-le-mirabili-acrobazie-complottiste-del-giullare-fasanella/)). È il ponte biografico più stretto fra il nucleo fondativo delle BR e i futuri fondatori di Hyperion — e va pesato per quello che è: ricostruzione memorialistica di parte, usata nelle polemiche fra ex militanti in entrambe le direzioni, qui registrata con la sua fonte e senza promozione.</w:t>
+      </w:r>
+    </w:p>
+    <w:p>
+      <w:pPr>
+        <w:spacing w:after="120" w:line="276"/>
+        <w:jc w:val="both"/>
+      </w:pPr>
+      <w:r>
+        <w:rPr>
+          <w:rFonts w:ascii="Times New Roman" w:cs="Times New Roman" w:eastAsia="Times New Roman" w:hAnsi="Times New Roman"/>
+          <w:b/>
+          <w:bCs/>
+          <w:sz w:val="24"/>
+          <w:szCs w:val="24"/>
+        </w:rPr>
+        <w:t xml:space="preserve">FH-5 · Il filo Moretti (documentato, già vagliato).</w:t>
+      </w:r>
+      <w:r>
+        <w:rPr>
+          <w:rFonts w:ascii="Times New Roman" w:cs="Times New Roman" w:eastAsia="Times New Roman" w:hAnsi="Times New Roman"/>
+          <w:sz w:val="24"/>
+          <w:szCs w:val="24"/>
+        </w:rPr>
+        <w:t xml:space="preserve"> Mario Moretti transitò per il Superclan (nodo HY-2) e approdò alle BR fino alla direzione del sequestro Moro. È il secondo ponte biografico fra i due mondi; l'anti-triangolazione ATH-3 resta integra: </w:t>
+      </w:r>
+      <w:r>
+        <w:rPr>
+          <w:rFonts w:ascii="Times New Roman" w:cs="Times New Roman" w:eastAsia="Times New Roman" w:hAnsi="Times New Roman"/>
+          <w:b/>
+          <w:bCs/>
+          <w:sz w:val="24"/>
+          <w:szCs w:val="24"/>
+        </w:rPr>
+        <w:t xml:space="preserve">un filo biografico non è una catena di comando</w:t>
+      </w:r>
+      <w:r>
+        <w:rPr>
+          <w:rFonts w:ascii="Times New Roman" w:cs="Times New Roman" w:eastAsia="Times New Roman" w:hAnsi="Times New Roman"/>
+          <w:sz w:val="24"/>
+          <w:szCs w:val="24"/>
+        </w:rPr>
+        <w:t xml:space="preserve">, e i processi non hanno accertato alcuna eterodirezione.</w:t>
+      </w:r>
+    </w:p>
+    <w:p>
+      <w:pPr>
+        <w:spacing w:after="120" w:line="276"/>
+        <w:jc w:val="both"/>
+      </w:pPr>
+      <w:r>
+        <w:rPr>
+          <w:rFonts w:ascii="Times New Roman" w:cs="Times New Roman" w:eastAsia="Times New Roman" w:hAnsi="Times New Roman"/>
+          <w:b/>
+          <w:bCs/>
+          <w:sz w:val="24"/>
+          <w:szCs w:val="24"/>
+        </w:rPr>
+        <w:t xml:space="preserve">FH-6 · La giustizia trattò i due rami insieme (documentato).</w:t>
+      </w:r>
+      <w:r>
+        <w:rPr>
+          <w:rFonts w:ascii="Times New Roman" w:cs="Times New Roman" w:eastAsia="Times New Roman" w:hAnsi="Times New Roman"/>
+          <w:sz w:val="24"/>
+          <w:szCs w:val="24"/>
+        </w:rPr>
+        <w:t xml:space="preserve"> La magistratura celebrò un </w:t>
+      </w:r>
+      <w:r>
+        <w:rPr>
+          <w:rFonts w:ascii="Times New Roman" w:cs="Times New Roman" w:eastAsia="Times New Roman" w:hAnsi="Times New Roman"/>
+          <w:b/>
+          <w:bCs/>
+          <w:sz w:val="24"/>
+          <w:szCs w:val="24"/>
+        </w:rPr>
+        <w:t xml:space="preserve">processo congiunto «alle Brigate Rosse e ai GAP di Feltrinelli»</w:t>
+      </w:r>
+      <w:r>
+        <w:rPr>
+          <w:rFonts w:ascii="Times New Roman" w:cs="Times New Roman" w:eastAsia="Times New Roman" w:hAnsi="Times New Roman"/>
+          <w:sz w:val="24"/>
+          <w:szCs w:val="24"/>
+        </w:rPr>
+        <w:t xml:space="preserve"> (Torino, metà anni Settanta; il fascicolo è oggi valorizzato dal portale della memoria del Ministero della Cultura: memoria.cultura.gov.it (https://memoria.cultura.gov.it/w/processo-alle-brigate-rosse-e-ai-gap-di-feltrinelli)). Il dato è prezioso per l'incrocio: </w:t>
+      </w:r>
+      <w:r>
+        <w:rPr>
+          <w:rFonts w:ascii="Times New Roman" w:cs="Times New Roman" w:eastAsia="Times New Roman" w:hAnsi="Times New Roman"/>
+          <w:b/>
+          <w:bCs/>
+          <w:sz w:val="24"/>
+          <w:szCs w:val="24"/>
+        </w:rPr>
+        <w:t xml:space="preserve">l'unico luogo in cui GAP e BR furono davvero «unificati» fu l'aula giudiziaria</w:t>
+      </w:r>
+      <w:r>
+        <w:rPr>
+          <w:rFonts w:ascii="Times New Roman" w:cs="Times New Roman" w:eastAsia="Times New Roman" w:hAnsi="Times New Roman"/>
+          <w:sz w:val="24"/>
+          <w:szCs w:val="24"/>
+        </w:rPr>
+        <w:t xml:space="preserve"> — a conferma che i rapporti c'erano stati, e che di rapporti (non di fusione) si trattò.</w:t>
+      </w:r>
+    </w:p>
+    <w:p>
+      <w:pPr>
+        <w:spacing w:after="120" w:line="276"/>
+        <w:jc w:val="both"/>
+      </w:pPr>
+      <w:r>
+        <w:rPr>
+          <w:rFonts w:ascii="Times New Roman" w:cs="Times New Roman" w:eastAsia="Times New Roman" w:hAnsi="Times New Roman"/>
+          <w:b/>
+          <w:bCs/>
+          <w:sz w:val="24"/>
+          <w:szCs w:val="24"/>
+        </w:rPr>
+        <w:t xml:space="preserve">FH-7 · Il dopo-Segrate (documentato nella cornice, storiografico nel dettaglio).</w:t>
+      </w:r>
+      <w:r>
+        <w:rPr>
+          <w:rFonts w:ascii="Times New Roman" w:cs="Times New Roman" w:eastAsia="Times New Roman" w:hAnsi="Times New Roman"/>
+          <w:sz w:val="24"/>
+          <w:szCs w:val="24"/>
+        </w:rPr>
+        <w:t xml:space="preserve"> Con la morte di Feltrinelli i </w:t>
+      </w:r>
+      <w:r>
+        <w:rPr>
+          <w:rFonts w:ascii="Times New Roman" w:cs="Times New Roman" w:eastAsia="Times New Roman" w:hAnsi="Times New Roman"/>
+          <w:b/>
+          <w:bCs/>
+          <w:sz w:val="24"/>
+          <w:szCs w:val="24"/>
+        </w:rPr>
+        <w:t xml:space="preserve">GAP si dissolsero</w:t>
+      </w:r>
+      <w:r>
+        <w:rPr>
+          <w:rFonts w:ascii="Times New Roman" w:cs="Times New Roman" w:eastAsia="Times New Roman" w:hAnsi="Times New Roman"/>
+          <w:sz w:val="24"/>
+          <w:szCs w:val="24"/>
+        </w:rPr>
+        <w:t xml:space="preserve">; la sorte della rete — in parte dispersa, in parte riassorbita da altre formazioni — è oggetto della storiografia recente (D. Serafino, </w:t>
+      </w:r>
+      <w:r>
+        <w:rPr>
+          <w:rFonts w:ascii="Times New Roman" w:cs="Times New Roman" w:eastAsia="Times New Roman" w:hAnsi="Times New Roman"/>
+          <w:i/>
+          <w:iCs/>
+          <w:sz w:val="24"/>
+          <w:szCs w:val="24"/>
+        </w:rPr>
+        <w:t xml:space="preserve">Gappisti. La rete clandestina di Giangiacomo Feltrinelli</w:t>
+      </w:r>
+      <w:r>
+        <w:rPr>
+          <w:rFonts w:ascii="Times New Roman" w:cs="Times New Roman" w:eastAsia="Times New Roman" w:hAnsi="Times New Roman"/>
+          <w:sz w:val="24"/>
+          <w:szCs w:val="24"/>
+        </w:rPr>
+        <w:t xml:space="preserve">, DeriveApprodi: scheda (https://deriveapprodi.com/libro/gappisti/)). Le BR sopravvissero al 1972 e rimasero, delle tre strade del nodo FH-2, l'unica ancora percorsa: il campo clandestino si semplificò per sottrazione, non per successione ordinata.</w:t>
+      </w:r>
+    </w:p>
+    <w:p>
+      <w:pPr>
+        <w:pStyle w:val="Heading2"/>
+        <w:spacing w:after="100" w:before="200"/>
+      </w:pPr>
+      <w:r>
+        <w:rPr>
+          <w:rFonts w:ascii="Times New Roman" w:cs="Times New Roman" w:eastAsia="Times New Roman" w:hAnsi="Times New Roman"/>
+          <w:sz w:val="24"/>
+          <w:szCs w:val="24"/>
+        </w:rPr>
+        <w:t xml:space="preserve">3. La congettura smentita: Segrate e il Superclan (FH-8)</w:t>
+      </w:r>
+    </w:p>
+    <w:p>
+      <w:pPr>
+        <w:spacing w:after="120" w:line="276"/>
+        <w:jc w:val="both"/>
+      </w:pPr>
+      <w:r>
+        <w:rPr>
+          <w:rFonts w:ascii="Times New Roman" w:cs="Times New Roman" w:eastAsia="Times New Roman" w:hAnsi="Times New Roman"/>
+          <w:sz w:val="24"/>
+          <w:szCs w:val="24"/>
+        </w:rPr>
+        <w:t xml:space="preserve">Resta il punto dove i due fronti si toccano nella pubblicistica più che nelle fonti: </w:t>
+      </w:r>
+      <w:r>
+        <w:rPr>
+          <w:rFonts w:ascii="Times New Roman" w:cs="Times New Roman" w:eastAsia="Times New Roman" w:hAnsi="Times New Roman"/>
+          <w:b/>
+          <w:bCs/>
+          <w:sz w:val="24"/>
+          <w:szCs w:val="24"/>
+        </w:rPr>
+        <w:t xml:space="preserve">i sospetti sulla morte di Feltrinelli</w:t>
+      </w:r>
+      <w:r>
+        <w:rPr>
+          <w:rFonts w:ascii="Times New Roman" w:cs="Times New Roman" w:eastAsia="Times New Roman" w:hAnsi="Times New Roman"/>
+          <w:sz w:val="24"/>
+          <w:szCs w:val="24"/>
+        </w:rPr>
+        <w:t xml:space="preserve">. La memorialistica di Franceschini ha alimentato per decenni la tesi di una mano esterna a Segrate — i dubbi sul ruolo del militante detto «Gunter», e soprattutto l'affermazione che i </w:t>
+      </w:r>
+      <w:r>
+        <w:rPr>
+          <w:rFonts w:ascii="Times New Roman" w:cs="Times New Roman" w:eastAsia="Times New Roman" w:hAnsi="Times New Roman"/>
+          <w:b/>
+          <w:bCs/>
+          <w:sz w:val="24"/>
+          <w:szCs w:val="24"/>
+        </w:rPr>
+        <w:t xml:space="preserve">timer</w:t>
+      </w:r>
+      <w:r>
+        <w:rPr>
+          <w:rFonts w:ascii="Times New Roman" w:cs="Times New Roman" w:eastAsia="Times New Roman" w:hAnsi="Times New Roman"/>
+          <w:sz w:val="24"/>
+          <w:szCs w:val="24"/>
+        </w:rPr>
+        <w:t xml:space="preserve"> dell'ordigno fossero stati «manipolati». La verifica d'incrocio registra due fatti:</w:t>
+      </w:r>
+    </w:p>
+    <w:p>
+      <w:pPr>
+        <w:spacing w:after="40"/>
+        <w:ind w:left="360"/>
+        <w:jc w:val="both"/>
+      </w:pPr>
+      <w:r>
+        <w:rPr>
+          <w:rFonts w:ascii="Times New Roman" w:cs="Times New Roman" w:eastAsia="Times New Roman" w:hAnsi="Times New Roman"/>
+          <w:sz w:val="24"/>
+          <w:szCs w:val="24"/>
+        </w:rPr>
+        <w:t xml:space="preserve">1. la ricostruzione giudiziaria (processo del 1979, riscontrata sui nastri di Robbiano di Mediglia — nodi F-16/F-17 della triangolazione Feltrinelli) resta quella dell'</w:t>
+      </w:r>
+      <w:r>
+        <w:rPr>
+          <w:rFonts w:ascii="Times New Roman" w:cs="Times New Roman" w:eastAsia="Times New Roman" w:hAnsi="Times New Roman"/>
+          <w:b/>
+          <w:bCs/>
+          <w:sz w:val="24"/>
+          <w:szCs w:val="24"/>
+        </w:rPr>
+        <w:t xml:space="preserve">incidente durante il sabotaggio</w:t>
+      </w:r>
+      <w:r>
+        <w:rPr>
+          <w:rFonts w:ascii="Times New Roman" w:cs="Times New Roman" w:eastAsia="Times New Roman" w:hAnsi="Times New Roman"/>
+          <w:sz w:val="24"/>
+          <w:szCs w:val="24"/>
+        </w:rPr>
+        <w:t xml:space="preserve">;</w:t>
+      </w:r>
+    </w:p>
+    <w:p>
+      <w:pPr>
+        <w:spacing w:after="40"/>
+        <w:ind w:left="360"/>
+        <w:jc w:val="both"/>
+      </w:pPr>
+      <w:r>
+        <w:rPr>
+          <w:rFonts w:ascii="Times New Roman" w:cs="Times New Roman" w:eastAsia="Times New Roman" w:hAnsi="Times New Roman"/>
+          <w:sz w:val="24"/>
+          <w:szCs w:val="24"/>
+        </w:rPr>
+        <w:t xml:space="preserve">2. la specifica affermazione sui timer manipolati risulta </w:t>
+      </w:r>
+      <w:r>
+        <w:rPr>
+          <w:rFonts w:ascii="Times New Roman" w:cs="Times New Roman" w:eastAsia="Times New Roman" w:hAnsi="Times New Roman"/>
+          <w:b/>
+          <w:bCs/>
+          <w:sz w:val="24"/>
+          <w:szCs w:val="24"/>
+        </w:rPr>
+        <w:t xml:space="preserve">smentita da Vittorio Battistoni, il tecnico dei GAP che fornì l'esplosivo all'editore</w:t>
+      </w:r>
+      <w:r>
+        <w:rPr>
+          <w:rFonts w:ascii="Times New Roman" w:cs="Times New Roman" w:eastAsia="Times New Roman" w:hAnsi="Times New Roman"/>
+          <w:sz w:val="24"/>
+          <w:szCs w:val="24"/>
+        </w:rPr>
+        <w:t xml:space="preserve"> (Insorgenze/Contropiano (https://contropiano.org/news/cultura-news/2026/05/09/dalla-dottrina-mitterrand-alla-perfida-albione-le-acrobazie-complottiste-di-fasanella-0194867)).</w:t>
+      </w:r>
+    </w:p>
+    <w:p>
+      <w:pPr>
+        <w:spacing w:after="120" w:line="276"/>
+        <w:jc w:val="both"/>
+      </w:pPr>
+      <w:r>
+        <w:rPr>
+          <w:rFonts w:ascii="Times New Roman" w:cs="Times New Roman" w:eastAsia="Times New Roman" w:hAnsi="Times New Roman"/>
+          <w:sz w:val="24"/>
+          <w:szCs w:val="24"/>
+        </w:rPr>
+        <w:t xml:space="preserve">La versione che collega — per allusione — l'ambiente del Superclan alla morte di Segrate appartiene dunque alla categoria più bassa del corpus: </w:t>
+      </w:r>
+      <w:r>
+        <w:rPr>
+          <w:rFonts w:ascii="Times New Roman" w:cs="Times New Roman" w:eastAsia="Times New Roman" w:hAnsi="Times New Roman"/>
+          <w:b/>
+          <w:bCs/>
+          <w:sz w:val="24"/>
+          <w:szCs w:val="24"/>
+        </w:rPr>
+        <w:t xml:space="preserve">congettura memorialistica, priva di riscontro e contraddetta su un punto qualificante da testimonianza diretta</w:t>
+      </w:r>
+      <w:r>
+        <w:rPr>
+          <w:rFonts w:ascii="Times New Roman" w:cs="Times New Roman" w:eastAsia="Times New Roman" w:hAnsi="Times New Roman"/>
+          <w:sz w:val="24"/>
+          <w:szCs w:val="24"/>
+        </w:rPr>
+        <w:t xml:space="preserve">. La si registra per completezza e la si lascia lì. Nessun nome; e per i fondatori di Hyperion vale, anche qui, la presunzione d'innocenza piena.</w:t>
+      </w:r>
+    </w:p>
+    <w:p>
+      <w:pPr>
+        <w:pStyle w:val="Heading2"/>
+        <w:spacing w:after="100" w:before="200"/>
+      </w:pPr>
+      <w:r>
+        <w:rPr>
+          <w:rFonts w:ascii="Times New Roman" w:cs="Times New Roman" w:eastAsia="Times New Roman" w:hAnsi="Times New Roman"/>
+          <w:sz w:val="24"/>
+          <w:szCs w:val="24"/>
+        </w:rPr>
+        <w:t xml:space="preserve">4. Anti-triangolazioni d'incrocio (ATI-1…ATI-3)</w:t>
+      </w:r>
+    </w:p>
+    <w:tbl>
+      <w:tblPr>
+        <w:tblW w:type="dxa" w:w="9360"/>
+        <w:tblBorders>
+          <w:top w:val="single" w:color="auto" w:sz="4"/>
+          <w:left w:val="single" w:color="auto" w:sz="4"/>
+          <w:bottom w:val="single" w:color="auto" w:sz="4"/>
+          <w:right w:val="single" w:color="auto" w:sz="4"/>
+          <w:insideH w:val="single" w:color="auto" w:sz="4"/>
+          <w:insideV w:val="single" w:color="auto" w:sz="4"/>
+        </w:tblBorders>
+      </w:tblPr>
+      <w:tblGrid>
+        <w:gridCol w:w="4680"/>
+        <w:gridCol w:w="4680"/>
+      </w:tblGrid>
+      <w:tr>
+        <w:tc>
+          <w:tcPr>
+            <w:tcW w:type="dxa" w:w="4680"/>
+            <w:shd w:fill="1F3864" w:val="clear"/>
+          </w:tcPr>
+          <w:p>
+            <w:pPr>
+              <w:spacing w:after="20" w:before="20"/>
+              <w:jc w:val="left"/>
+            </w:pPr>
+            <w:r>
+              <w:rPr>
+                <w:rFonts w:ascii="Times New Roman" w:cs="Times New Roman" w:eastAsia="Times New Roman" w:hAnsi="Times New Roman"/>
+                <w:b/>
+                <w:bCs/>
+                <w:color w:val="FFFFFF"/>
+                <w:sz w:val="20"/>
+                <w:szCs w:val="20"/>
+              </w:rPr>
+              <w:t xml:space="preserve">#</w:t>
+            </w:r>
+          </w:p>
+        </w:tc>
+        <w:tc>
+          <w:tcPr>
+            <w:tcW w:type="dxa" w:w="4680"/>
+            <w:shd w:fill="1F3864" w:val="clear"/>
+          </w:tcPr>
+          <w:p>
+            <w:pPr>
+              <w:spacing w:after="20" w:before="20"/>
+              <w:jc w:val="left"/>
+            </w:pPr>
+            <w:r>
+              <w:rPr>
+                <w:rFonts w:ascii="Times New Roman" w:cs="Times New Roman" w:eastAsia="Times New Roman" w:hAnsi="Times New Roman"/>
+                <w:b/>
+                <w:bCs/>
+                <w:color w:val="FFFFFF"/>
+                <w:sz w:val="20"/>
+                <w:szCs w:val="20"/>
+              </w:rPr>
+              <w:t xml:space="preserve">Anti-triangolazione</w:t>
+            </w:r>
+          </w:p>
+        </w:tc>
+      </w:tr>
+      <w:tr>
+        <w:tc>
+          <w:tcPr>
+            <w:tcW w:type="dxa" w:w="4680"/>
+          </w:tcPr>
+          <w:p>
+            <w:pPr>
+              <w:spacing w:after="20" w:before="20"/>
+              <w:jc w:val="left"/>
+            </w:pPr>
+            <w:r>
+              <w:rPr>
+                <w:rFonts w:ascii="Times New Roman" w:cs="Times New Roman" w:eastAsia="Times New Roman" w:hAnsi="Times New Roman"/>
+                <w:sz w:val="20"/>
+                <w:szCs w:val="20"/>
+              </w:rPr>
+              <w:t xml:space="preserve">ATI-1</w:t>
+            </w:r>
+          </w:p>
+        </w:tc>
+        <w:tc>
+          <w:tcPr>
+            <w:tcW w:type="dxa" w:w="4680"/>
+          </w:tcPr>
+          <w:p>
+            <w:pPr>
+              <w:spacing w:after="20" w:before="20"/>
+              <w:jc w:val="left"/>
+            </w:pPr>
+            <w:r>
+              <w:rPr>
+                <w:rFonts w:ascii="Times New Roman" w:cs="Times New Roman" w:eastAsia="Times New Roman" w:hAnsi="Times New Roman"/>
+                <w:b/>
+                <w:bCs/>
+                <w:sz w:val="20"/>
+                <w:szCs w:val="20"/>
+              </w:rPr>
+              <w:t xml:space="preserve">Feltrinelli e Hyperion non si incontrarono mai.</w:t>
+            </w:r>
+            <w:r>
+              <w:rPr>
+                <w:rFonts w:ascii="Times New Roman" w:cs="Times New Roman" w:eastAsia="Times New Roman" w:hAnsi="Times New Roman"/>
+                <w:sz w:val="20"/>
+                <w:szCs w:val="20"/>
+              </w:rPr>
+              <w:t xml:space="preserve"> La scuola nacque nel 1976; Feltrinelli morì nel 1972. Ogni schema che li metta nello stesso organigramma proietta all'indietro un'entità che non esisteva. L'incrocio è di </w:t>
+            </w:r>
+            <w:r>
+              <w:rPr>
+                <w:rFonts w:ascii="Times New Roman" w:cs="Times New Roman" w:eastAsia="Times New Roman" w:hAnsi="Times New Roman"/>
+                <w:b/>
+                <w:bCs/>
+                <w:sz w:val="20"/>
+                <w:szCs w:val="20"/>
+              </w:rPr>
+              <w:t xml:space="preserve">matrice e di uomini</w:t>
+            </w:r>
+            <w:r>
+              <w:rPr>
+                <w:rFonts w:ascii="Times New Roman" w:cs="Times New Roman" w:eastAsia="Times New Roman" w:hAnsi="Times New Roman"/>
+                <w:sz w:val="20"/>
+                <w:szCs w:val="20"/>
+              </w:rPr>
+              <w:t xml:space="preserve">, mai di organizzazioni</w:t>
+            </w:r>
+          </w:p>
+        </w:tc>
+      </w:tr>
+      <w:tr>
+        <w:tc>
+          <w:tcPr>
+            <w:tcW w:type="dxa" w:w="4680"/>
+          </w:tcPr>
+          <w:p>
+            <w:pPr>
+              <w:spacing w:after="20" w:before="20"/>
+              <w:jc w:val="left"/>
+            </w:pPr>
+            <w:r>
+              <w:rPr>
+                <w:rFonts w:ascii="Times New Roman" w:cs="Times New Roman" w:eastAsia="Times New Roman" w:hAnsi="Times New Roman"/>
+                <w:sz w:val="20"/>
+                <w:szCs w:val="20"/>
+              </w:rPr>
+              <w:t xml:space="preserve">ATI-2</w:t>
+            </w:r>
+          </w:p>
+        </w:tc>
+        <w:tc>
+          <w:tcPr>
+            <w:tcW w:type="dxa" w:w="4680"/>
+          </w:tcPr>
+          <w:p>
+            <w:pPr>
+              <w:spacing w:after="20" w:before="20"/>
+              <w:jc w:val="left"/>
+            </w:pPr>
+            <w:r>
+              <w:rPr>
+                <w:rFonts w:ascii="Times New Roman" w:cs="Times New Roman" w:eastAsia="Times New Roman" w:hAnsi="Times New Roman"/>
+                <w:b/>
+                <w:bCs/>
+                <w:sz w:val="20"/>
+                <w:szCs w:val="20"/>
+              </w:rPr>
+              <w:t xml:space="preserve">La triforcazione non ha un vertice.</w:t>
+            </w:r>
+            <w:r>
+              <w:rPr>
+                <w:rFonts w:ascii="Times New Roman" w:cs="Times New Roman" w:eastAsia="Times New Roman" w:hAnsi="Times New Roman"/>
+                <w:sz w:val="20"/>
+                <w:szCs w:val="20"/>
+              </w:rPr>
+              <w:t xml:space="preserve"> Tre progetti dal medesimo ceppo non fanno una regia unica: il comando unificato fu cercato (da Feltrinelli, FH-3) e </w:t>
+            </w:r>
+            <w:r>
+              <w:rPr>
+                <w:rFonts w:ascii="Times New Roman" w:cs="Times New Roman" w:eastAsia="Times New Roman" w:hAnsi="Times New Roman"/>
+                <w:b/>
+                <w:bCs/>
+                <w:sz w:val="20"/>
+                <w:szCs w:val="20"/>
+              </w:rPr>
+              <w:t xml:space="preserve">non ottenuto</w:t>
+            </w:r>
+            <w:r>
+              <w:rPr>
+                <w:rFonts w:ascii="Times New Roman" w:cs="Times New Roman" w:eastAsia="Times New Roman" w:hAnsi="Times New Roman"/>
+                <w:sz w:val="20"/>
+                <w:szCs w:val="20"/>
+              </w:rPr>
+              <w:t xml:space="preserve"> — il fallimento di quell'unificazione è documentato quanto i rapporti stessi</w:t>
+            </w:r>
+          </w:p>
+        </w:tc>
+      </w:tr>
+      <w:tr>
+        <w:tc>
+          <w:tcPr>
+            <w:tcW w:type="dxa" w:w="4680"/>
+          </w:tcPr>
+          <w:p>
+            <w:pPr>
+              <w:spacing w:after="20" w:before="20"/>
+              <w:jc w:val="left"/>
+            </w:pPr>
+            <w:r>
+              <w:rPr>
+                <w:rFonts w:ascii="Times New Roman" w:cs="Times New Roman" w:eastAsia="Times New Roman" w:hAnsi="Times New Roman"/>
+                <w:sz w:val="20"/>
+                <w:szCs w:val="20"/>
+              </w:rPr>
+              <w:t xml:space="preserve">ATI-3</w:t>
+            </w:r>
+          </w:p>
+        </w:tc>
+        <w:tc>
+          <w:tcPr>
+            <w:tcW w:type="dxa" w:w="4680"/>
+          </w:tcPr>
+          <w:p>
+            <w:pPr>
+              <w:spacing w:after="20" w:before="20"/>
+              <w:jc w:val="left"/>
+            </w:pPr>
+            <w:r>
+              <w:rPr>
+                <w:rFonts w:ascii="Times New Roman" w:cs="Times New Roman" w:eastAsia="Times New Roman" w:hAnsi="Times New Roman"/>
+                <w:b/>
+                <w:bCs/>
+                <w:sz w:val="20"/>
+                <w:szCs w:val="20"/>
+              </w:rPr>
+              <w:t xml:space="preserve">La memorialistica di parte non è fonte di accusa.</w:t>
+            </w:r>
+            <w:r>
+              <w:rPr>
+                <w:rFonts w:ascii="Times New Roman" w:cs="Times New Roman" w:eastAsia="Times New Roman" w:hAnsi="Times New Roman"/>
+                <w:sz w:val="20"/>
+                <w:szCs w:val="20"/>
+              </w:rPr>
+              <w:t xml:space="preserve"> Le ricostruzioni di Franceschini (su Simioni, su Moretti, su Segrate) e le repliche degli avversari appartengono a una guerra della memoria fra ex militanti: si citano con attribuzione, si pesano, non si promuovono. Dove sono state verificate, ne è uscita una smentita (FH-8)</w:t>
+            </w:r>
+          </w:p>
+        </w:tc>
+      </w:tr>
+    </w:tbl>
+    <w:p>
+      <w:pPr>
+        <w:spacing w:after="80"/>
+      </w:pPr>
+    </w:p>
+    <w:p>
+      <w:pPr>
+        <w:pStyle w:val="Heading2"/>
+        <w:spacing w:after="100" w:before="200"/>
+      </w:pPr>
+      <w:r>
+        <w:rPr>
+          <w:rFonts w:ascii="Times New Roman" w:cs="Times New Roman" w:eastAsia="Times New Roman" w:hAnsi="Times New Roman"/>
+          <w:sz w:val="24"/>
+          <w:szCs w:val="24"/>
+        </w:rPr>
+        <w:t xml:space="preserve">5. Registro di esecuzione</w:t>
+      </w:r>
+    </w:p>
+    <w:p>
+      <w:pPr>
+        <w:pStyle w:val="ListParagraph"/>
+        <w:numPr>
+          <w:ilvl w:val="0"/>
+          <w:numId w:val="1"/>
+        </w:numPr>
+        <w:spacing w:after="40"/>
+        <w:jc w:val="both"/>
+      </w:pPr>
+      <w:r>
+        <w:rPr>
+          <w:rFonts w:ascii="Times New Roman" w:cs="Times New Roman" w:eastAsia="Times New Roman" w:hAnsi="Times New Roman"/>
+          <w:sz w:val="24"/>
+          <w:szCs w:val="24"/>
+        </w:rPr>
+        <w:t xml:space="preserve">Nodi d'incrocio: </w:t>
+      </w:r>
+      <w:r>
+        <w:rPr>
+          <w:rFonts w:ascii="Times New Roman" w:cs="Times New Roman" w:eastAsia="Times New Roman" w:hAnsi="Times New Roman"/>
+          <w:b/>
+          <w:bCs/>
+          <w:sz w:val="24"/>
+          <w:szCs w:val="24"/>
+        </w:rPr>
+        <w:t xml:space="preserve">8</w:t>
+      </w:r>
+      <w:r>
+        <w:rPr>
+          <w:rFonts w:ascii="Times New Roman" w:cs="Times New Roman" w:eastAsia="Times New Roman" w:hAnsi="Times New Roman"/>
+          <w:sz w:val="24"/>
+          <w:szCs w:val="24"/>
+        </w:rPr>
+        <w:t xml:space="preserve"> (FH-1…FH-8): 6 documentati, 1 memorialistico incrociato (FH-4), 1 congettura smentita (FH-8).</w:t>
+      </w:r>
+    </w:p>
+    <w:p>
+      <w:pPr>
+        <w:pStyle w:val="ListParagraph"/>
+        <w:numPr>
+          <w:ilvl w:val="0"/>
+          <w:numId w:val="1"/>
+        </w:numPr>
+        <w:spacing w:after="40"/>
+        <w:jc w:val="both"/>
+      </w:pPr>
+      <w:r>
+        <w:rPr>
+          <w:rFonts w:ascii="Times New Roman" w:cs="Times New Roman" w:eastAsia="Times New Roman" w:hAnsi="Times New Roman"/>
+          <w:sz w:val="24"/>
+          <w:szCs w:val="24"/>
+        </w:rPr>
+        <w:t xml:space="preserve">Verifiche web dedicate in sessione: </w:t>
+      </w:r>
+      <w:r>
+        <w:rPr>
+          <w:rFonts w:ascii="Times New Roman" w:cs="Times New Roman" w:eastAsia="Times New Roman" w:hAnsi="Times New Roman"/>
+          <w:b/>
+          <w:bCs/>
+          <w:sz w:val="24"/>
+          <w:szCs w:val="24"/>
+        </w:rPr>
+        <w:t xml:space="preserve">2</w:t>
+      </w:r>
+      <w:r>
+        <w:rPr>
+          <w:rFonts w:ascii="Times New Roman" w:cs="Times New Roman" w:eastAsia="Times New Roman" w:hAnsi="Times New Roman"/>
+          <w:sz w:val="24"/>
+          <w:szCs w:val="24"/>
+        </w:rPr>
+        <w:t xml:space="preserve"> (rapporti Feltrinelli-BR e confluenze post-1972; memorialistica Franceschini/«zie rosse»/timer e sua smentita).</w:t>
+      </w:r>
+    </w:p>
+    <w:p>
+      <w:pPr>
+        <w:pStyle w:val="ListParagraph"/>
+        <w:numPr>
+          <w:ilvl w:val="0"/>
+          <w:numId w:val="1"/>
+        </w:numPr>
+        <w:spacing w:after="40"/>
+        <w:jc w:val="both"/>
+      </w:pPr>
+      <w:r>
+        <w:rPr>
+          <w:rFonts w:ascii="Times New Roman" w:cs="Times New Roman" w:eastAsia="Times New Roman" w:hAnsi="Times New Roman"/>
+          <w:sz w:val="24"/>
+          <w:szCs w:val="24"/>
+        </w:rPr>
+        <w:t xml:space="preserve">Anti-triangolazioni: </w:t>
+      </w:r>
+      <w:r>
+        <w:rPr>
+          <w:rFonts w:ascii="Times New Roman" w:cs="Times New Roman" w:eastAsia="Times New Roman" w:hAnsi="Times New Roman"/>
+          <w:b/>
+          <w:bCs/>
+          <w:sz w:val="24"/>
+          <w:szCs w:val="24"/>
+        </w:rPr>
+        <w:t xml:space="preserve">3</w:t>
+      </w:r>
+      <w:r>
+        <w:rPr>
+          <w:rFonts w:ascii="Times New Roman" w:cs="Times New Roman" w:eastAsia="Times New Roman" w:hAnsi="Times New Roman"/>
+          <w:sz w:val="24"/>
+          <w:szCs w:val="24"/>
+        </w:rPr>
+        <w:t xml:space="preserve"> (ATI-1…ATI-3).</w:t>
+      </w:r>
+    </w:p>
+    <w:p>
+      <w:pPr>
+        <w:pStyle w:val="ListParagraph"/>
+        <w:numPr>
+          <w:ilvl w:val="0"/>
+          <w:numId w:val="1"/>
+        </w:numPr>
+        <w:spacing w:after="40"/>
+        <w:jc w:val="both"/>
+      </w:pPr>
+      <w:r>
+        <w:rPr>
+          <w:rFonts w:ascii="Times New Roman" w:cs="Times New Roman" w:eastAsia="Times New Roman" w:hAnsi="Times New Roman"/>
+          <w:sz w:val="24"/>
+          <w:szCs w:val="24"/>
+        </w:rPr>
+        <w:t xml:space="preserve">Il documento si appoggia ai nodi già verificati delle due triangolazioni madri (F-1…F-17; HY-1…HY-9) senza duplicarli.</w:t>
+      </w:r>
+    </w:p>
+    <w:p>
+      <w:pPr>
+        <w:pStyle w:val="ListParagraph"/>
+        <w:numPr>
+          <w:ilvl w:val="0"/>
+          <w:numId w:val="1"/>
+        </w:numPr>
+        <w:spacing w:after="40"/>
+        <w:jc w:val="both"/>
+      </w:pPr>
+      <w:r>
+        <w:rPr>
+          <w:rFonts w:ascii="Times New Roman" w:cs="Times New Roman" w:eastAsia="Times New Roman" w:hAnsi="Times New Roman"/>
+          <w:sz w:val="24"/>
+          <w:szCs w:val="24"/>
+        </w:rPr>
+        <w:t xml:space="preserve">Sintesi dell'incrocio in una riga: </w:t>
+      </w:r>
+      <w:r>
+        <w:rPr>
+          <w:rFonts w:ascii="Times New Roman" w:cs="Times New Roman" w:eastAsia="Times New Roman" w:hAnsi="Times New Roman"/>
+          <w:b/>
+          <w:bCs/>
+          <w:sz w:val="24"/>
+          <w:szCs w:val="24"/>
+        </w:rPr>
+        <w:t xml:space="preserve">stesso ceppo, tre strade, ponti di uomini, nessuna regia accertata — e l'unica «unificazione» reale avvenne in tribunale.</w:t>
+      </w:r>
+    </w:p>
+    <w:p>
+      <w:pPr>
+        <w:pBdr>
+          <w:bottom w:val="single" w:color="999999" w:sz="6" w:space="1"/>
+        </w:pBdr>
+        <w:spacing w:after="80"/>
+      </w:pPr>
+    </w:p>
+    <w:p>
+      <w:pPr>
+        <w:spacing w:after="120" w:line="276"/>
+        <w:jc w:val="both"/>
+      </w:pPr>
+      <w:r>
+        <w:rPr>
+          <w:rFonts w:ascii="Times New Roman" w:cs="Times New Roman" w:eastAsia="Times New Roman" w:hAnsi="Times New Roman"/>
+          <w:i/>
+          <w:iCs/>
+          <w:sz w:val="24"/>
+          <w:szCs w:val="24"/>
+        </w:rPr>
+        <w:t xml:space="preserve">Triangolazione d'incrocio fra i fronti Feltrinelli e Hyperion. Matrice comune e ponti biografici documentati; congetture memorialistiche declassate o smentite; presunzione d'innocenza piena per i prosciolti. Regola di Ferro: dove la fonte documenta, si certifica; dove tace, si tace.</w:t>
       </w:r>
     </w:p>
     <w:p>

</xml_diff>